<commit_message>
LFOs you draw and drag onto knobs; the wall respects solo
- a row of Serum/Vital-style LFOs under the pads (+ LFO for more): drag points, bend
  segments, presets, sync to tempo or free Hz, a big editor in its own window
- drag an LFO's handle onto any knob or slider; drag the knob's outer ring (or cmd-drag)
  to set how much; rings and badges in the LFO's colour; LFOs show up as mod sources
- an LFO's free rate is itself a knob, so LFOs can move LFOs; LFOs are saved with sets
- solo now applies to the wall too, and the wall pad has an S

Co-Authored-By: Claude Opus 5.5 (1M context) <noreply@anthropic.com>
</commit_message>
<xml_diff>
--- a/docs/unsound-manual.docx
+++ b/docs/unsound-manual.docx
@@ -1236,7 +1236,7 @@
         <w:t xml:space="preserve"> </w:t>
       </w:r>
       <w:r>
-        <w:t xml:space="preserve">and knob next to each pad.</w:t>
+        <w:t xml:space="preserve">and knob next to each pad (solo works on the wall too).</w:t>
       </w:r>
       <w:r>
         <w:t xml:space="preserve"> </w:t>
@@ -2315,7 +2315,20 @@
         <w:pStyle w:val="FirstParagraph"/>
       </w:pPr>
       <w:r>
-        <w:t xml:space="preserve">The wall ignores solo, and dice / glide leave it alone. It’s yours to shape.</w:t>
+        <w:t xml:space="preserve">Solo works on it like any track (it goes quiet when you solo something else, and it has its own</w:t>
+      </w:r>
+      <w:r>
+        <w:t xml:space="preserve"> </w:t>
+      </w:r>
+      <w:r>
+        <w:rPr>
+          <w:b/>
+          <w:bCs/>
+        </w:rPr>
+        <w:t xml:space="preserve">S</w:t>
+      </w:r>
+      <w:r>
+        <w:t xml:space="preserve">). Dice and glide leave it alone: it’s yours to shape.</w:t>
       </w:r>
     </w:p>
     <w:p>
@@ -3199,11 +3212,419 @@
       <w:pPr>
         <w:pStyle w:val="Heading2"/>
       </w:pPr>
-      <w:bookmarkStart w:id="35" w:name="_38b93c7fafd2d68f4d39234d80887dd163dcf58"/>
+      <w:bookmarkStart w:id="35" w:name="_b53aca093982d2d13ec993337bfc1422c678be5"/>
+      <w:r>
+        <w:t xml:space="preserve">7½. LFOs (Serum / Vital style)</w:t>
+      </w:r>
+      <w:bookmarkEnd w:id="35"/>
+    </w:p>
+    <w:p>
+      <w:pPr>
+        <w:pStyle w:val="CaptionedFigure"/>
+      </w:pPr>
+      <w:r>
+        <w:drawing>
+          <wp:inline>
+            <wp:extent cx="5334000" cy="648729"/>
+            <wp:effectExtent b="0" l="0" r="0" t="0"/>
+            <wp:docPr descr="the LFO row" title="" id="37" name="Picture"/>
+            <a:graphic>
+              <a:graphicData uri="http://schemas.openxmlformats.org/drawingml/2006/picture">
+                <pic:pic>
+                  <pic:nvPicPr>
+                    <pic:cNvPr descr="docs/img/lfos.png" id="38" name="Picture"/>
+                    <pic:cNvPicPr>
+                      <a:picLocks noChangeArrowheads="1" noChangeAspect="1"/>
+                    </pic:cNvPicPr>
+                  </pic:nvPicPr>
+                  <pic:blipFill>
+                    <a:blip r:embed="rId36"/>
+                    <a:stretch>
+                      <a:fillRect/>
+                    </a:stretch>
+                  </pic:blipFill>
+                  <pic:spPr bwMode="auto">
+                    <a:xfrm>
+                      <a:off x="0" y="0"/>
+                      <a:ext cx="5334000" cy="648729"/>
+                    </a:xfrm>
+                    <a:prstGeom prst="rect">
+                      <a:avLst/>
+                    </a:prstGeom>
+                    <a:noFill/>
+                    <a:ln w="9525">
+                      <a:noFill/>
+                      <a:headEnd/>
+                      <a:tailEnd/>
+                    </a:ln>
+                  </pic:spPr>
+                </pic:pic>
+              </a:graphicData>
+            </a:graphic>
+          </wp:inline>
+        </w:drawing>
+      </w:r>
+    </w:p>
+    <w:p>
+      <w:pPr>
+        <w:pStyle w:val="ImageCaption"/>
+      </w:pPr>
+      <w:r>
+        <w:t xml:space="preserve">the LFO row</w:t>
+      </w:r>
+    </w:p>
+    <w:p>
+      <w:pPr>
+        <w:pStyle w:val="FirstParagraph"/>
+      </w:pPr>
+      <w:r>
+        <w:t xml:space="preserve">The row under the pads holds the LFOs: three to start,</w:t>
+      </w:r>
+      <w:r>
+        <w:t xml:space="preserve"> </w:t>
+      </w:r>
+      <w:r>
+        <w:rPr>
+          <w:b/>
+          <w:bCs/>
+        </w:rPr>
+        <w:t xml:space="preserve">+ LFO</w:t>
+      </w:r>
+      <w:r>
+        <w:t xml:space="preserve"> </w:t>
+      </w:r>
+      <w:r>
+        <w:t xml:space="preserve">for as many as you like.</w:t>
+      </w:r>
+    </w:p>
+    <w:p>
+      <w:pPr>
+        <w:pStyle w:val="Compact"/>
+        <w:numPr>
+          <w:ilvl w:val="0"/>
+          <w:numId w:val="1009"/>
+        </w:numPr>
+      </w:pPr>
+      <w:r>
+        <w:rPr>
+          <w:b/>
+          <w:bCs/>
+        </w:rPr>
+        <w:t xml:space="preserve">Draw the shape</w:t>
+      </w:r>
+      <w:r>
+        <w:t xml:space="preserve">: drag the white points; drag the small circle halfway along a segment to bend</w:t>
+      </w:r>
+      <w:r>
+        <w:t xml:space="preserve"> </w:t>
+      </w:r>
+      <w:r>
+        <w:t xml:space="preserve">it (curves); double-click to add a point, double-click a point to remove it.</w:t>
+      </w:r>
+      <w:r>
+        <w:t xml:space="preserve"> </w:t>
+      </w:r>
+      <w:r>
+        <w:rPr>
+          <w:b/>
+          <w:bCs/>
+        </w:rPr>
+        <w:t xml:space="preserve">shape…</w:t>
+      </w:r>
+      <w:r>
+        <w:t xml:space="preserve"> </w:t>
+      </w:r>
+      <w:r>
+        <w:t xml:space="preserve">loads a</w:t>
+      </w:r>
+      <w:r>
+        <w:t xml:space="preserve"> </w:t>
+      </w:r>
+      <w:r>
+        <w:t xml:space="preserve">preset (sine, tri, saw up / down, square, pluck, swell, steps, random).</w:t>
+      </w:r>
+    </w:p>
+    <w:p>
+      <w:pPr>
+        <w:pStyle w:val="Compact"/>
+        <w:numPr>
+          <w:ilvl w:val="0"/>
+          <w:numId w:val="1009"/>
+        </w:numPr>
+      </w:pPr>
+      <w:r>
+        <w:rPr>
+          <w:b/>
+          <w:bCs/>
+        </w:rPr>
+        <w:t xml:space="preserve">Speed</w:t>
+      </w:r>
+      <w:r>
+        <w:t xml:space="preserve">:</w:t>
+      </w:r>
+      <w:r>
+        <w:t xml:space="preserve"> </w:t>
+      </w:r>
+      <w:r>
+        <w:rPr>
+          <w:b/>
+          <w:bCs/>
+        </w:rPr>
+        <w:t xml:space="preserve">sync</w:t>
+      </w:r>
+      <w:r>
+        <w:t xml:space="preserve"> </w:t>
+      </w:r>
+      <w:r>
+        <w:t xml:space="preserve">on = locked to the tempo (1/32 to 8 bars); off = free, in Hz (the small knob).</w:t>
+      </w:r>
+    </w:p>
+    <w:p>
+      <w:pPr>
+        <w:pStyle w:val="Compact"/>
+        <w:numPr>
+          <w:ilvl w:val="0"/>
+          <w:numId w:val="1009"/>
+        </w:numPr>
+      </w:pPr>
+      <w:r>
+        <w:rPr>
+          <w:b/>
+          <w:bCs/>
+        </w:rPr>
+        <w:t xml:space="preserve">Use it</w:t>
+      </w:r>
+      <w:r>
+        <w:t xml:space="preserve">: grab the coloured</w:t>
+      </w:r>
+      <w:r>
+        <w:t xml:space="preserve"> </w:t>
+      </w:r>
+      <w:r>
+        <w:rPr>
+          <w:b/>
+          <w:bCs/>
+        </w:rPr>
+        <w:t xml:space="preserve">✥ drag</w:t>
+      </w:r>
+      <w:r>
+        <w:t xml:space="preserve"> </w:t>
+      </w:r>
+      <w:r>
+        <w:t xml:space="preserve">handle and drop it on</w:t>
+      </w:r>
+      <w:r>
+        <w:t xml:space="preserve"> </w:t>
+      </w:r>
+      <w:r>
+        <w:rPr>
+          <w:b/>
+          <w:bCs/>
+        </w:rPr>
+        <w:t xml:space="preserve">any knob</w:t>
+      </w:r>
+      <w:r>
+        <w:t xml:space="preserve"> </w:t>
+      </w:r>
+      <w:r>
+        <w:t xml:space="preserve">(or every-so-often</w:t>
+      </w:r>
+      <w:r>
+        <w:t xml:space="preserve"> </w:t>
+      </w:r>
+      <w:r>
+        <w:t xml:space="preserve">slider), anywhere: instruments, effects, sends, the wall, another LFO’s rate. The knob gets a ring</w:t>
+      </w:r>
+      <w:r>
+        <w:t xml:space="preserve"> </w:t>
+      </w:r>
+      <w:r>
+        <w:t xml:space="preserve">in the LFO’s colour and a little numbered badge.</w:t>
+      </w:r>
+    </w:p>
+    <w:p>
+      <w:pPr>
+        <w:pStyle w:val="Compact"/>
+        <w:numPr>
+          <w:ilvl w:val="0"/>
+          <w:numId w:val="1009"/>
+        </w:numPr>
+      </w:pPr>
+      <w:r>
+        <w:rPr>
+          <w:b/>
+          <w:bCs/>
+        </w:rPr>
+        <w:t xml:space="preserve">How much</w:t>
+      </w:r>
+      <w:r>
+        <w:t xml:space="preserve">: drag that knob’s</w:t>
+      </w:r>
+      <w:r>
+        <w:t xml:space="preserve"> </w:t>
+      </w:r>
+      <w:r>
+        <w:rPr>
+          <w:b/>
+          <w:bCs/>
+        </w:rPr>
+        <w:t xml:space="preserve">outer ring</w:t>
+      </w:r>
+      <w:r>
+        <w:t xml:space="preserve"> </w:t>
+      </w:r>
+      <w:r>
+        <w:t xml:space="preserve">up or down (or</w:t>
+      </w:r>
+      <w:r>
+        <w:t xml:space="preserve"> </w:t>
+      </w:r>
+      <w:r>
+        <w:rPr>
+          <w:b/>
+          <w:bCs/>
+        </w:rPr>
+        <w:t xml:space="preserve">cmd-drag</w:t>
+      </w:r>
+      <w:r>
+        <w:t xml:space="preserve"> </w:t>
+      </w:r>
+      <w:r>
+        <w:t xml:space="preserve">the knob). Drag below</w:t>
+      </w:r>
+      <w:r>
+        <w:t xml:space="preserve"> </w:t>
+      </w:r>
+      <w:r>
+        <w:t xml:space="preserve">zero to invert it. Turning the knob normally still moves the centre it swings around.</w:t>
+      </w:r>
+    </w:p>
+    <w:p>
+      <w:pPr>
+        <w:pStyle w:val="Compact"/>
+        <w:numPr>
+          <w:ilvl w:val="0"/>
+          <w:numId w:val="1009"/>
+        </w:numPr>
+      </w:pPr>
+      <w:r>
+        <w:t xml:space="preserve">The</w:t>
+      </w:r>
+      <w:r>
+        <w:t xml:space="preserve"> </w:t>
+      </w:r>
+      <w:r>
+        <w:rPr>
+          <w:b/>
+          <w:bCs/>
+        </w:rPr>
+        <w:t xml:space="preserve">→ n</w:t>
+      </w:r>
+      <w:r>
+        <w:t xml:space="preserve"> </w:t>
+      </w:r>
+      <w:r>
+        <w:t xml:space="preserve">next to the handle counts what the LFO is moving. Each of those also shows in the</w:t>
+      </w:r>
+      <w:r>
+        <w:t xml:space="preserve"> </w:t>
+      </w:r>
+      <w:r>
+        <w:t xml:space="preserve">track’s</w:t>
+      </w:r>
+      <w:r>
+        <w:t xml:space="preserve"> </w:t>
+      </w:r>
+      <w:r>
+        <w:rPr>
+          <w:b/>
+          <w:bCs/>
+        </w:rPr>
+        <w:t xml:space="preserve">mods</w:t>
+      </w:r>
+      <w:r>
+        <w:t xml:space="preserve"> </w:t>
+      </w:r>
+      <w:r>
+        <w:t xml:space="preserve">panel with source</w:t>
+      </w:r>
+      <w:r>
+        <w:t xml:space="preserve"> </w:t>
+      </w:r>
+      <w:r>
+        <w:t xml:space="preserve">“LFO n”</w:t>
+      </w:r>
+      <w:r>
+        <w:t xml:space="preserve">, where you can switch it to another LFO or another source.</w:t>
+      </w:r>
+    </w:p>
+    <w:p>
+      <w:pPr>
+        <w:pStyle w:val="Compact"/>
+        <w:numPr>
+          <w:ilvl w:val="0"/>
+          <w:numId w:val="1009"/>
+        </w:numPr>
+      </w:pPr>
+      <w:r>
+        <w:rPr>
+          <w:b/>
+          <w:bCs/>
+        </w:rPr>
+        <w:t xml:space="preserve">⧉</w:t>
+      </w:r>
+      <w:r>
+        <w:t xml:space="preserve"> </w:t>
+      </w:r>
+      <w:r>
+        <w:t xml:space="preserve">opens a big editor for the shape;</w:t>
+      </w:r>
+      <w:r>
+        <w:t xml:space="preserve"> </w:t>
+      </w:r>
+      <w:r>
+        <w:rPr>
+          <w:b/>
+          <w:bCs/>
+        </w:rPr>
+        <w:t xml:space="preserve">x</w:t>
+      </w:r>
+      <w:r>
+        <w:t xml:space="preserve"> </w:t>
+      </w:r>
+      <w:r>
+        <w:t xml:space="preserve">removes the LFO (and the mods it was driving).</w:t>
+      </w:r>
+    </w:p>
+    <w:p>
+      <w:pPr>
+        <w:pStyle w:val="Compact"/>
+        <w:numPr>
+          <w:ilvl w:val="0"/>
+          <w:numId w:val="1009"/>
+        </w:numPr>
+      </w:pPr>
+      <w:r>
+        <w:t xml:space="preserve">An LFO’s free rate is a knob too: drop another LFO on it and LFOs move LFOs.</w:t>
+      </w:r>
+    </w:p>
+    <w:p>
+      <w:pPr>
+        <w:pStyle w:val="FirstParagraph"/>
+      </w:pPr>
+      <w:r>
+        <w:t xml:space="preserve">LFOs are saved with the set.</w:t>
+      </w:r>
+    </w:p>
+    <w:p>
+      <w:pPr>
+        <w:pStyle w:val="Heading2"/>
+      </w:pPr>
+      <w:bookmarkStart w:id="39" w:name="_38b93c7fafd2d68f4d39234d80887dd163dcf58"/>
       <w:r>
         <w:t xml:space="preserve">8. Every so often</w:t>
       </w:r>
-      <w:bookmarkEnd w:id="35"/>
+      <w:bookmarkEnd w:id="39"/>
     </w:p>
     <w:p>
       <w:pPr>
@@ -3742,11 +4163,11 @@
       <w:pPr>
         <w:pStyle w:val="Heading2"/>
       </w:pPr>
-      <w:bookmarkStart w:id="36" w:name="_6b61a8d1df24a4a32d0531f830638a730b9b572"/>
+      <w:bookmarkStart w:id="40" w:name="_6b61a8d1df24a4a32d0531f830638a730b9b572"/>
       <w:r>
         <w:t xml:space="preserve">9. Big moves</w:t>
       </w:r>
-      <w:bookmarkEnd w:id="36"/>
+      <w:bookmarkEnd w:id="40"/>
     </w:p>
     <w:tbl>
       <w:tblPr>
@@ -4065,21 +4486,21 @@
       <w:pPr>
         <w:pStyle w:val="Heading2"/>
       </w:pPr>
-      <w:bookmarkStart w:id="37" w:name="_instruments"/>
+      <w:bookmarkStart w:id="41" w:name="_instruments"/>
       <w:r>
         <w:t xml:space="preserve">10. Instruments</w:t>
       </w:r>
-      <w:bookmarkEnd w:id="37"/>
+      <w:bookmarkEnd w:id="41"/>
     </w:p>
     <w:p>
       <w:pPr>
         <w:pStyle w:val="Heading3"/>
       </w:pPr>
-      <w:bookmarkStart w:id="38" w:name="_36f252bfda2a5e22f3ebeddac50f9d63ae6b5d7"/>
+      <w:bookmarkStart w:id="42" w:name="_36f252bfda2a5e22f3ebeddac50f9d63ae6b5d7"/>
       <w:r>
         <w:t xml:space="preserve">bytebeat (the bitmeister)</w:t>
       </w:r>
-      <w:bookmarkEnd w:id="38"/>
+      <w:bookmarkEnd w:id="42"/>
     </w:p>
     <w:p>
       <w:pPr>
@@ -4157,11 +4578,11 @@
       <w:pPr>
         <w:pStyle w:val="Heading3"/>
       </w:pPr>
-      <w:bookmarkStart w:id="39" w:name="_grains"/>
+      <w:bookmarkStart w:id="43" w:name="_grains"/>
       <w:r>
         <w:t xml:space="preserve">grains</w:t>
       </w:r>
-      <w:bookmarkEnd w:id="39"/>
+      <w:bookmarkEnd w:id="43"/>
     </w:p>
     <w:p>
       <w:pPr>
@@ -4172,18 +4593,18 @@
           <wp:inline>
             <wp:extent cx="5334000" cy="3275076"/>
             <wp:effectExtent b="0" l="0" r="0" t="0"/>
-            <wp:docPr descr="grains" title="" id="41" name="Picture"/>
+            <wp:docPr descr="grains" title="" id="45" name="Picture"/>
             <a:graphic>
               <a:graphicData uri="http://schemas.openxmlformats.org/drawingml/2006/picture">
                 <pic:pic>
                   <pic:nvPicPr>
-                    <pic:cNvPr descr="docs/img/grains.png" id="42" name="Picture"/>
+                    <pic:cNvPr descr="docs/img/grains.png" id="46" name="Picture"/>
                     <pic:cNvPicPr>
                       <a:picLocks noChangeArrowheads="1" noChangeAspect="1"/>
                     </pic:cNvPicPr>
                   </pic:nvPicPr>
                   <pic:blipFill>
-                    <a:blip r:embed="rId40"/>
+                    <a:blip r:embed="rId44"/>
                     <a:stretch>
                       <a:fillRect/>
                     </a:stretch>
@@ -4323,11 +4744,11 @@
       <w:pPr>
         <w:pStyle w:val="Heading3"/>
       </w:pPr>
-      <w:bookmarkStart w:id="43" w:name="_noise"/>
+      <w:bookmarkStart w:id="47" w:name="_noise"/>
       <w:r>
         <w:t xml:space="preserve">noise</w:t>
       </w:r>
-      <w:bookmarkEnd w:id="43"/>
+      <w:bookmarkEnd w:id="47"/>
     </w:p>
     <w:p>
       <w:pPr>
@@ -4338,236 +4759,12 @@
           <wp:inline>
             <wp:extent cx="5334000" cy="3253740"/>
             <wp:effectExtent b="0" l="0" r="0" t="0"/>
-            <wp:docPr descr="noise" title="" id="45" name="Picture"/>
+            <wp:docPr descr="noise" title="" id="49" name="Picture"/>
             <a:graphic>
               <a:graphicData uri="http://schemas.openxmlformats.org/drawingml/2006/picture">
                 <pic:pic>
                   <pic:nvPicPr>
-                    <pic:cNvPr descr="docs/img/noise.png" id="46" name="Picture"/>
-                    <pic:cNvPicPr>
-                      <a:picLocks noChangeArrowheads="1" noChangeAspect="1"/>
-                    </pic:cNvPicPr>
-                  </pic:nvPicPr>
-                  <pic:blipFill>
-                    <a:blip r:embed="rId44"/>
-                    <a:stretch>
-                      <a:fillRect/>
-                    </a:stretch>
-                  </pic:blipFill>
-                  <pic:spPr bwMode="auto">
-                    <a:xfrm>
-                      <a:off x="0" y="0"/>
-                      <a:ext cx="5334000" cy="3253740"/>
-                    </a:xfrm>
-                    <a:prstGeom prst="rect">
-                      <a:avLst/>
-                    </a:prstGeom>
-                    <a:noFill/>
-                    <a:ln w="9525">
-                      <a:noFill/>
-                      <a:headEnd/>
-                      <a:tailEnd/>
-                    </a:ln>
-                  </pic:spPr>
-                </pic:pic>
-              </a:graphicData>
-            </a:graphic>
-          </wp:inline>
-        </w:drawing>
-      </w:r>
-      <w:r>
-        <w:t xml:space="preserve"> </w:t>
-      </w:r>
-      <w:r>
-        <w:t xml:space="preserve">Two layers (A, B), each sweeping continuously through 20 kinds of noise: white, pink, brown, grey,</w:t>
-      </w:r>
-      <w:r>
-        <w:t xml:space="preserve"> </w:t>
-      </w:r>
-      <w:r>
-        <w:t xml:space="preserve">bits, stepped, clipped, smooth, velvet, dust, crackle, rain, wind, radio, metal, sine fm, logistic,</w:t>
-      </w:r>
-      <w:r>
-        <w:t xml:space="preserve"> </w:t>
-      </w:r>
-      <w:r>
-        <w:t xml:space="preserve">henon, cusp, gendy. Per layer:</w:t>
-      </w:r>
-      <w:r>
-        <w:t xml:space="preserve"> </w:t>
-      </w:r>
-      <w:r>
-        <w:rPr>
-          <w:b/>
-          <w:bCs/>
-        </w:rPr>
-        <w:t xml:space="preserve">kind</w:t>
-      </w:r>
-      <w:r>
-        <w:t xml:space="preserve"> </w:t>
-      </w:r>
-      <w:r>
-        <w:t xml:space="preserve">(menu, or the knob to morph between neighbours),</w:t>
-      </w:r>
-      <w:r>
-        <w:t xml:space="preserve"> </w:t>
-      </w:r>
-      <w:r>
-        <w:rPr>
-          <w:b/>
-          <w:bCs/>
-        </w:rPr>
-        <w:t xml:space="preserve">rate</w:t>
-      </w:r>
-      <w:r>
-        <w:t xml:space="preserve">,</w:t>
-      </w:r>
-      <w:r>
-        <w:t xml:space="preserve"> </w:t>
-      </w:r>
-      <w:r>
-        <w:rPr>
-          <w:b/>
-          <w:bCs/>
-        </w:rPr>
-        <w:t xml:space="preserve">char</w:t>
-      </w:r>
-      <w:r>
-        <w:t xml:space="preserve">,</w:t>
-      </w:r>
-      <w:r>
-        <w:t xml:space="preserve"> </w:t>
-      </w:r>
-      <w:r>
-        <w:rPr>
-          <w:b/>
-          <w:bCs/>
-        </w:rPr>
-        <w:t xml:space="preserve">level</w:t>
-      </w:r>
-      <w:r>
-        <w:t xml:space="preserve">. Then</w:t>
-      </w:r>
-      <w:r>
-        <w:t xml:space="preserve"> </w:t>
-      </w:r>
-      <w:r>
-        <w:rPr>
-          <w:b/>
-          <w:bCs/>
-        </w:rPr>
-        <w:t xml:space="preserve">cutoff</w:t>
-      </w:r>
-      <w:r>
-        <w:t xml:space="preserve">,</w:t>
-      </w:r>
-      <w:r>
-        <w:t xml:space="preserve"> </w:t>
-      </w:r>
-      <w:r>
-        <w:rPr>
-          <w:b/>
-          <w:bCs/>
-        </w:rPr>
-        <w:t xml:space="preserve">high pass</w:t>
-      </w:r>
-      <w:r>
-        <w:t xml:space="preserve">,</w:t>
-      </w:r>
-      <w:r>
-        <w:t xml:space="preserve"> </w:t>
-      </w:r>
-      <w:r>
-        <w:rPr>
-          <w:b/>
-          <w:bCs/>
-        </w:rPr>
-        <w:t xml:space="preserve">res</w:t>
-      </w:r>
-      <w:r>
-        <w:t xml:space="preserve">,</w:t>
-      </w:r>
-      <w:r>
-        <w:t xml:space="preserve"> </w:t>
-      </w:r>
-      <w:r>
-        <w:rPr>
-          <w:b/>
-          <w:bCs/>
-        </w:rPr>
-        <w:t xml:space="preserve">drive</w:t>
-      </w:r>
-      <w:r>
-        <w:t xml:space="preserve">,</w:t>
-      </w:r>
-      <w:r>
-        <w:t xml:space="preserve"> </w:t>
-      </w:r>
-      <w:r>
-        <w:rPr>
-          <w:b/>
-          <w:bCs/>
-        </w:rPr>
-        <w:t xml:space="preserve">pulse</w:t>
-      </w:r>
-      <w:r>
-        <w:t xml:space="preserve"> </w:t>
-      </w:r>
-      <w:r>
-        <w:t xml:space="preserve">(gate) and</w:t>
-      </w:r>
-      <w:r>
-        <w:t xml:space="preserve"> </w:t>
-      </w:r>
-      <w:r>
-        <w:rPr>
-          <w:b/>
-          <w:bCs/>
-        </w:rPr>
-        <w:t xml:space="preserve">pulse rate</w:t>
-      </w:r>
-      <w:r>
-        <w:t xml:space="preserve">,</w:t>
-      </w:r>
-      <w:r>
-        <w:t xml:space="preserve"> </w:t>
-      </w:r>
-      <w:r>
-        <w:rPr>
-          <w:b/>
-          <w:bCs/>
-        </w:rPr>
-        <w:t xml:space="preserve">width</w:t>
-      </w:r>
-      <w:r>
-        <w:t xml:space="preserve">. Keys set layer A’s rate (pitched noise).</w:t>
-      </w:r>
-    </w:p>
-    <w:p>
-      <w:pPr>
-        <w:pStyle w:val="Heading3"/>
-      </w:pPr>
-      <w:bookmarkStart w:id="47" w:name="_mouth"/>
-      <w:r>
-        <w:t xml:space="preserve">mouth</w:t>
-      </w:r>
-      <w:bookmarkEnd w:id="47"/>
-    </w:p>
-    <w:p>
-      <w:pPr>
-        <w:pStyle w:val="FirstParagraph"/>
-      </w:pPr>
-      <w:r>
-        <w:drawing>
-          <wp:inline>
-            <wp:extent cx="5334000" cy="3253740"/>
-            <wp:effectExtent b="0" l="0" r="0" t="0"/>
-            <wp:docPr descr="mouth" title="" id="49" name="Picture"/>
-            <a:graphic>
-              <a:graphicData uri="http://schemas.openxmlformats.org/drawingml/2006/picture">
-                <pic:pic>
-                  <pic:nvPicPr>
-                    <pic:cNvPr descr="docs/img/mouth.png" id="50" name="Picture"/>
+                    <pic:cNvPr descr="docs/img/noise.png" id="50" name="Picture"/>
                     <pic:cNvPicPr>
                       <a:picLocks noChangeArrowheads="1" noChangeAspect="1"/>
                     </pic:cNvPicPr>
@@ -4603,71 +4800,45 @@
         <w:t xml:space="preserve"> </w:t>
       </w:r>
       <w:r>
-        <w:t xml:space="preserve">A talking machine.</w:t>
-      </w:r>
-      <w:r>
-        <w:t xml:space="preserve"> </w:t>
-      </w:r>
-      <w:r>
-        <w:rPr>
-          <w:b/>
-          <w:bCs/>
-        </w:rPr>
-        <w:t xml:space="preserve">babble</w:t>
-      </w:r>
-      <w:r>
-        <w:t xml:space="preserve"> </w:t>
-      </w:r>
-      <w:r>
-        <w:t xml:space="preserve">(random syllables),</w:t>
-      </w:r>
-      <w:r>
-        <w:t xml:space="preserve"> </w:t>
-      </w:r>
-      <w:r>
-        <w:rPr>
-          <w:b/>
-          <w:bCs/>
-        </w:rPr>
-        <w:t xml:space="preserve">say the text</w:t>
-      </w:r>
-      <w:r>
-        <w:t xml:space="preserve"> </w:t>
-      </w:r>
-      <w:r>
-        <w:t xml:space="preserve">(type into the box, it loops</w:t>
-      </w:r>
-      <w:r>
-        <w:t xml:space="preserve"> </w:t>
-      </w:r>
-      <w:r>
-        <w:t xml:space="preserve">it),</w:t>
-      </w:r>
-      <w:r>
-        <w:t xml:space="preserve"> </w:t>
-      </w:r>
-      <w:r>
-        <w:rPr>
-          <w:b/>
-          <w:bCs/>
-        </w:rPr>
-        <w:t xml:space="preserve">hold a vowel</w:t>
-      </w:r>
-      <w:r>
-        <w:t xml:space="preserve"> </w:t>
-      </w:r>
-      <w:r>
-        <w:t xml:space="preserve">(sweep a → e → i → o → u on the XY pad).</w:t>
-      </w:r>
-      <w:r>
-        <w:t xml:space="preserve"> </w:t>
-      </w:r>
-      <w:r>
-        <w:rPr>
-          <w:b/>
-          <w:bCs/>
-        </w:rPr>
-        <w:t xml:space="preserve">pitch</w:t>
+        <w:t xml:space="preserve">Two layers (A, B), each sweeping continuously through 20 kinds of noise: white, pink, brown, grey,</w:t>
+      </w:r>
+      <w:r>
+        <w:t xml:space="preserve"> </w:t>
+      </w:r>
+      <w:r>
+        <w:t xml:space="preserve">bits, stepped, clipped, smooth, velvet, dust, crackle, rain, wind, radio, metal, sine fm, logistic,</w:t>
+      </w:r>
+      <w:r>
+        <w:t xml:space="preserve"> </w:t>
+      </w:r>
+      <w:r>
+        <w:t xml:space="preserve">henon, cusp, gendy. Per layer:</w:t>
+      </w:r>
+      <w:r>
+        <w:t xml:space="preserve"> </w:t>
+      </w:r>
+      <w:r>
+        <w:rPr>
+          <w:b/>
+          <w:bCs/>
+        </w:rPr>
+        <w:t xml:space="preserve">kind</w:t>
+      </w:r>
+      <w:r>
+        <w:t xml:space="preserve"> </w:t>
+      </w:r>
+      <w:r>
+        <w:t xml:space="preserve">(menu, or the knob to morph between neighbours),</w:t>
+      </w:r>
+      <w:r>
+        <w:t xml:space="preserve"> </w:t>
+      </w:r>
+      <w:r>
+        <w:rPr>
+          <w:b/>
+          <w:bCs/>
+        </w:rPr>
+        <w:t xml:space="preserve">rate</w:t>
       </w:r>
       <w:r>
         <w:t xml:space="preserve">,</w:t>
@@ -4680,137 +4851,126 @@
           <w:b/>
           <w:bCs/>
         </w:rPr>
-        <w:t xml:space="preserve">throat</w:t>
-      </w:r>
-      <w:r>
-        <w:t xml:space="preserve"> </w:t>
-      </w:r>
-      <w:r>
-        <w:t xml:space="preserve">(head size),</w:t>
-      </w:r>
-      <w:r>
-        <w:t xml:space="preserve"> </w:t>
-      </w:r>
-      <w:r>
-        <w:rPr>
-          <w:b/>
-          <w:bCs/>
-        </w:rPr>
+        <w:t xml:space="preserve">char</w:t>
+      </w:r>
+      <w:r>
+        <w:t xml:space="preserve">,</w:t>
+      </w:r>
+      <w:r>
+        <w:t xml:space="preserve"> </w:t>
+      </w:r>
+      <w:r>
+        <w:rPr>
+          <w:b/>
+          <w:bCs/>
+        </w:rPr>
+        <w:t xml:space="preserve">level</w:t>
+      </w:r>
+      <w:r>
+        <w:t xml:space="preserve">. Then</w:t>
+      </w:r>
+      <w:r>
+        <w:t xml:space="preserve"> </w:t>
+      </w:r>
+      <w:r>
+        <w:rPr>
+          <w:b/>
+          <w:bCs/>
+        </w:rPr>
+        <w:t xml:space="preserve">cutoff</w:t>
+      </w:r>
+      <w:r>
+        <w:t xml:space="preserve">,</w:t>
+      </w:r>
+      <w:r>
+        <w:t xml:space="preserve"> </w:t>
+      </w:r>
+      <w:r>
+        <w:rPr>
+          <w:b/>
+          <w:bCs/>
+        </w:rPr>
+        <w:t xml:space="preserve">high pass</w:t>
+      </w:r>
+      <w:r>
+        <w:t xml:space="preserve">,</w:t>
+      </w:r>
+      <w:r>
+        <w:t xml:space="preserve"> </w:t>
+      </w:r>
+      <w:r>
+        <w:rPr>
+          <w:b/>
+          <w:bCs/>
+        </w:rPr>
+        <w:t xml:space="preserve">res</w:t>
+      </w:r>
+      <w:r>
+        <w:t xml:space="preserve">,</w:t>
+      </w:r>
+      <w:r>
+        <w:t xml:space="preserve"> </w:t>
+      </w:r>
+      <w:r>
+        <w:rPr>
+          <w:b/>
+          <w:bCs/>
+        </w:rPr>
+        <w:t xml:space="preserve">drive</w:t>
+      </w:r>
+      <w:r>
+        <w:t xml:space="preserve">,</w:t>
+      </w:r>
+      <w:r>
+        <w:t xml:space="preserve"> </w:t>
+      </w:r>
+      <w:r>
+        <w:rPr>
+          <w:b/>
+          <w:bCs/>
+        </w:rPr>
+        <w:t xml:space="preserve">pulse</w:t>
+      </w:r>
+      <w:r>
+        <w:t xml:space="preserve"> </w:t>
+      </w:r>
+      <w:r>
+        <w:t xml:space="preserve">(gate) and</w:t>
+      </w:r>
+      <w:r>
+        <w:t xml:space="preserve"> </w:t>
+      </w:r>
+      <w:r>
+        <w:rPr>
+          <w:b/>
+          <w:bCs/>
+        </w:rPr>
+        <w:t xml:space="preserve">pulse rate</w:t>
+      </w:r>
+      <w:r>
+        <w:t xml:space="preserve">,</w:t>
+      </w:r>
+      <w:r>
+        <w:t xml:space="preserve"> </w:t>
+      </w:r>
+      <w:r>
+        <w:rPr>
+          <w:b/>
+          <w:bCs/>
+        </w:rPr>
+        <w:t xml:space="preserve">width</w:t>
+      </w:r>
+      <w:r>
+        <w:t xml:space="preserve">. Keys set layer A’s rate (pitched noise).</w:t>
+      </w:r>
+    </w:p>
+    <w:p>
+      <w:pPr>
+        <w:pStyle w:val="Heading3"/>
+      </w:pPr>
+      <w:bookmarkStart w:id="51" w:name="_mouth"/>
+      <w:r>
         <w:t xml:space="preserve">mouth</w:t>
-      </w:r>
-      <w:r>
-        <w:t xml:space="preserve">,</w:t>
-      </w:r>
-      <w:r>
-        <w:t xml:space="preserve"> </w:t>
-      </w:r>
-      <w:r>
-        <w:rPr>
-          <w:b/>
-          <w:bCs/>
-        </w:rPr>
-        <w:t xml:space="preserve">breath</w:t>
-      </w:r>
-      <w:r>
-        <w:t xml:space="preserve">,</w:t>
-      </w:r>
-      <w:r>
-        <w:t xml:space="preserve"> </w:t>
-      </w:r>
-      <w:r>
-        <w:rPr>
-          <w:b/>
-          <w:bCs/>
-        </w:rPr>
-        <w:t xml:space="preserve">rate</w:t>
-      </w:r>
-      <w:r>
-        <w:t xml:space="preserve"> </w:t>
-      </w:r>
-      <w:r>
-        <w:t xml:space="preserve">(syllables per beat),</w:t>
-      </w:r>
-      <w:r>
-        <w:t xml:space="preserve"> </w:t>
-      </w:r>
-      <w:r>
-        <w:rPr>
-          <w:b/>
-          <w:bCs/>
-        </w:rPr>
-        <w:t xml:space="preserve">glide</w:t>
-      </w:r>
-      <w:r>
-        <w:t xml:space="preserve">,</w:t>
-      </w:r>
-      <w:r>
-        <w:t xml:space="preserve"> </w:t>
-      </w:r>
-      <w:r>
-        <w:rPr>
-          <w:b/>
-          <w:bCs/>
-        </w:rPr>
-        <w:t xml:space="preserve">sing</w:t>
-      </w:r>
-      <w:r>
-        <w:t xml:space="preserve"> </w:t>
-      </w:r>
-      <w:r>
-        <w:t xml:space="preserve">(0 = speech, 1 = sings</w:t>
-      </w:r>
-      <w:r>
-        <w:t xml:space="preserve"> </w:t>
-      </w:r>
-      <w:r>
-        <w:t xml:space="preserve">the scale),</w:t>
-      </w:r>
-      <w:r>
-        <w:t xml:space="preserve"> </w:t>
-      </w:r>
-      <w:r>
-        <w:rPr>
-          <w:b/>
-          <w:bCs/>
-        </w:rPr>
-        <w:t xml:space="preserve">robot</w:t>
-      </w:r>
-      <w:r>
-        <w:t xml:space="preserve"> </w:t>
-      </w:r>
-      <w:r>
-        <w:t xml:space="preserve">(monotone),</w:t>
-      </w:r>
-      <w:r>
-        <w:t xml:space="preserve"> </w:t>
-      </w:r>
-      <w:r>
-        <w:rPr>
-          <w:b/>
-          <w:bCs/>
-        </w:rPr>
-        <w:t xml:space="preserve">lofi</w:t>
-      </w:r>
-      <w:r>
-        <w:t xml:space="preserve"> </w:t>
-      </w:r>
-      <w:r>
-        <w:t xml:space="preserve">(down to Speak &amp; Spell). Keys: a note sets the pitch</w:t>
-      </w:r>
-      <w:r>
-        <w:t xml:space="preserve"> </w:t>
-      </w:r>
-      <w:r>
-        <w:t xml:space="preserve">and says a syllable.</w:t>
-      </w:r>
-    </w:p>
-    <w:p>
-      <w:pPr>
-        <w:pStyle w:val="Heading3"/>
-      </w:pPr>
-      <w:bookmarkStart w:id="51" w:name="_deck"/>
-      <w:r>
-        <w:t xml:space="preserve">deck</w:t>
       </w:r>
       <w:bookmarkEnd w:id="51"/>
     </w:p>
@@ -4823,12 +4983,12 @@
           <wp:inline>
             <wp:extent cx="5334000" cy="3253740"/>
             <wp:effectExtent b="0" l="0" r="0" t="0"/>
-            <wp:docPr descr="deck" title="" id="53" name="Picture"/>
+            <wp:docPr descr="mouth" title="" id="53" name="Picture"/>
             <a:graphic>
               <a:graphicData uri="http://schemas.openxmlformats.org/drawingml/2006/picture">
                 <pic:pic>
                   <pic:nvPicPr>
-                    <pic:cNvPr descr="docs/img/deck.png" id="54" name="Picture"/>
+                    <pic:cNvPr descr="docs/img/mouth.png" id="54" name="Picture"/>
                     <pic:cNvPicPr>
                       <a:picLocks noChangeArrowheads="1" noChangeAspect="1"/>
                     </pic:cNvPicPr>
@@ -4864,135 +5024,71 @@
         <w:t xml:space="preserve"> </w:t>
       </w:r>
       <w:r>
-        <w:t xml:space="preserve">A tape player.</w:t>
-      </w:r>
-      <w:r>
-        <w:t xml:space="preserve"> </w:t>
-      </w:r>
-      <w:r>
-        <w:rPr>
-          <w:b/>
-          <w:bCs/>
-        </w:rPr>
-        <w:t xml:space="preserve">open…</w:t>
-      </w:r>
-      <w:r>
-        <w:t xml:space="preserve"> </w:t>
-      </w:r>
-      <w:r>
-        <w:t xml:space="preserve">any audio file,</w:t>
-      </w:r>
-      <w:r>
-        <w:t xml:space="preserve"> </w:t>
-      </w:r>
-      <w:r>
-        <w:rPr>
-          <w:b/>
-          <w:bCs/>
-        </w:rPr>
-        <w:t xml:space="preserve">from folder</w:t>
-      </w:r>
-      <w:r>
-        <w:t xml:space="preserve"> </w:t>
-      </w:r>
-      <w:r>
-        <w:t xml:space="preserve">for a random one. It loops the region</w:t>
-      </w:r>
-      <w:r>
-        <w:t xml:space="preserve"> </w:t>
-      </w:r>
-      <w:r>
-        <w:t xml:space="preserve">forever:</w:t>
-      </w:r>
-      <w:r>
-        <w:t xml:space="preserve"> </w:t>
-      </w:r>
-      <w:r>
-        <w:rPr>
-          <w:b/>
-          <w:bCs/>
-        </w:rPr>
-        <w:t xml:space="preserve">click</w:t>
-      </w:r>
-      <w:r>
-        <w:t xml:space="preserve"> </w:t>
-      </w:r>
-      <w:r>
-        <w:t xml:space="preserve">the waveform to move the playhead,</w:t>
-      </w:r>
-      <w:r>
-        <w:t xml:space="preserve"> </w:t>
-      </w:r>
-      <w:r>
-        <w:rPr>
-          <w:b/>
-          <w:bCs/>
-        </w:rPr>
-        <w:t xml:space="preserve">drag</w:t>
-      </w:r>
-      <w:r>
-        <w:t xml:space="preserve"> </w:t>
-      </w:r>
-      <w:r>
-        <w:t xml:space="preserve">to pick the loop,</w:t>
-      </w:r>
-      <w:r>
-        <w:t xml:space="preserve"> </w:t>
-      </w:r>
-      <w:r>
-        <w:rPr>
-          <w:b/>
-          <w:bCs/>
-        </w:rPr>
-        <w:t xml:space="preserve">whole tape</w:t>
-      </w:r>
-      <w:r>
-        <w:t xml:space="preserve"> </w:t>
-      </w:r>
-      <w:r>
-        <w:t xml:space="preserve">to reset.</w:t>
-      </w:r>
-      <w:r>
-        <w:t xml:space="preserve"> </w:t>
-      </w:r>
-      <w:r>
-        <w:rPr>
-          <w:b/>
-          <w:bCs/>
-        </w:rPr>
-        <w:t xml:space="preserve">speed</w:t>
-      </w:r>
-      <w:r>
-        <w:t xml:space="preserve"> </w:t>
-      </w:r>
-      <w:r>
-        <w:t xml:space="preserve">−8× to 8× through a motor with</w:t>
-      </w:r>
-      <w:r>
-        <w:t xml:space="preserve"> </w:t>
-      </w:r>
-      <w:r>
-        <w:rPr>
-          <w:b/>
-          <w:bCs/>
-        </w:rPr>
-        <w:t xml:space="preserve">inertia</w:t>
-      </w:r>
-      <w:r>
-        <w:t xml:space="preserve"> </w:t>
-      </w:r>
-      <w:r>
-        <w:t xml:space="preserve">(so changes swoop),</w:t>
-      </w:r>
-      <w:r>
-        <w:t xml:space="preserve"> </w:t>
-      </w:r>
-      <w:r>
-        <w:rPr>
-          <w:b/>
-          <w:bCs/>
-        </w:rPr>
-        <w:t xml:space="preserve">semis</w:t>
+        <w:t xml:space="preserve">A talking machine.</w:t>
+      </w:r>
+      <w:r>
+        <w:t xml:space="preserve"> </w:t>
+      </w:r>
+      <w:r>
+        <w:rPr>
+          <w:b/>
+          <w:bCs/>
+        </w:rPr>
+        <w:t xml:space="preserve">babble</w:t>
+      </w:r>
+      <w:r>
+        <w:t xml:space="preserve"> </w:t>
+      </w:r>
+      <w:r>
+        <w:t xml:space="preserve">(random syllables),</w:t>
+      </w:r>
+      <w:r>
+        <w:t xml:space="preserve"> </w:t>
+      </w:r>
+      <w:r>
+        <w:rPr>
+          <w:b/>
+          <w:bCs/>
+        </w:rPr>
+        <w:t xml:space="preserve">say the text</w:t>
+      </w:r>
+      <w:r>
+        <w:t xml:space="preserve"> </w:t>
+      </w:r>
+      <w:r>
+        <w:t xml:space="preserve">(type into the box, it loops</w:t>
+      </w:r>
+      <w:r>
+        <w:t xml:space="preserve"> </w:t>
+      </w:r>
+      <w:r>
+        <w:t xml:space="preserve">it),</w:t>
+      </w:r>
+      <w:r>
+        <w:t xml:space="preserve"> </w:t>
+      </w:r>
+      <w:r>
+        <w:rPr>
+          <w:b/>
+          <w:bCs/>
+        </w:rPr>
+        <w:t xml:space="preserve">hold a vowel</w:t>
+      </w:r>
+      <w:r>
+        <w:t xml:space="preserve"> </w:t>
+      </w:r>
+      <w:r>
+        <w:t xml:space="preserve">(sweep a → e → i → o → u on the XY pad).</w:t>
+      </w:r>
+      <w:r>
+        <w:t xml:space="preserve"> </w:t>
+      </w:r>
+      <w:r>
+        <w:rPr>
+          <w:b/>
+          <w:bCs/>
+        </w:rPr>
+        <w:t xml:space="preserve">pitch</w:t>
       </w:r>
       <w:r>
         <w:t xml:space="preserve">,</w:t>
@@ -5005,7 +5101,23 @@
           <w:b/>
           <w:bCs/>
         </w:rPr>
-        <w:t xml:space="preserve">stop</w:t>
+        <w:t xml:space="preserve">throat</w:t>
+      </w:r>
+      <w:r>
+        <w:t xml:space="preserve"> </w:t>
+      </w:r>
+      <w:r>
+        <w:t xml:space="preserve">(head size),</w:t>
+      </w:r>
+      <w:r>
+        <w:t xml:space="preserve"> </w:t>
+      </w:r>
+      <w:r>
+        <w:rPr>
+          <w:b/>
+          <w:bCs/>
+        </w:rPr>
+        <w:t xml:space="preserve">mouth</w:t>
       </w:r>
       <w:r>
         <w:t xml:space="preserve">,</w:t>
@@ -5018,7 +5130,7 @@
           <w:b/>
           <w:bCs/>
         </w:rPr>
-        <w:t xml:space="preserve">spin back</w:t>
+        <w:t xml:space="preserve">breath</w:t>
       </w:r>
       <w:r>
         <w:t xml:space="preserve">,</w:t>
@@ -5031,7 +5143,23 @@
           <w:b/>
           <w:bCs/>
         </w:rPr>
-        <w:t xml:space="preserve">reverse</w:t>
+        <w:t xml:space="preserve">rate</w:t>
+      </w:r>
+      <w:r>
+        <w:t xml:space="preserve"> </w:t>
+      </w:r>
+      <w:r>
+        <w:t xml:space="preserve">(syllables per beat),</w:t>
+      </w:r>
+      <w:r>
+        <w:t xml:space="preserve"> </w:t>
+      </w:r>
+      <w:r>
+        <w:rPr>
+          <w:b/>
+          <w:bCs/>
+        </w:rPr>
+        <w:t xml:space="preserve">glide</w:t>
       </w:r>
       <w:r>
         <w:t xml:space="preserve">,</w:t>
@@ -5044,106 +5172,66 @@
           <w:b/>
           <w:bCs/>
         </w:rPr>
-        <w:t xml:space="preserve">1x</w:t>
-      </w:r>
-      <w:r>
-        <w:t xml:space="preserve">. Wear:</w:t>
-      </w:r>
-      <w:r>
-        <w:t xml:space="preserve"> </w:t>
-      </w:r>
-      <w:r>
-        <w:rPr>
-          <w:b/>
-          <w:bCs/>
-        </w:rPr>
-        <w:t xml:space="preserve">wow</w:t>
-      </w:r>
-      <w:r>
-        <w:t xml:space="preserve">,</w:t>
-      </w:r>
-      <w:r>
-        <w:t xml:space="preserve"> </w:t>
-      </w:r>
-      <w:r>
-        <w:rPr>
-          <w:b/>
-          <w:bCs/>
-        </w:rPr>
-        <w:t xml:space="preserve">flutter</w:t>
-      </w:r>
-      <w:r>
-        <w:t xml:space="preserve">,</w:t>
-      </w:r>
-      <w:r>
-        <w:t xml:space="preserve"> </w:t>
-      </w:r>
-      <w:r>
-        <w:rPr>
-          <w:b/>
-          <w:bCs/>
-        </w:rPr>
-        <w:t xml:space="preserve">chew</w:t>
-      </w:r>
-      <w:r>
-        <w:t xml:space="preserve"> </w:t>
-      </w:r>
-      <w:r>
-        <w:t xml:space="preserve">(skips and</w:t>
-      </w:r>
-      <w:r>
-        <w:t xml:space="preserve"> </w:t>
-      </w:r>
-      <w:r>
-        <w:t xml:space="preserve">drop-outs),</w:t>
-      </w:r>
-      <w:r>
-        <w:t xml:space="preserve"> </w:t>
-      </w:r>
-      <w:r>
-        <w:rPr>
-          <w:b/>
-          <w:bCs/>
-        </w:rPr>
-        <w:t xml:space="preserve">drive</w:t>
-      </w:r>
-      <w:r>
-        <w:t xml:space="preserve">,</w:t>
-      </w:r>
-      <w:r>
-        <w:t xml:space="preserve"> </w:t>
-      </w:r>
-      <w:r>
-        <w:rPr>
-          <w:b/>
-          <w:bCs/>
-        </w:rPr>
-        <w:t xml:space="preserve">age</w:t>
-      </w:r>
-      <w:r>
-        <w:t xml:space="preserve">,</w:t>
-      </w:r>
-      <w:r>
-        <w:t xml:space="preserve"> </w:t>
-      </w:r>
-      <w:r>
-        <w:rPr>
-          <w:b/>
-          <w:bCs/>
-        </w:rPr>
-        <w:t xml:space="preserve">hiss</w:t>
-      </w:r>
-      <w:r>
-        <w:t xml:space="preserve">. The reel shows the motor.</w:t>
+        <w:t xml:space="preserve">sing</w:t>
+      </w:r>
+      <w:r>
+        <w:t xml:space="preserve"> </w:t>
+      </w:r>
+      <w:r>
+        <w:t xml:space="preserve">(0 = speech, 1 = sings</w:t>
+      </w:r>
+      <w:r>
+        <w:t xml:space="preserve"> </w:t>
+      </w:r>
+      <w:r>
+        <w:t xml:space="preserve">the scale),</w:t>
+      </w:r>
+      <w:r>
+        <w:t xml:space="preserve"> </w:t>
+      </w:r>
+      <w:r>
+        <w:rPr>
+          <w:b/>
+          <w:bCs/>
+        </w:rPr>
+        <w:t xml:space="preserve">robot</w:t>
+      </w:r>
+      <w:r>
+        <w:t xml:space="preserve"> </w:t>
+      </w:r>
+      <w:r>
+        <w:t xml:space="preserve">(monotone),</w:t>
+      </w:r>
+      <w:r>
+        <w:t xml:space="preserve"> </w:t>
+      </w:r>
+      <w:r>
+        <w:rPr>
+          <w:b/>
+          <w:bCs/>
+        </w:rPr>
+        <w:t xml:space="preserve">lofi</w:t>
+      </w:r>
+      <w:r>
+        <w:t xml:space="preserve"> </w:t>
+      </w:r>
+      <w:r>
+        <w:t xml:space="preserve">(down to Speak &amp; Spell). Keys: a note sets the pitch</w:t>
+      </w:r>
+      <w:r>
+        <w:t xml:space="preserve"> </w:t>
+      </w:r>
+      <w:r>
+        <w:t xml:space="preserve">and says a syllable.</w:t>
       </w:r>
     </w:p>
     <w:p>
       <w:pPr>
         <w:pStyle w:val="Heading3"/>
       </w:pPr>
-      <w:bookmarkStart w:id="55" w:name="_osc3"/>
-      <w:r>
-        <w:t xml:space="preserve">osc3</w:t>
+      <w:bookmarkStart w:id="55" w:name="_deck"/>
+      <w:r>
+        <w:t xml:space="preserve">deck</w:t>
       </w:r>
       <w:bookmarkEnd w:id="55"/>
     </w:p>
@@ -5156,12 +5244,12 @@
           <wp:inline>
             <wp:extent cx="5334000" cy="3253740"/>
             <wp:effectExtent b="0" l="0" r="0" t="0"/>
-            <wp:docPr descr="osc3" title="" id="57" name="Picture"/>
+            <wp:docPr descr="deck" title="" id="57" name="Picture"/>
             <a:graphic>
               <a:graphicData uri="http://schemas.openxmlformats.org/drawingml/2006/picture">
                 <pic:pic>
                   <pic:nvPicPr>
-                    <pic:cNvPr descr="docs/img/osc3.png" id="58" name="Picture"/>
+                    <pic:cNvPr descr="docs/img/deck.png" id="58" name="Picture"/>
                     <pic:cNvPicPr>
                       <a:picLocks noChangeArrowheads="1" noChangeAspect="1"/>
                     </pic:cNvPicPr>
@@ -5197,23 +5285,135 @@
         <w:t xml:space="preserve"> </w:t>
       </w:r>
       <w:r>
-        <w:t xml:space="preserve">A 3xOsc. Three oscillators (sine / tri / saw / square / noise), each with semitones, cents and</w:t>
-      </w:r>
-      <w:r>
-        <w:t xml:space="preserve"> </w:t>
-      </w:r>
-      <w:r>
-        <w:t xml:space="preserve">level. Osc 2 and 3 each</w:t>
-      </w:r>
-      <w:r>
-        <w:t xml:space="preserve"> </w:t>
-      </w:r>
-      <w:r>
-        <w:rPr>
-          <w:b/>
-          <w:bCs/>
-        </w:rPr>
-        <w:t xml:space="preserve">mix</w:t>
+        <w:t xml:space="preserve">A tape player.</w:t>
+      </w:r>
+      <w:r>
+        <w:t xml:space="preserve"> </w:t>
+      </w:r>
+      <w:r>
+        <w:rPr>
+          <w:b/>
+          <w:bCs/>
+        </w:rPr>
+        <w:t xml:space="preserve">open…</w:t>
+      </w:r>
+      <w:r>
+        <w:t xml:space="preserve"> </w:t>
+      </w:r>
+      <w:r>
+        <w:t xml:space="preserve">any audio file,</w:t>
+      </w:r>
+      <w:r>
+        <w:t xml:space="preserve"> </w:t>
+      </w:r>
+      <w:r>
+        <w:rPr>
+          <w:b/>
+          <w:bCs/>
+        </w:rPr>
+        <w:t xml:space="preserve">from folder</w:t>
+      </w:r>
+      <w:r>
+        <w:t xml:space="preserve"> </w:t>
+      </w:r>
+      <w:r>
+        <w:t xml:space="preserve">for a random one. It loops the region</w:t>
+      </w:r>
+      <w:r>
+        <w:t xml:space="preserve"> </w:t>
+      </w:r>
+      <w:r>
+        <w:t xml:space="preserve">forever:</w:t>
+      </w:r>
+      <w:r>
+        <w:t xml:space="preserve"> </w:t>
+      </w:r>
+      <w:r>
+        <w:rPr>
+          <w:b/>
+          <w:bCs/>
+        </w:rPr>
+        <w:t xml:space="preserve">click</w:t>
+      </w:r>
+      <w:r>
+        <w:t xml:space="preserve"> </w:t>
+      </w:r>
+      <w:r>
+        <w:t xml:space="preserve">the waveform to move the playhead,</w:t>
+      </w:r>
+      <w:r>
+        <w:t xml:space="preserve"> </w:t>
+      </w:r>
+      <w:r>
+        <w:rPr>
+          <w:b/>
+          <w:bCs/>
+        </w:rPr>
+        <w:t xml:space="preserve">drag</w:t>
+      </w:r>
+      <w:r>
+        <w:t xml:space="preserve"> </w:t>
+      </w:r>
+      <w:r>
+        <w:t xml:space="preserve">to pick the loop,</w:t>
+      </w:r>
+      <w:r>
+        <w:t xml:space="preserve"> </w:t>
+      </w:r>
+      <w:r>
+        <w:rPr>
+          <w:b/>
+          <w:bCs/>
+        </w:rPr>
+        <w:t xml:space="preserve">whole tape</w:t>
+      </w:r>
+      <w:r>
+        <w:t xml:space="preserve"> </w:t>
+      </w:r>
+      <w:r>
+        <w:t xml:space="preserve">to reset.</w:t>
+      </w:r>
+      <w:r>
+        <w:t xml:space="preserve"> </w:t>
+      </w:r>
+      <w:r>
+        <w:rPr>
+          <w:b/>
+          <w:bCs/>
+        </w:rPr>
+        <w:t xml:space="preserve">speed</w:t>
+      </w:r>
+      <w:r>
+        <w:t xml:space="preserve"> </w:t>
+      </w:r>
+      <w:r>
+        <w:t xml:space="preserve">−8× to 8× through a motor with</w:t>
+      </w:r>
+      <w:r>
+        <w:t xml:space="preserve"> </w:t>
+      </w:r>
+      <w:r>
+        <w:rPr>
+          <w:b/>
+          <w:bCs/>
+        </w:rPr>
+        <w:t xml:space="preserve">inertia</w:t>
+      </w:r>
+      <w:r>
+        <w:t xml:space="preserve"> </w:t>
+      </w:r>
+      <w:r>
+        <w:t xml:space="preserve">(so changes swoop),</w:t>
+      </w:r>
+      <w:r>
+        <w:t xml:space="preserve"> </w:t>
+      </w:r>
+      <w:r>
+        <w:rPr>
+          <w:b/>
+          <w:bCs/>
+        </w:rPr>
+        <w:t xml:space="preserve">semis</w:t>
       </w:r>
       <w:r>
         <w:t xml:space="preserve">,</w:t>
@@ -5226,7 +5426,7 @@
           <w:b/>
           <w:bCs/>
         </w:rPr>
-        <w:t xml:space="preserve">ring</w:t>
+        <w:t xml:space="preserve">stop</w:t>
       </w:r>
       <w:r>
         <w:t xml:space="preserve">,</w:t>
@@ -5239,52 +5439,7 @@
           <w:b/>
           <w:bCs/>
         </w:rPr>
-        <w:t xml:space="preserve">fm</w:t>
-      </w:r>
-      <w:r>
-        <w:t xml:space="preserve"> </w:t>
-      </w:r>
-      <w:r>
-        <w:t xml:space="preserve">or</w:t>
-      </w:r>
-      <w:r>
-        <w:t xml:space="preserve"> </w:t>
-      </w:r>
-      <w:r>
-        <w:rPr>
-          <w:b/>
-          <w:bCs/>
-        </w:rPr>
-        <w:t xml:space="preserve">am</w:t>
-      </w:r>
-      <w:r>
-        <w:t xml:space="preserve"> </w:t>
-      </w:r>
-      <w:r>
-        <w:t xml:space="preserve">into osc 1 (</w:t>
-      </w:r>
-      <w:r>
-        <w:rPr>
-          <w:b/>
-          <w:bCs/>
-        </w:rPr>
-        <w:t xml:space="preserve">fm amt</w:t>
-      </w:r>
-      <w:r>
-        <w:t xml:space="preserve">). A pitch LFO</w:t>
-      </w:r>
-      <w:r>
-        <w:t xml:space="preserve"> </w:t>
-      </w:r>
-      <w:r>
-        <w:t xml:space="preserve">(</w:t>
-      </w:r>
-      <w:r>
-        <w:rPr>
-          <w:b/>
-          <w:bCs/>
-        </w:rPr>
-        <w:t xml:space="preserve">lfo rate</w:t>
+        <w:t xml:space="preserve">spin back</w:t>
       </w:r>
       <w:r>
         <w:t xml:space="preserve">,</w:t>
@@ -5297,55 +5452,119 @@
           <w:b/>
           <w:bCs/>
         </w:rPr>
-        <w:t xml:space="preserve">lfo amt</w:t>
-      </w:r>
-      <w:r>
-        <w:t xml:space="preserve">), envelope (</w:t>
-      </w:r>
-      <w:r>
-        <w:rPr>
-          <w:b/>
-          <w:bCs/>
-        </w:rPr>
-        <w:t xml:space="preserve">atk dec sus rel</w:t>
-      </w:r>
-      <w:r>
-        <w:t xml:space="preserve">), filter (</w:t>
-      </w:r>
-      <w:r>
-        <w:rPr>
-          <w:b/>
-          <w:bCs/>
-        </w:rPr>
-        <w:t xml:space="preserve">cutoff res fenv</w:t>
-      </w:r>
-      <w:r>
-        <w:t xml:space="preserve">). The</w:t>
-      </w:r>
-      <w:r>
-        <w:t xml:space="preserve"> </w:t>
-      </w:r>
-      <w:r>
-        <w:rPr>
-          <w:b/>
-          <w:bCs/>
-        </w:rPr>
-        <w:t xml:space="preserve">lfo → …</w:t>
-      </w:r>
-      <w:r>
-        <w:t xml:space="preserve"> </w:t>
-      </w:r>
-      <w:r>
-        <w:t xml:space="preserve">menu puts a sine mod on any of its knobs in one click. Plays the piano roll or wanders.</w:t>
+        <w:t xml:space="preserve">reverse</w:t>
+      </w:r>
+      <w:r>
+        <w:t xml:space="preserve">,</w:t>
+      </w:r>
+      <w:r>
+        <w:t xml:space="preserve"> </w:t>
+      </w:r>
+      <w:r>
+        <w:rPr>
+          <w:b/>
+          <w:bCs/>
+        </w:rPr>
+        <w:t xml:space="preserve">1x</w:t>
+      </w:r>
+      <w:r>
+        <w:t xml:space="preserve">. Wear:</w:t>
+      </w:r>
+      <w:r>
+        <w:t xml:space="preserve"> </w:t>
+      </w:r>
+      <w:r>
+        <w:rPr>
+          <w:b/>
+          <w:bCs/>
+        </w:rPr>
+        <w:t xml:space="preserve">wow</w:t>
+      </w:r>
+      <w:r>
+        <w:t xml:space="preserve">,</w:t>
+      </w:r>
+      <w:r>
+        <w:t xml:space="preserve"> </w:t>
+      </w:r>
+      <w:r>
+        <w:rPr>
+          <w:b/>
+          <w:bCs/>
+        </w:rPr>
+        <w:t xml:space="preserve">flutter</w:t>
+      </w:r>
+      <w:r>
+        <w:t xml:space="preserve">,</w:t>
+      </w:r>
+      <w:r>
+        <w:t xml:space="preserve"> </w:t>
+      </w:r>
+      <w:r>
+        <w:rPr>
+          <w:b/>
+          <w:bCs/>
+        </w:rPr>
+        <w:t xml:space="preserve">chew</w:t>
+      </w:r>
+      <w:r>
+        <w:t xml:space="preserve"> </w:t>
+      </w:r>
+      <w:r>
+        <w:t xml:space="preserve">(skips and</w:t>
+      </w:r>
+      <w:r>
+        <w:t xml:space="preserve"> </w:t>
+      </w:r>
+      <w:r>
+        <w:t xml:space="preserve">drop-outs),</w:t>
+      </w:r>
+      <w:r>
+        <w:t xml:space="preserve"> </w:t>
+      </w:r>
+      <w:r>
+        <w:rPr>
+          <w:b/>
+          <w:bCs/>
+        </w:rPr>
+        <w:t xml:space="preserve">drive</w:t>
+      </w:r>
+      <w:r>
+        <w:t xml:space="preserve">,</w:t>
+      </w:r>
+      <w:r>
+        <w:t xml:space="preserve"> </w:t>
+      </w:r>
+      <w:r>
+        <w:rPr>
+          <w:b/>
+          <w:bCs/>
+        </w:rPr>
+        <w:t xml:space="preserve">age</w:t>
+      </w:r>
+      <w:r>
+        <w:t xml:space="preserve">,</w:t>
+      </w:r>
+      <w:r>
+        <w:t xml:space="preserve"> </w:t>
+      </w:r>
+      <w:r>
+        <w:rPr>
+          <w:b/>
+          <w:bCs/>
+        </w:rPr>
+        <w:t xml:space="preserve">hiss</w:t>
+      </w:r>
+      <w:r>
+        <w:t xml:space="preserve">. The reel shows the motor.</w:t>
       </w:r>
     </w:p>
     <w:p>
       <w:pPr>
         <w:pStyle w:val="Heading3"/>
       </w:pPr>
-      <w:bookmarkStart w:id="59" w:name="_atari"/>
-      <w:r>
-        <w:t xml:space="preserve">atari</w:t>
+      <w:bookmarkStart w:id="59" w:name="_osc3"/>
+      <w:r>
+        <w:t xml:space="preserve">osc3</w:t>
       </w:r>
       <w:bookmarkEnd w:id="59"/>
     </w:p>
@@ -5358,12 +5577,12 @@
           <wp:inline>
             <wp:extent cx="5334000" cy="3253740"/>
             <wp:effectExtent b="0" l="0" r="0" t="0"/>
-            <wp:docPr descr="atari" title="" id="61" name="Picture"/>
+            <wp:docPr descr="osc3" title="" id="61" name="Picture"/>
             <a:graphic>
               <a:graphicData uri="http://schemas.openxmlformats.org/drawingml/2006/picture">
                 <pic:pic>
                   <pic:nvPicPr>
-                    <pic:cNvPr descr="docs/img/atari.png" id="62" name="Picture"/>
+                    <pic:cNvPr descr="docs/img/osc3.png" id="62" name="Picture"/>
                     <pic:cNvPicPr>
                       <a:picLocks noChangeArrowheads="1" noChangeAspect="1"/>
                     </pic:cNvPicPr>
@@ -5399,118 +5618,155 @@
         <w:t xml:space="preserve"> </w:t>
       </w:r>
       <w:r>
-        <w:t xml:space="preserve">The Atari 2600’s sound chip, emulated from its counters. Two channels, each with the real</w:t>
-      </w:r>
-      <w:r>
-        <w:t xml:space="preserve"> </w:t>
-      </w:r>
-      <w:r>
-        <w:t xml:space="preserve">registers:</w:t>
-      </w:r>
-      <w:r>
-        <w:t xml:space="preserve"> </w:t>
-      </w:r>
-      <w:r>
-        <w:rPr>
-          <w:b/>
-          <w:bCs/>
-        </w:rPr>
-        <w:t xml:space="preserve">wave</w:t>
-      </w:r>
-      <w:r>
-        <w:t xml:space="preserve"> </w:t>
-      </w:r>
-      <w:r>
-        <w:t xml:space="preserve">(AUDC, 16 waveforms: buzz, rumble, pure, bass, lead, white noise…),</w:t>
-      </w:r>
-      <w:r>
-        <w:t xml:space="preserve"> </w:t>
-      </w:r>
-      <w:r>
-        <w:rPr>
-          <w:b/>
-          <w:bCs/>
-        </w:rPr>
-        <w:t xml:space="preserve">freq</w:t>
-      </w:r>
-      <w:r>
-        <w:t xml:space="preserve"> </w:t>
-      </w:r>
-      <w:r>
-        <w:t xml:space="preserve">(AUDF, 0–31),</w:t>
-      </w:r>
-      <w:r>
-        <w:t xml:space="preserve"> </w:t>
-      </w:r>
-      <w:r>
-        <w:rPr>
-          <w:b/>
-          <w:bCs/>
-        </w:rPr>
-        <w:t xml:space="preserve">vol</w:t>
-      </w:r>
-      <w:r>
-        <w:t xml:space="preserve"> </w:t>
-      </w:r>
-      <w:r>
-        <w:t xml:space="preserve">(AUDV, 0–15),</w:t>
-      </w:r>
-      <w:r>
-        <w:t xml:space="preserve"> </w:t>
-      </w:r>
-      <w:r>
-        <w:rPr>
-          <w:b/>
-          <w:bCs/>
-        </w:rPr>
-        <w:t xml:space="preserve">decay</w:t>
-      </w:r>
-      <w:r>
-        <w:t xml:space="preserve">. Channel A plays the roll / wander / keys (notes snap</w:t>
-      </w:r>
-      <w:r>
-        <w:t xml:space="preserve"> </w:t>
-      </w:r>
-      <w:r>
-        <w:t xml:space="preserve">to the nearest AUDF, so they’re out of tune like the real thing); channel B does sound effects.</w:t>
-      </w:r>
-      <w:r>
-        <w:t xml:space="preserve"> </w:t>
-      </w:r>
-      <w:r>
-        <w:rPr>
-          <w:b/>
-          <w:bCs/>
-        </w:rPr>
-        <w:t xml:space="preserve">clock</w:t>
-      </w:r>
-      <w:r>
-        <w:t xml:space="preserve"> </w:t>
-      </w:r>
-      <w:r>
-        <w:t xml:space="preserve">overclocks the chip (</w:t>
-      </w:r>
-      <w:r>
-        <w:rPr>
-          <w:b/>
-          <w:bCs/>
-        </w:rPr>
-        <w:t xml:space="preserve">NTSC</w:t>
-      </w:r>
-      <w:r>
-        <w:t xml:space="preserve"> </w:t>
-      </w:r>
-      <w:r>
-        <w:t xml:space="preserve">resets it).</w:t>
+        <w:t xml:space="preserve">A 3xOsc. Three oscillators (sine / tri / saw / square / noise), each with semitones, cents and</w:t>
+      </w:r>
+      <w:r>
+        <w:t xml:space="preserve"> </w:t>
+      </w:r>
+      <w:r>
+        <w:t xml:space="preserve">level. Osc 2 and 3 each</w:t>
+      </w:r>
+      <w:r>
+        <w:t xml:space="preserve"> </w:t>
+      </w:r>
+      <w:r>
+        <w:rPr>
+          <w:b/>
+          <w:bCs/>
+        </w:rPr>
+        <w:t xml:space="preserve">mix</w:t>
+      </w:r>
+      <w:r>
+        <w:t xml:space="preserve">,</w:t>
+      </w:r>
+      <w:r>
+        <w:t xml:space="preserve"> </w:t>
+      </w:r>
+      <w:r>
+        <w:rPr>
+          <w:b/>
+          <w:bCs/>
+        </w:rPr>
+        <w:t xml:space="preserve">ring</w:t>
+      </w:r>
+      <w:r>
+        <w:t xml:space="preserve">,</w:t>
+      </w:r>
+      <w:r>
+        <w:t xml:space="preserve"> </w:t>
+      </w:r>
+      <w:r>
+        <w:rPr>
+          <w:b/>
+          <w:bCs/>
+        </w:rPr>
+        <w:t xml:space="preserve">fm</w:t>
+      </w:r>
+      <w:r>
+        <w:t xml:space="preserve"> </w:t>
+      </w:r>
+      <w:r>
+        <w:t xml:space="preserve">or</w:t>
+      </w:r>
+      <w:r>
+        <w:t xml:space="preserve"> </w:t>
+      </w:r>
+      <w:r>
+        <w:rPr>
+          <w:b/>
+          <w:bCs/>
+        </w:rPr>
+        <w:t xml:space="preserve">am</w:t>
+      </w:r>
+      <w:r>
+        <w:t xml:space="preserve"> </w:t>
+      </w:r>
+      <w:r>
+        <w:t xml:space="preserve">into osc 1 (</w:t>
+      </w:r>
+      <w:r>
+        <w:rPr>
+          <w:b/>
+          <w:bCs/>
+        </w:rPr>
+        <w:t xml:space="preserve">fm amt</w:t>
+      </w:r>
+      <w:r>
+        <w:t xml:space="preserve">). A pitch LFO</w:t>
+      </w:r>
+      <w:r>
+        <w:t xml:space="preserve"> </w:t>
+      </w:r>
+      <w:r>
+        <w:t xml:space="preserve">(</w:t>
+      </w:r>
+      <w:r>
+        <w:rPr>
+          <w:b/>
+          <w:bCs/>
+        </w:rPr>
+        <w:t xml:space="preserve">lfo rate</w:t>
+      </w:r>
+      <w:r>
+        <w:t xml:space="preserve">,</w:t>
+      </w:r>
+      <w:r>
+        <w:t xml:space="preserve"> </w:t>
+      </w:r>
+      <w:r>
+        <w:rPr>
+          <w:b/>
+          <w:bCs/>
+        </w:rPr>
+        <w:t xml:space="preserve">lfo amt</w:t>
+      </w:r>
+      <w:r>
+        <w:t xml:space="preserve">), envelope (</w:t>
+      </w:r>
+      <w:r>
+        <w:rPr>
+          <w:b/>
+          <w:bCs/>
+        </w:rPr>
+        <w:t xml:space="preserve">atk dec sus rel</w:t>
+      </w:r>
+      <w:r>
+        <w:t xml:space="preserve">), filter (</w:t>
+      </w:r>
+      <w:r>
+        <w:rPr>
+          <w:b/>
+          <w:bCs/>
+        </w:rPr>
+        <w:t xml:space="preserve">cutoff res fenv</w:t>
+      </w:r>
+      <w:r>
+        <w:t xml:space="preserve">). The</w:t>
+      </w:r>
+      <w:r>
+        <w:t xml:space="preserve"> </w:t>
+      </w:r>
+      <w:r>
+        <w:rPr>
+          <w:b/>
+          <w:bCs/>
+        </w:rPr>
+        <w:t xml:space="preserve">lfo → …</w:t>
+      </w:r>
+      <w:r>
+        <w:t xml:space="preserve"> </w:t>
+      </w:r>
+      <w:r>
+        <w:t xml:space="preserve">menu puts a sine mod on any of its knobs in one click. Plays the piano roll or wanders.</w:t>
       </w:r>
     </w:p>
     <w:p>
       <w:pPr>
         <w:pStyle w:val="Heading3"/>
       </w:pPr>
-      <w:bookmarkStart w:id="63" w:name="_drums"/>
-      <w:r>
-        <w:t xml:space="preserve">drums</w:t>
+      <w:bookmarkStart w:id="63" w:name="_atari"/>
+      <w:r>
+        <w:t xml:space="preserve">atari</w:t>
       </w:r>
       <w:bookmarkEnd w:id="63"/>
     </w:p>
@@ -5523,12 +5779,12 @@
           <wp:inline>
             <wp:extent cx="5334000" cy="3253740"/>
             <wp:effectExtent b="0" l="0" r="0" t="0"/>
-            <wp:docPr descr="drums" title="" id="65" name="Picture"/>
+            <wp:docPr descr="atari" title="" id="65" name="Picture"/>
             <a:graphic>
               <a:graphicData uri="http://schemas.openxmlformats.org/drawingml/2006/picture">
                 <pic:pic>
                   <pic:nvPicPr>
-                    <pic:cNvPr descr="docs/img/drums.png" id="66" name="Picture"/>
+                    <pic:cNvPr descr="docs/img/atari.png" id="66" name="Picture"/>
                     <pic:cNvPicPr>
                       <a:picLocks noChangeArrowheads="1" noChangeAspect="1"/>
                     </pic:cNvPicPr>
@@ -5564,246 +5820,118 @@
         <w:t xml:space="preserve"> </w:t>
       </w:r>
       <w:r>
-        <w:t xml:space="preserve">Eight lanes, each its own sequencer.</w:t>
-      </w:r>
-      <w:r>
-        <w:t xml:space="preserve"> </w:t>
-      </w:r>
-      <w:r>
-        <w:rPr>
-          <w:b/>
-          <w:bCs/>
-        </w:rPr>
-        <w:t xml:space="preserve">click</w:t>
-      </w:r>
-      <w:r>
-        <w:t xml:space="preserve"> </w:t>
-      </w:r>
-      <w:r>
-        <w:t xml:space="preserve">= hit,</w:t>
-      </w:r>
-      <w:r>
-        <w:t xml:space="preserve"> </w:t>
-      </w:r>
-      <w:r>
-        <w:rPr>
-          <w:b/>
-          <w:bCs/>
-        </w:rPr>
-        <w:t xml:space="preserve">drag</w:t>
-      </w:r>
-      <w:r>
-        <w:t xml:space="preserve"> </w:t>
-      </w:r>
-      <w:r>
-        <w:t xml:space="preserve">= paint,</w:t>
-      </w:r>
-      <w:r>
-        <w:t xml:space="preserve"> </w:t>
-      </w:r>
-      <w:r>
-        <w:rPr>
-          <w:b/>
-          <w:bCs/>
-        </w:rPr>
-        <w:t xml:space="preserve">right-click</w:t>
-      </w:r>
-      <w:r>
-        <w:t xml:space="preserve"> </w:t>
-      </w:r>
-      <w:r>
-        <w:t xml:space="preserve">a cell =</w:t>
-      </w:r>
-      <w:r>
-        <w:t xml:space="preserve"> </w:t>
-      </w:r>
-      <w:r>
-        <w:t xml:space="preserve">the lane ends there (polymeter). Per lane:</w:t>
-      </w:r>
-      <w:r>
-        <w:t xml:space="preserve"> </w:t>
-      </w:r>
-      <w:r>
-        <w:rPr>
-          <w:b/>
-          <w:bCs/>
-        </w:rPr>
-        <w:t xml:space="preserve">syn / fm / smp</w:t>
-      </w:r>
-      <w:r>
-        <w:t xml:space="preserve"> </w:t>
-      </w:r>
-      <w:r>
-        <w:t xml:space="preserve">(click to cycle the sound),</w:t>
-      </w:r>
-      <w:r>
-        <w:t xml:space="preserve"> </w:t>
-      </w:r>
-      <w:r>
-        <w:rPr>
-          <w:b/>
-          <w:bCs/>
-        </w:rPr>
-        <w:t xml:space="preserve">gen</w:t>
-      </w:r>
-      <w:r>
-        <w:t xml:space="preserve"> </w:t>
-      </w:r>
-      <w:r>
-        <w:t xml:space="preserve">(new pattern),</w:t>
-      </w:r>
-      <w:r>
-        <w:t xml:space="preserve"> </w:t>
-      </w:r>
-      <w:r>
-        <w:rPr>
-          <w:b/>
-          <w:bCs/>
-        </w:rPr>
-        <w:t xml:space="preserve">rnd</w:t>
-      </w:r>
-      <w:r>
-        <w:t xml:space="preserve"> </w:t>
-      </w:r>
-      <w:r>
-        <w:t xml:space="preserve">(random sample slice),</w:t>
-      </w:r>
-      <w:r>
-        <w:t xml:space="preserve"> </w:t>
-      </w:r>
-      <w:r>
-        <w:rPr>
-          <w:b/>
-          <w:bCs/>
-        </w:rPr>
-        <w:t xml:space="preserve">load</w:t>
-      </w:r>
-      <w:r>
-        <w:t xml:space="preserve"> </w:t>
-      </w:r>
-      <w:r>
-        <w:t xml:space="preserve">(your own sample), and knobs for level,</w:t>
-      </w:r>
-      <w:r>
-        <w:t xml:space="preserve"> </w:t>
-      </w:r>
-      <w:r>
-        <w:t xml:space="preserve">pitch, decay, tone, fm ratio, mutate, busy, probability, ratchet, hop. Kit:</w:t>
-      </w:r>
-      <w:r>
-        <w:t xml:space="preserve"> </w:t>
-      </w:r>
-      <w:r>
-        <w:rPr>
-          <w:b/>
-          <w:bCs/>
-        </w:rPr>
-        <w:t xml:space="preserve">style</w:t>
-      </w:r>
-      <w:r>
-        <w:t xml:space="preserve">,</w:t>
-      </w:r>
-      <w:r>
-        <w:t xml:space="preserve"> </w:t>
-      </w:r>
-      <w:r>
-        <w:rPr>
-          <w:b/>
-          <w:bCs/>
-        </w:rPr>
-        <w:t xml:space="preserve">generate kit</w:t>
-      </w:r>
-      <w:r>
-        <w:t xml:space="preserve">,</w:t>
-      </w:r>
-      <w:r>
-        <w:t xml:space="preserve"> </w:t>
-      </w:r>
-      <w:r>
-        <w:rPr>
-          <w:b/>
-          <w:bCs/>
-        </w:rPr>
-        <w:t xml:space="preserve">keep variation</w:t>
-      </w:r>
-      <w:r>
-        <w:t xml:space="preserve">,</w:t>
-      </w:r>
-      <w:r>
-        <w:t xml:space="preserve"> </w:t>
-      </w:r>
-      <w:r>
-        <w:rPr>
-          <w:b/>
-          <w:bCs/>
-        </w:rPr>
-        <w:t xml:space="preserve">new samples</w:t>
-      </w:r>
-      <w:r>
-        <w:t xml:space="preserve">,</w:t>
-      </w:r>
-      <w:r>
-        <w:t xml:space="preserve"> </w:t>
-      </w:r>
-      <w:r>
-        <w:rPr>
-          <w:b/>
-          <w:bCs/>
-        </w:rPr>
-        <w:t xml:space="preserve">long sample…</w:t>
-      </w:r>
-      <w:r>
-        <w:t xml:space="preserve"> </w:t>
-      </w:r>
-      <w:r>
-        <w:t xml:space="preserve">(one long file the whole</w:t>
-      </w:r>
-      <w:r>
-        <w:t xml:space="preserve"> </w:t>
-      </w:r>
-      <w:r>
-        <w:t xml:space="preserve">kit slices from, at its onsets),</w:t>
-      </w:r>
-      <w:r>
-        <w:t xml:space="preserve"> </w:t>
-      </w:r>
-      <w:r>
-        <w:rPr>
-          <w:b/>
-          <w:bCs/>
-        </w:rPr>
-        <w:t xml:space="preserve">all fm</w:t>
-      </w:r>
-      <w:r>
-        <w:t xml:space="preserve">,</w:t>
-      </w:r>
-      <w:r>
-        <w:t xml:space="preserve"> </w:t>
-      </w:r>
-      <w:r>
-        <w:rPr>
-          <w:b/>
-          <w:bCs/>
-        </w:rPr>
-        <w:t xml:space="preserve">all synth</w:t>
-      </w:r>
-      <w:r>
-        <w:t xml:space="preserve">. Solid = your hit, outline = mutation</w:t>
-      </w:r>
-      <w:r>
-        <w:t xml:space="preserve"> </w:t>
-      </w:r>
-      <w:r>
-        <w:t xml:space="preserve">added one, dot = mutation removed one.</w:t>
+        <w:t xml:space="preserve">The Atari 2600’s sound chip, emulated from its counters. Two channels, each with the real</w:t>
+      </w:r>
+      <w:r>
+        <w:t xml:space="preserve"> </w:t>
+      </w:r>
+      <w:r>
+        <w:t xml:space="preserve">registers:</w:t>
+      </w:r>
+      <w:r>
+        <w:t xml:space="preserve"> </w:t>
+      </w:r>
+      <w:r>
+        <w:rPr>
+          <w:b/>
+          <w:bCs/>
+        </w:rPr>
+        <w:t xml:space="preserve">wave</w:t>
+      </w:r>
+      <w:r>
+        <w:t xml:space="preserve"> </w:t>
+      </w:r>
+      <w:r>
+        <w:t xml:space="preserve">(AUDC, 16 waveforms: buzz, rumble, pure, bass, lead, white noise…),</w:t>
+      </w:r>
+      <w:r>
+        <w:t xml:space="preserve"> </w:t>
+      </w:r>
+      <w:r>
+        <w:rPr>
+          <w:b/>
+          <w:bCs/>
+        </w:rPr>
+        <w:t xml:space="preserve">freq</w:t>
+      </w:r>
+      <w:r>
+        <w:t xml:space="preserve"> </w:t>
+      </w:r>
+      <w:r>
+        <w:t xml:space="preserve">(AUDF, 0–31),</w:t>
+      </w:r>
+      <w:r>
+        <w:t xml:space="preserve"> </w:t>
+      </w:r>
+      <w:r>
+        <w:rPr>
+          <w:b/>
+          <w:bCs/>
+        </w:rPr>
+        <w:t xml:space="preserve">vol</w:t>
+      </w:r>
+      <w:r>
+        <w:t xml:space="preserve"> </w:t>
+      </w:r>
+      <w:r>
+        <w:t xml:space="preserve">(AUDV, 0–15),</w:t>
+      </w:r>
+      <w:r>
+        <w:t xml:space="preserve"> </w:t>
+      </w:r>
+      <w:r>
+        <w:rPr>
+          <w:b/>
+          <w:bCs/>
+        </w:rPr>
+        <w:t xml:space="preserve">decay</w:t>
+      </w:r>
+      <w:r>
+        <w:t xml:space="preserve">. Channel A plays the roll / wander / keys (notes snap</w:t>
+      </w:r>
+      <w:r>
+        <w:t xml:space="preserve"> </w:t>
+      </w:r>
+      <w:r>
+        <w:t xml:space="preserve">to the nearest AUDF, so they’re out of tune like the real thing); channel B does sound effects.</w:t>
+      </w:r>
+      <w:r>
+        <w:t xml:space="preserve"> </w:t>
+      </w:r>
+      <w:r>
+        <w:rPr>
+          <w:b/>
+          <w:bCs/>
+        </w:rPr>
+        <w:t xml:space="preserve">clock</w:t>
+      </w:r>
+      <w:r>
+        <w:t xml:space="preserve"> </w:t>
+      </w:r>
+      <w:r>
+        <w:t xml:space="preserve">overclocks the chip (</w:t>
+      </w:r>
+      <w:r>
+        <w:rPr>
+          <w:b/>
+          <w:bCs/>
+        </w:rPr>
+        <w:t xml:space="preserve">NTSC</w:t>
+      </w:r>
+      <w:r>
+        <w:t xml:space="preserve"> </w:t>
+      </w:r>
+      <w:r>
+        <w:t xml:space="preserve">resets it).</w:t>
       </w:r>
     </w:p>
     <w:p>
       <w:pPr>
         <w:pStyle w:val="Heading3"/>
       </w:pPr>
-      <w:bookmarkStart w:id="67" w:name="_558c07a85e7114cb4f79c9c835359eb0d2e8c09"/>
-      <w:r>
-        <w:t xml:space="preserve">creature, hum</w:t>
+      <w:bookmarkStart w:id="67" w:name="_drums"/>
+      <w:r>
+        <w:t xml:space="preserve">drums</w:t>
       </w:r>
       <w:bookmarkEnd w:id="67"/>
     </w:p>
@@ -5814,20 +5942,313 @@
       <w:r>
         <w:drawing>
           <wp:inline>
-            <wp:extent cx="5334000" cy="3171952"/>
+            <wp:extent cx="5334000" cy="3253740"/>
             <wp:effectExtent b="0" l="0" r="0" t="0"/>
-            <wp:docPr descr="creature" title="" id="69" name="Picture"/>
+            <wp:docPr descr="drums" title="" id="69" name="Picture"/>
             <a:graphic>
               <a:graphicData uri="http://schemas.openxmlformats.org/drawingml/2006/picture">
                 <pic:pic>
                   <pic:nvPicPr>
-                    <pic:cNvPr descr="docs/img/creature.png" id="70" name="Picture"/>
+                    <pic:cNvPr descr="docs/img/drums.png" id="70" name="Picture"/>
                     <pic:cNvPicPr>
                       <a:picLocks noChangeArrowheads="1" noChangeAspect="1"/>
                     </pic:cNvPicPr>
                   </pic:nvPicPr>
                   <pic:blipFill>
                     <a:blip r:embed="rId68"/>
+                    <a:stretch>
+                      <a:fillRect/>
+                    </a:stretch>
+                  </pic:blipFill>
+                  <pic:spPr bwMode="auto">
+                    <a:xfrm>
+                      <a:off x="0" y="0"/>
+                      <a:ext cx="5334000" cy="3253740"/>
+                    </a:xfrm>
+                    <a:prstGeom prst="rect">
+                      <a:avLst/>
+                    </a:prstGeom>
+                    <a:noFill/>
+                    <a:ln w="9525">
+                      <a:noFill/>
+                      <a:headEnd/>
+                      <a:tailEnd/>
+                    </a:ln>
+                  </pic:spPr>
+                </pic:pic>
+              </a:graphicData>
+            </a:graphic>
+          </wp:inline>
+        </w:drawing>
+      </w:r>
+      <w:r>
+        <w:t xml:space="preserve"> </w:t>
+      </w:r>
+      <w:r>
+        <w:t xml:space="preserve">Eight lanes, each its own sequencer.</w:t>
+      </w:r>
+      <w:r>
+        <w:t xml:space="preserve"> </w:t>
+      </w:r>
+      <w:r>
+        <w:rPr>
+          <w:b/>
+          <w:bCs/>
+        </w:rPr>
+        <w:t xml:space="preserve">click</w:t>
+      </w:r>
+      <w:r>
+        <w:t xml:space="preserve"> </w:t>
+      </w:r>
+      <w:r>
+        <w:t xml:space="preserve">= hit,</w:t>
+      </w:r>
+      <w:r>
+        <w:t xml:space="preserve"> </w:t>
+      </w:r>
+      <w:r>
+        <w:rPr>
+          <w:b/>
+          <w:bCs/>
+        </w:rPr>
+        <w:t xml:space="preserve">drag</w:t>
+      </w:r>
+      <w:r>
+        <w:t xml:space="preserve"> </w:t>
+      </w:r>
+      <w:r>
+        <w:t xml:space="preserve">= paint,</w:t>
+      </w:r>
+      <w:r>
+        <w:t xml:space="preserve"> </w:t>
+      </w:r>
+      <w:r>
+        <w:rPr>
+          <w:b/>
+          <w:bCs/>
+        </w:rPr>
+        <w:t xml:space="preserve">right-click</w:t>
+      </w:r>
+      <w:r>
+        <w:t xml:space="preserve"> </w:t>
+      </w:r>
+      <w:r>
+        <w:t xml:space="preserve">a cell =</w:t>
+      </w:r>
+      <w:r>
+        <w:t xml:space="preserve"> </w:t>
+      </w:r>
+      <w:r>
+        <w:t xml:space="preserve">the lane ends there (polymeter). Per lane:</w:t>
+      </w:r>
+      <w:r>
+        <w:t xml:space="preserve"> </w:t>
+      </w:r>
+      <w:r>
+        <w:rPr>
+          <w:b/>
+          <w:bCs/>
+        </w:rPr>
+        <w:t xml:space="preserve">syn / fm / smp</w:t>
+      </w:r>
+      <w:r>
+        <w:t xml:space="preserve"> </w:t>
+      </w:r>
+      <w:r>
+        <w:t xml:space="preserve">(click to cycle the sound),</w:t>
+      </w:r>
+      <w:r>
+        <w:t xml:space="preserve"> </w:t>
+      </w:r>
+      <w:r>
+        <w:rPr>
+          <w:b/>
+          <w:bCs/>
+        </w:rPr>
+        <w:t xml:space="preserve">gen</w:t>
+      </w:r>
+      <w:r>
+        <w:t xml:space="preserve"> </w:t>
+      </w:r>
+      <w:r>
+        <w:t xml:space="preserve">(new pattern),</w:t>
+      </w:r>
+      <w:r>
+        <w:t xml:space="preserve"> </w:t>
+      </w:r>
+      <w:r>
+        <w:rPr>
+          <w:b/>
+          <w:bCs/>
+        </w:rPr>
+        <w:t xml:space="preserve">rnd</w:t>
+      </w:r>
+      <w:r>
+        <w:t xml:space="preserve"> </w:t>
+      </w:r>
+      <w:r>
+        <w:t xml:space="preserve">(random sample slice),</w:t>
+      </w:r>
+      <w:r>
+        <w:t xml:space="preserve"> </w:t>
+      </w:r>
+      <w:r>
+        <w:rPr>
+          <w:b/>
+          <w:bCs/>
+        </w:rPr>
+        <w:t xml:space="preserve">load</w:t>
+      </w:r>
+      <w:r>
+        <w:t xml:space="preserve"> </w:t>
+      </w:r>
+      <w:r>
+        <w:t xml:space="preserve">(your own sample), and knobs for level,</w:t>
+      </w:r>
+      <w:r>
+        <w:t xml:space="preserve"> </w:t>
+      </w:r>
+      <w:r>
+        <w:t xml:space="preserve">pitch, decay, tone, fm ratio, mutate, busy, probability, ratchet, hop. Kit:</w:t>
+      </w:r>
+      <w:r>
+        <w:t xml:space="preserve"> </w:t>
+      </w:r>
+      <w:r>
+        <w:rPr>
+          <w:b/>
+          <w:bCs/>
+        </w:rPr>
+        <w:t xml:space="preserve">style</w:t>
+      </w:r>
+      <w:r>
+        <w:t xml:space="preserve">,</w:t>
+      </w:r>
+      <w:r>
+        <w:t xml:space="preserve"> </w:t>
+      </w:r>
+      <w:r>
+        <w:rPr>
+          <w:b/>
+          <w:bCs/>
+        </w:rPr>
+        <w:t xml:space="preserve">generate kit</w:t>
+      </w:r>
+      <w:r>
+        <w:t xml:space="preserve">,</w:t>
+      </w:r>
+      <w:r>
+        <w:t xml:space="preserve"> </w:t>
+      </w:r>
+      <w:r>
+        <w:rPr>
+          <w:b/>
+          <w:bCs/>
+        </w:rPr>
+        <w:t xml:space="preserve">keep variation</w:t>
+      </w:r>
+      <w:r>
+        <w:t xml:space="preserve">,</w:t>
+      </w:r>
+      <w:r>
+        <w:t xml:space="preserve"> </w:t>
+      </w:r>
+      <w:r>
+        <w:rPr>
+          <w:b/>
+          <w:bCs/>
+        </w:rPr>
+        <w:t xml:space="preserve">new samples</w:t>
+      </w:r>
+      <w:r>
+        <w:t xml:space="preserve">,</w:t>
+      </w:r>
+      <w:r>
+        <w:t xml:space="preserve"> </w:t>
+      </w:r>
+      <w:r>
+        <w:rPr>
+          <w:b/>
+          <w:bCs/>
+        </w:rPr>
+        <w:t xml:space="preserve">long sample…</w:t>
+      </w:r>
+      <w:r>
+        <w:t xml:space="preserve"> </w:t>
+      </w:r>
+      <w:r>
+        <w:t xml:space="preserve">(one long file the whole</w:t>
+      </w:r>
+      <w:r>
+        <w:t xml:space="preserve"> </w:t>
+      </w:r>
+      <w:r>
+        <w:t xml:space="preserve">kit slices from, at its onsets),</w:t>
+      </w:r>
+      <w:r>
+        <w:t xml:space="preserve"> </w:t>
+      </w:r>
+      <w:r>
+        <w:rPr>
+          <w:b/>
+          <w:bCs/>
+        </w:rPr>
+        <w:t xml:space="preserve">all fm</w:t>
+      </w:r>
+      <w:r>
+        <w:t xml:space="preserve">,</w:t>
+      </w:r>
+      <w:r>
+        <w:t xml:space="preserve"> </w:t>
+      </w:r>
+      <w:r>
+        <w:rPr>
+          <w:b/>
+          <w:bCs/>
+        </w:rPr>
+        <w:t xml:space="preserve">all synth</w:t>
+      </w:r>
+      <w:r>
+        <w:t xml:space="preserve">. Solid = your hit, outline = mutation</w:t>
+      </w:r>
+      <w:r>
+        <w:t xml:space="preserve"> </w:t>
+      </w:r>
+      <w:r>
+        <w:t xml:space="preserve">added one, dot = mutation removed one.</w:t>
+      </w:r>
+    </w:p>
+    <w:p>
+      <w:pPr>
+        <w:pStyle w:val="Heading3"/>
+      </w:pPr>
+      <w:bookmarkStart w:id="71" w:name="_558c07a85e7114cb4f79c9c835359eb0d2e8c09"/>
+      <w:r>
+        <w:t xml:space="preserve">creature, hum</w:t>
+      </w:r>
+      <w:bookmarkEnd w:id="71"/>
+    </w:p>
+    <w:p>
+      <w:pPr>
+        <w:pStyle w:val="FirstParagraph"/>
+      </w:pPr>
+      <w:r>
+        <w:drawing>
+          <wp:inline>
+            <wp:extent cx="5334000" cy="3171952"/>
+            <wp:effectExtent b="0" l="0" r="0" t="0"/>
+            <wp:docPr descr="creature" title="" id="73" name="Picture"/>
+            <a:graphic>
+              <a:graphicData uri="http://schemas.openxmlformats.org/drawingml/2006/picture">
+                <pic:pic>
+                  <pic:nvPicPr>
+                    <pic:cNvPr descr="docs/img/creature.png" id="74" name="Picture"/>
+                    <pic:cNvPicPr>
+                      <a:picLocks noChangeArrowheads="1" noChangeAspect="1"/>
+                    </pic:cNvPicPr>
+                  </pic:nvPicPr>
+                  <pic:blipFill>
+                    <a:blip r:embed="rId72"/>
                     <a:stretch>
                       <a:fillRect/>
                     </a:stretch>
@@ -5902,11 +6323,11 @@
       <w:pPr>
         <w:pStyle w:val="Heading3"/>
       </w:pPr>
-      <w:bookmarkStart w:id="71" w:name="_b519c9889491143f9f1bbe1f0f598ee8766c00f"/>
+      <w:bookmarkStart w:id="75" w:name="_b519c9889491143f9f1bbe1f0f598ee8766c00f"/>
       <w:r>
         <w:t xml:space="preserve">keys, fm, kick</w:t>
       </w:r>
-      <w:bookmarkEnd w:id="71"/>
+      <w:bookmarkEnd w:id="75"/>
     </w:p>
     <w:p>
       <w:pPr>
@@ -6033,11 +6454,11 @@
       <w:pPr>
         <w:pStyle w:val="Heading2"/>
       </w:pPr>
-      <w:bookmarkStart w:id="72" w:name="_effects"/>
+      <w:bookmarkStart w:id="76" w:name="_effects"/>
       <w:r>
         <w:t xml:space="preserve">11. Effects</w:t>
       </w:r>
-      <w:bookmarkEnd w:id="72"/>
+      <w:bookmarkEnd w:id="76"/>
     </w:p>
     <w:p>
       <w:pPr>
@@ -6052,7 +6473,7 @@
         <w:pStyle w:val="Compact"/>
         <w:numPr>
           <w:ilvl w:val="0"/>
-          <w:numId w:val="1009"/>
+          <w:numId w:val="1010"/>
         </w:numPr>
       </w:pPr>
       <w:r>
@@ -6071,7 +6492,7 @@
         <w:pStyle w:val="Compact"/>
         <w:numPr>
           <w:ilvl w:val="0"/>
-          <w:numId w:val="1009"/>
+          <w:numId w:val="1010"/>
         </w:numPr>
       </w:pPr>
       <w:r>
@@ -6093,7 +6514,7 @@
         <w:pStyle w:val="Compact"/>
         <w:numPr>
           <w:ilvl w:val="1"/>
-          <w:numId w:val="1010"/>
+          <w:numId w:val="1011"/>
         </w:numPr>
       </w:pPr>
       <w:r>
@@ -6112,7 +6533,7 @@
         <w:pStyle w:val="Compact"/>
         <w:numPr>
           <w:ilvl w:val="1"/>
-          <w:numId w:val="1010"/>
+          <w:numId w:val="1011"/>
         </w:numPr>
       </w:pPr>
       <w:r>
@@ -6141,7 +6562,7 @@
         <w:pStyle w:val="Compact"/>
         <w:numPr>
           <w:ilvl w:val="1"/>
-          <w:numId w:val="1010"/>
+          <w:numId w:val="1011"/>
         </w:numPr>
       </w:pPr>
       <w:r>
@@ -6176,7 +6597,7 @@
         <w:pStyle w:val="Compact"/>
         <w:numPr>
           <w:ilvl w:val="1"/>
-          <w:numId w:val="1010"/>
+          <w:numId w:val="1011"/>
         </w:numPr>
       </w:pPr>
       <w:r>
@@ -6228,7 +6649,7 @@
         <w:pStyle w:val="Compact"/>
         <w:numPr>
           <w:ilvl w:val="1"/>
-          <w:numId w:val="1010"/>
+          <w:numId w:val="1011"/>
         </w:numPr>
       </w:pPr>
       <w:r>
@@ -6260,7 +6681,7 @@
         <w:pStyle w:val="Compact"/>
         <w:numPr>
           <w:ilvl w:val="1"/>
-          <w:numId w:val="1010"/>
+          <w:numId w:val="1011"/>
         </w:numPr>
       </w:pPr>
       <w:r>
@@ -6279,7 +6700,7 @@
         <w:pStyle w:val="Compact"/>
         <w:numPr>
           <w:ilvl w:val="0"/>
-          <w:numId w:val="1009"/>
+          <w:numId w:val="1010"/>
         </w:numPr>
       </w:pPr>
       <w:r>
@@ -6339,7 +6760,7 @@
         <w:pStyle w:val="Compact"/>
         <w:numPr>
           <w:ilvl w:val="0"/>
-          <w:numId w:val="1009"/>
+          <w:numId w:val="1010"/>
         </w:numPr>
       </w:pPr>
       <w:r>
@@ -6358,7 +6779,7 @@
         <w:pStyle w:val="Compact"/>
         <w:numPr>
           <w:ilvl w:val="0"/>
-          <w:numId w:val="1009"/>
+          <w:numId w:val="1010"/>
         </w:numPr>
       </w:pPr>
       <w:r>
@@ -6377,7 +6798,7 @@
         <w:pStyle w:val="Compact"/>
         <w:numPr>
           <w:ilvl w:val="0"/>
-          <w:numId w:val="1009"/>
+          <w:numId w:val="1010"/>
         </w:numPr>
       </w:pPr>
       <w:r>
@@ -6396,7 +6817,7 @@
         <w:pStyle w:val="Compact"/>
         <w:numPr>
           <w:ilvl w:val="0"/>
-          <w:numId w:val="1009"/>
+          <w:numId w:val="1010"/>
         </w:numPr>
       </w:pPr>
       <w:r>
@@ -6540,11 +6961,11 @@
       <w:pPr>
         <w:pStyle w:val="Heading2"/>
       </w:pPr>
-      <w:bookmarkStart w:id="73" w:name="_4a04b088d11928ce66d92febf57955f2c36ecae"/>
+      <w:bookmarkStart w:id="77" w:name="_4a04b088d11928ce66d92febf57955f2c36ecae"/>
       <w:r>
         <w:t xml:space="preserve">12. The 8 encoders and MIDI</w:t>
       </w:r>
-      <w:bookmarkEnd w:id="73"/>
+      <w:bookmarkEnd w:id="77"/>
     </w:p>
     <w:p>
       <w:pPr>
@@ -6623,7 +7044,7 @@
         <w:pStyle w:val="Compact"/>
         <w:numPr>
           <w:ilvl w:val="0"/>
-          <w:numId w:val="1011"/>
+          <w:numId w:val="1012"/>
         </w:numPr>
       </w:pPr>
       <w:r>
@@ -6651,7 +7072,7 @@
         <w:pStyle w:val="Compact"/>
         <w:numPr>
           <w:ilvl w:val="0"/>
-          <w:numId w:val="1011"/>
+          <w:numId w:val="1012"/>
         </w:numPr>
       </w:pPr>
       <w:r>
@@ -6698,7 +7119,7 @@
         <w:pStyle w:val="Compact"/>
         <w:numPr>
           <w:ilvl w:val="0"/>
-          <w:numId w:val="1011"/>
+          <w:numId w:val="1012"/>
         </w:numPr>
       </w:pPr>
       <w:r>
@@ -6807,7 +7228,7 @@
         <w:pStyle w:val="Compact"/>
         <w:numPr>
           <w:ilvl w:val="0"/>
-          <w:numId w:val="1011"/>
+          <w:numId w:val="1012"/>
         </w:numPr>
       </w:pPr>
       <w:r>
@@ -6819,7 +7240,7 @@
         <w:pStyle w:val="Compact"/>
         <w:numPr>
           <w:ilvl w:val="0"/>
-          <w:numId w:val="1011"/>
+          <w:numId w:val="1012"/>
         </w:numPr>
       </w:pPr>
       <w:r>
@@ -6831,7 +7252,7 @@
         <w:pStyle w:val="Compact"/>
         <w:numPr>
           <w:ilvl w:val="0"/>
-          <w:numId w:val="1011"/>
+          <w:numId w:val="1012"/>
         </w:numPr>
       </w:pPr>
       <w:r>
@@ -6853,7 +7274,7 @@
         <w:pStyle w:val="Compact"/>
         <w:numPr>
           <w:ilvl w:val="0"/>
-          <w:numId w:val="1011"/>
+          <w:numId w:val="1012"/>
         </w:numPr>
       </w:pPr>
       <w:r>
@@ -6871,11 +7292,11 @@
       <w:pPr>
         <w:pStyle w:val="Heading2"/>
       </w:pPr>
-      <w:bookmarkStart w:id="74" w:name="_dcb5886c37b9352b56e327030ed2248e18665e3"/>
+      <w:bookmarkStart w:id="78" w:name="_dcb5886c37b9352b56e327030ed2248e18665e3"/>
       <w:r>
         <w:t xml:space="preserve">13. Playing it from the keyboard</w:t>
       </w:r>
-      <w:bookmarkEnd w:id="74"/>
+      <w:bookmarkEnd w:id="78"/>
     </w:p>
     <w:tbl>
       <w:tblPr>
@@ -7555,11 +7976,11 @@
       <w:pPr>
         <w:pStyle w:val="Heading2"/>
       </w:pPr>
-      <w:bookmarkStart w:id="75" w:name="_358e8f8637f9e8f3f8dcdc2e2eeccd6f387f989"/>
+      <w:bookmarkStart w:id="79" w:name="_358e8f8637f9e8f3f8dcdc2e2eeccd6f387f989"/>
       <w:r>
         <w:t xml:space="preserve">14. The studio window</w:t>
       </w:r>
-      <w:bookmarkEnd w:id="75"/>
+      <w:bookmarkEnd w:id="79"/>
     </w:p>
     <w:p>
       <w:pPr>
@@ -7570,18 +7991,18 @@
           <wp:inline>
             <wp:extent cx="5334000" cy="3136392"/>
             <wp:effectExtent b="0" l="0" r="0" t="0"/>
-            <wp:docPr descr="studio" title="" id="77" name="Picture"/>
+            <wp:docPr descr="studio" title="" id="81" name="Picture"/>
             <a:graphic>
               <a:graphicData uri="http://schemas.openxmlformats.org/drawingml/2006/picture">
                 <pic:pic>
                   <pic:nvPicPr>
-                    <pic:cNvPr descr="docs/img/studio.png" id="78" name="Picture"/>
+                    <pic:cNvPr descr="docs/img/studio.png" id="82" name="Picture"/>
                     <pic:cNvPicPr>
                       <a:picLocks noChangeArrowheads="1" noChangeAspect="1"/>
                     </pic:cNvPicPr>
                   </pic:nvPicPr>
                   <pic:blipFill>
-                    <a:blip r:embed="rId76"/>
+                    <a:blip r:embed="rId80"/>
                     <a:stretch>
                       <a:fillRect/>
                     </a:stretch>
@@ -7658,7 +8079,7 @@
         <w:pStyle w:val="Compact"/>
         <w:numPr>
           <w:ilvl w:val="0"/>
-          <w:numId w:val="1012"/>
+          <w:numId w:val="1013"/>
         </w:numPr>
       </w:pPr>
       <w:r>
@@ -7731,7 +8152,7 @@
         <w:pStyle w:val="Compact"/>
         <w:numPr>
           <w:ilvl w:val="0"/>
-          <w:numId w:val="1012"/>
+          <w:numId w:val="1013"/>
         </w:numPr>
       </w:pPr>
       <w:r>
@@ -7842,7 +8263,7 @@
         <w:pStyle w:val="Compact"/>
         <w:numPr>
           <w:ilvl w:val="0"/>
-          <w:numId w:val="1012"/>
+          <w:numId w:val="1013"/>
         </w:numPr>
       </w:pPr>
       <w:r>
@@ -7886,7 +8307,7 @@
         <w:pStyle w:val="Compact"/>
         <w:numPr>
           <w:ilvl w:val="0"/>
-          <w:numId w:val="1012"/>
+          <w:numId w:val="1013"/>
         </w:numPr>
       </w:pPr>
       <w:r>
@@ -8007,7 +8428,7 @@
         <w:pStyle w:val="Compact"/>
         <w:numPr>
           <w:ilvl w:val="0"/>
-          <w:numId w:val="1012"/>
+          <w:numId w:val="1013"/>
         </w:numPr>
       </w:pPr>
       <w:r>
@@ -8033,18 +8454,18 @@
           <wp:inline>
             <wp:extent cx="5334000" cy="3136392"/>
             <wp:effectExtent b="0" l="0" r="0" t="0"/>
-            <wp:docPr descr="every mod in the set" title="" id="80" name="Picture"/>
+            <wp:docPr descr="every mod in the set" title="" id="84" name="Picture"/>
             <a:graphic>
               <a:graphicData uri="http://schemas.openxmlformats.org/drawingml/2006/picture">
                 <pic:pic>
                   <pic:nvPicPr>
-                    <pic:cNvPr descr="docs/img/studio-mods.png" id="81" name="Picture"/>
+                    <pic:cNvPr descr="docs/img/studio-mods.png" id="85" name="Picture"/>
                     <pic:cNvPicPr>
                       <a:picLocks noChangeArrowheads="1" noChangeAspect="1"/>
                     </pic:cNvPicPr>
                   </pic:nvPicPr>
                   <pic:blipFill>
-                    <a:blip r:embed="rId79"/>
+                    <a:blip r:embed="rId83"/>
                     <a:stretch>
                       <a:fillRect/>
                     </a:stretch>
@@ -8090,547 +8511,11 @@
       <w:pPr>
         <w:pStyle w:val="Heading2"/>
       </w:pPr>
-      <w:bookmarkStart w:id="82" w:name="_09631190d1167c1cfccf743b08f42330a821ecc"/>
+      <w:bookmarkStart w:id="86" w:name="_09631190d1167c1cfccf743b08f42330a821ecc"/>
       <w:r>
         <w:t xml:space="preserve">15. Sets, scenes, files</w:t>
       </w:r>
-      <w:bookmarkEnd w:id="82"/>
-    </w:p>
-    <w:p>
-      <w:pPr>
-        <w:pStyle w:val="Compact"/>
-        <w:numPr>
-          <w:ilvl w:val="0"/>
-          <w:numId w:val="1013"/>
-        </w:numPr>
-      </w:pPr>
-      <w:r>
-        <w:rPr>
-          <w:b/>
-          <w:bCs/>
-        </w:rPr>
-        <w:t xml:space="preserve">save / load</w:t>
-      </w:r>
-      <w:r>
-        <w:t xml:space="preserve"> </w:t>
-      </w:r>
-      <w:r>
-        <w:t xml:space="preserve">(top bar): a whole set (tracks, devices, sends, mods, scenes, song, MIDI maps,</w:t>
-      </w:r>
-      <w:r>
-        <w:t xml:space="preserve"> </w:t>
-      </w:r>
-      <w:r>
-        <w:t xml:space="preserve">the wall, loaded files’ paths) in one</w:t>
-      </w:r>
-      <w:r>
-        <w:t xml:space="preserve"> </w:t>
-      </w:r>
-      <w:r>
-        <w:rPr>
-          <w:rStyle w:val="VerbatimChar"/>
-        </w:rPr>
-        <w:t xml:space="preserve">.unsound</w:t>
-      </w:r>
-      <w:r>
-        <w:t xml:space="preserve"> </w:t>
-      </w:r>
-      <w:r>
-        <w:t xml:space="preserve">file. Sets go in</w:t>
-      </w:r>
-      <w:r>
-        <w:t xml:space="preserve"> </w:t>
-      </w:r>
-      <w:r>
-        <w:rPr>
-          <w:rStyle w:val="VerbatimChar"/>
-        </w:rPr>
-        <w:t xml:space="preserve">sets/</w:t>
-      </w:r>
-      <w:r>
-        <w:t xml:space="preserve"> </w:t>
-      </w:r>
-      <w:r>
-        <w:t xml:space="preserve">by default.</w:t>
-      </w:r>
-    </w:p>
-    <w:p>
-      <w:pPr>
-        <w:pStyle w:val="Compact"/>
-        <w:numPr>
-          <w:ilvl w:val="0"/>
-          <w:numId w:val="1013"/>
-        </w:numPr>
-      </w:pPr>
-      <w:r>
-        <w:rPr>
-          <w:b/>
-          <w:bCs/>
-        </w:rPr>
-        <w:t xml:space="preserve">keeps</w:t>
-      </w:r>
-      <w:r>
-        <w:t xml:space="preserve"> </w:t>
-      </w:r>
-      <w:r>
-        <w:t xml:space="preserve">and recordings go to</w:t>
-      </w:r>
-      <w:r>
-        <w:t xml:space="preserve"> </w:t>
-      </w:r>
-      <w:r>
-        <w:rPr>
-          <w:rStyle w:val="VerbatimChar"/>
-        </w:rPr>
-        <w:t xml:space="preserve">~/Music/unsound/</w:t>
-      </w:r>
-      <w:r>
-        <w:t xml:space="preserve">.</w:t>
-      </w:r>
-    </w:p>
-    <w:p>
-      <w:pPr>
-        <w:pStyle w:val="Compact"/>
-        <w:numPr>
-          <w:ilvl w:val="0"/>
-          <w:numId w:val="1013"/>
-        </w:numPr>
-      </w:pPr>
-      <w:r>
-        <w:t xml:space="preserve">The sample folder is</w:t>
-      </w:r>
-      <w:r>
-        <w:t xml:space="preserve"> </w:t>
-      </w:r>
-      <w:r>
-        <w:rPr>
-          <w:rStyle w:val="VerbatimChar"/>
-        </w:rPr>
-        <w:t xml:space="preserve">~folder</w:t>
-      </w:r>
-      <w:r>
-        <w:t xml:space="preserve"> </w:t>
-      </w:r>
-      <w:r>
-        <w:t xml:space="preserve">in</w:t>
-      </w:r>
-      <w:r>
-        <w:t xml:space="preserve"> </w:t>
-      </w:r>
-      <w:r>
-        <w:rPr>
-          <w:rStyle w:val="VerbatimChar"/>
-        </w:rPr>
-        <w:t xml:space="preserve">play.scd</w:t>
-      </w:r>
-      <w:r>
-        <w:t xml:space="preserve">;</w:t>
-      </w:r>
-      <w:r>
-        <w:t xml:space="preserve"> </w:t>
-      </w:r>
-      <w:r>
-        <w:rPr>
-          <w:rStyle w:val="VerbatimChar"/>
-        </w:rPr>
-        <w:t xml:space="preserve">~reload.("~/some/folder")</w:t>
-      </w:r>
-      <w:r>
-        <w:t xml:space="preserve"> </w:t>
-      </w:r>
-      <w:r>
-        <w:t xml:space="preserve">swaps it while playing.</w:t>
-      </w:r>
-    </w:p>
-    <w:p>
-      <w:r>
-        <w:pict>
-          <v:rect style="width:0;height:1.5pt" o:hralign="center" o:hrstd="t" o:hr="t"/>
-        </w:pict>
-      </w:r>
-    </w:p>
-    <w:p>
-      <w:pPr>
-        <w:pStyle w:val="Heading2"/>
-      </w:pPr>
-      <w:bookmarkStart w:id="83" w:name="_41a0df473373c60c9872098155e6e0a6a20ee2d"/>
-      <w:r>
-        <w:t xml:space="preserve">16. From code (</w:t>
-      </w:r>
-      <w:r>
-        <w:rPr>
-          <w:rStyle w:val="VerbatimChar"/>
-        </w:rPr>
-        <w:t xml:space="preserve">play.scd</w:t>
-      </w:r>
-      <w:r>
-        <w:t xml:space="preserve">)</w:t>
-      </w:r>
-      <w:bookmarkEnd w:id="83"/>
-    </w:p>
-    <w:p>
-      <w:pPr>
-        <w:pStyle w:val="FirstParagraph"/>
-      </w:pPr>
-      <w:r>
-        <w:t xml:space="preserve">Everything in the window can be done from code. A few favourites:</w:t>
-      </w:r>
-    </w:p>
-    <w:p>
-      <w:pPr>
-        <w:pStyle w:val="SourceCode"/>
-      </w:pPr>
-      <w:r>
-        <w:rPr>
-          <w:rStyle w:val="VerbatimChar"/>
-        </w:rPr>
-        <w:t xml:space="preserve">~add.(\mouth);                         // a new track</w:t>
-      </w:r>
-      <w:r>
-        <w:br/>
-      </w:r>
-      <w:r>
-        <w:rPr>
-          <w:rStyle w:val="VerbatimChar"/>
-        </w:rPr>
-        <w:t xml:space="preserve">~dev.(\bytebeat, \overflow);           // an effect on a track</w:t>
-      </w:r>
-      <w:r>
-        <w:br/>
-      </w:r>
-      <w:r>
-        <w:rPr>
-          <w:rStyle w:val="VerbatimChar"/>
-        </w:rPr>
-        <w:t xml:space="preserve">~tset.(\mouth, \text, "hello");        // any track setting</w:t>
-      </w:r>
-      <w:r>
-        <w:br/>
-      </w:r>
-      <w:r>
-        <w:rPr>
-          <w:rStyle w:val="VerbatimChar"/>
-        </w:rPr>
-        <w:t xml:space="preserve">~send.(\grains, \A, 0.6);              // a send</w:t>
-      </w:r>
-      <w:r>
-        <w:br/>
-      </w:r>
-      <w:r>
-        <w:rPr>
-          <w:rStyle w:val="VerbatimChar"/>
-        </w:rPr>
-        <w:t xml:space="preserve">~ramp.(\bytebeat, \rate, 20000, 16);   // glide a setting over 16 beats</w:t>
-      </w:r>
-      <w:r>
-        <w:br/>
-      </w:r>
-      <w:r>
-        <w:rPr>
-          <w:rStyle w:val="VerbatimChar"/>
-        </w:rPr>
-        <w:t xml:space="preserve">~wallPick.(5);                         // the scream wall</w:t>
-      </w:r>
-      <w:r>
-        <w:br/>
-      </w:r>
-      <w:r>
-        <w:rPr>
-          <w:rStyle w:val="VerbatimChar"/>
-        </w:rPr>
-        <w:t xml:space="preserve">~takeover.(\bytebeat2, 1);             // takeover from code</w:t>
-      </w:r>
-      <w:r>
-        <w:br/>
-      </w:r>
-      <w:r>
-        <w:rPr>
-          <w:rStyle w:val="VerbatimChar"/>
-        </w:rPr>
-        <w:t xml:space="preserve">~keep.(120);                           // keep the last two minutes</w:t>
-      </w:r>
-      <w:r>
-        <w:br/>
-      </w:r>
-      <w:r>
-        <w:rPr>
-          <w:rStyle w:val="VerbatimChar"/>
-        </w:rPr>
-        <w:t xml:space="preserve">~song = List[[0, 16], [1, 8]]; ~playSong.();   // scenes in order: [scene, bars]</w:t>
-      </w:r>
-    </w:p>
-    <w:p>
-      <w:pPr>
-        <w:pStyle w:val="FirstParagraph"/>
-      </w:pPr>
-      <w:r>
-        <w:rPr>
-          <w:b/>
-          <w:bCs/>
-        </w:rPr>
-        <w:t xml:space="preserve">Make your own</w:t>
-      </w:r>
-      <w:r>
-        <w:t xml:space="preserve">:</w:t>
-      </w:r>
-      <w:r>
-        <w:t xml:space="preserve"> </w:t>
-      </w:r>
-      <w:r>
-        <w:t xml:space="preserve">- a</w:t>
-      </w:r>
-      <w:r>
-        <w:t xml:space="preserve"> </w:t>
-      </w:r>
-      <w:r>
-        <w:rPr>
-          <w:b/>
-          <w:bCs/>
-        </w:rPr>
-        <w:t xml:space="preserve">noise kind</w:t>
-      </w:r>
-      <w:r>
-        <w:t xml:space="preserve">: one line in</w:t>
-      </w:r>
-      <w:r>
-        <w:t xml:space="preserve"> </w:t>
-      </w:r>
-      <w:r>
-        <w:rPr>
-          <w:rStyle w:val="VerbatimChar"/>
-        </w:rPr>
-        <w:t xml:space="preserve">~noiseKinds</w:t>
-      </w:r>
-      <w:r>
-        <w:t xml:space="preserve"> </w:t>
-      </w:r>
-      <w:r>
-        <w:t xml:space="preserve">(</w:t>
-      </w:r>
-      <w:r>
-        <w:rPr>
-          <w:rStyle w:val="VerbatimChar"/>
-        </w:rPr>
-        <w:t xml:space="preserve">lib/voices/noisegen.scd</w:t>
-      </w:r>
-      <w:r>
-        <w:t xml:space="preserve">):</w:t>
-      </w:r>
-      <w:r>
-        <w:t xml:space="preserve"> </w:t>
-      </w:r>
-      <w:r>
-        <w:rPr>
-          <w:rStyle w:val="VerbatimChar"/>
-        </w:rPr>
-        <w:t xml:space="preserve">["name", { |rate, char| signal }]</w:t>
-      </w:r>
-      <w:r>
-        <w:t xml:space="preserve"> </w:t>
-      </w:r>
-      <w:r>
-        <w:t xml:space="preserve">- a</w:t>
-      </w:r>
-      <w:r>
-        <w:t xml:space="preserve"> </w:t>
-      </w:r>
-      <w:r>
-        <w:rPr>
-          <w:b/>
-          <w:bCs/>
-        </w:rPr>
-        <w:t xml:space="preserve">wall</w:t>
-      </w:r>
-      <w:r>
-        <w:t xml:space="preserve">: one line in</w:t>
-      </w:r>
-      <w:r>
-        <w:t xml:space="preserve"> </w:t>
-      </w:r>
-      <w:r>
-        <w:rPr>
-          <w:rStyle w:val="VerbatimChar"/>
-        </w:rPr>
-        <w:t xml:space="preserve">~wallTypes</w:t>
-      </w:r>
-      <w:r>
-        <w:t xml:space="preserve"> </w:t>
-      </w:r>
-      <w:r>
-        <w:t xml:space="preserve">(</w:t>
-      </w:r>
-      <w:r>
-        <w:rPr>
-          <w:rStyle w:val="VerbatimChar"/>
-        </w:rPr>
-        <w:t xml:space="preserve">lib/wall.scd</w:t>
-      </w:r>
-      <w:r>
-        <w:t xml:space="preserve">):</w:t>
-      </w:r>
-      <w:r>
-        <w:t xml:space="preserve"> </w:t>
-      </w:r>
-      <w:r>
-        <w:rPr>
-          <w:rStyle w:val="VerbatimChar"/>
-        </w:rPr>
-        <w:t xml:space="preserve">["name", { |dens, grit, motion| stereo signal }]</w:t>
-      </w:r>
-      <w:r>
-        <w:t xml:space="preserve"> </w:t>
-      </w:r>
-      <w:r>
-        <w:t xml:space="preserve">- an</w:t>
-      </w:r>
-      <w:r>
-        <w:t xml:space="preserve"> </w:t>
-      </w:r>
-      <w:r>
-        <w:rPr>
-          <w:b/>
-          <w:bCs/>
-        </w:rPr>
-        <w:t xml:space="preserve">effect</w:t>
-      </w:r>
-      <w:r>
-        <w:t xml:space="preserve">: a</w:t>
-      </w:r>
-      <w:r>
-        <w:t xml:space="preserve"> </w:t>
-      </w:r>
-      <w:r>
-        <w:rPr>
-          <w:rStyle w:val="VerbatimChar"/>
-        </w:rPr>
-        <w:t xml:space="preserve">~deviceDef</w:t>
-      </w:r>
-      <w:r>
-        <w:t xml:space="preserve"> </w:t>
-      </w:r>
-      <w:r>
-        <w:t xml:space="preserve">and an entry in</w:t>
-      </w:r>
-      <w:r>
-        <w:t xml:space="preserve"> </w:t>
-      </w:r>
-      <w:r>
-        <w:rPr>
-          <w:rStyle w:val="VerbatimChar"/>
-        </w:rPr>
-        <w:t xml:space="preserve">~deviceTypes</w:t>
-      </w:r>
-      <w:r>
-        <w:t xml:space="preserve"> </w:t>
-      </w:r>
-      <w:r>
-        <w:t xml:space="preserve">(</w:t>
-      </w:r>
-      <w:r>
-        <w:rPr>
-          <w:rStyle w:val="VerbatimChar"/>
-        </w:rPr>
-        <w:t xml:space="preserve">lib/devices.scd</w:t>
-      </w:r>
-      <w:r>
-        <w:t xml:space="preserve">), plus a</w:t>
-      </w:r>
-      <w:r>
-        <w:t xml:space="preserve"> </w:t>
-      </w:r>
-      <w:r>
-        <w:t xml:space="preserve">description in</w:t>
-      </w:r>
-      <w:r>
-        <w:t xml:space="preserve"> </w:t>
-      </w:r>
-      <w:r>
-        <w:rPr>
-          <w:rStyle w:val="VerbatimChar"/>
-        </w:rPr>
-        <w:t xml:space="preserve">lib/descriptions.scd</w:t>
-      </w:r>
-      <w:r>
-        <w:t xml:space="preserve"> </w:t>
-      </w:r>
-      <w:r>
-        <w:t xml:space="preserve">- an</w:t>
-      </w:r>
-      <w:r>
-        <w:t xml:space="preserve"> </w:t>
-      </w:r>
-      <w:r>
-        <w:rPr>
-          <w:b/>
-          <w:bCs/>
-        </w:rPr>
-        <w:t xml:space="preserve">instrument</w:t>
-      </w:r>
-      <w:r>
-        <w:t xml:space="preserve">: a file in</w:t>
-      </w:r>
-      <w:r>
-        <w:t xml:space="preserve"> </w:t>
-      </w:r>
-      <w:r>
-        <w:rPr>
-          <w:rStyle w:val="VerbatimChar"/>
-        </w:rPr>
-        <w:t xml:space="preserve">lib/voices/</w:t>
-      </w:r>
-      <w:r>
-        <w:t xml:space="preserve"> </w:t>
-      </w:r>
-      <w:r>
-        <w:t xml:space="preserve">registering</w:t>
-      </w:r>
-      <w:r>
-        <w:t xml:space="preserve"> </w:t>
-      </w:r>
-      <w:r>
-        <w:rPr>
-          <w:rStyle w:val="VerbatimChar"/>
-        </w:rPr>
-        <w:t xml:space="preserve">~voiceTypes[\name]</w:t>
-      </w:r>
-      <w:r>
-        <w:t xml:space="preserve"> </w:t>
-      </w:r>
-      <w:r>
-        <w:t xml:space="preserve">(copy one), added to</w:t>
-      </w:r>
-      <w:r>
-        <w:t xml:space="preserve"> </w:t>
-      </w:r>
-      <w:r>
-        <w:t xml:space="preserve">the list in</w:t>
-      </w:r>
-      <w:r>
-        <w:t xml:space="preserve"> </w:t>
-      </w:r>
-      <w:r>
-        <w:rPr>
-          <w:rStyle w:val="VerbatimChar"/>
-        </w:rPr>
-        <w:t xml:space="preserve">unsound.scd</w:t>
-      </w:r>
-    </w:p>
-    <w:p>
-      <w:r>
-        <w:pict>
-          <v:rect style="width:0;height:1.5pt" o:hralign="center" o:hrstd="t" o:hr="t"/>
-        </w:pict>
-      </w:r>
-    </w:p>
-    <w:p>
-      <w:pPr>
-        <w:pStyle w:val="Heading2"/>
-      </w:pPr>
-      <w:bookmarkStart w:id="84" w:name="_340fc2f84be01f35e34ce906de44e355ea89354"/>
-      <w:r>
-        <w:t xml:space="preserve">17. When something’s wrong</w:t>
-      </w:r>
-      <w:bookmarkEnd w:id="84"/>
+      <w:bookmarkEnd w:id="86"/>
     </w:p>
     <w:p>
       <w:pPr>
@@ -8645,52 +8530,49 @@
           <w:b/>
           <w:bCs/>
         </w:rPr>
-        <w:t xml:space="preserve">Silence</w:t>
-      </w:r>
-      <w:r>
-        <w:t xml:space="preserve">: is</w:t>
-      </w:r>
-      <w:r>
-        <w:t xml:space="preserve"> </w:t>
-      </w:r>
-      <w:r>
-        <w:rPr>
-          <w:b/>
-          <w:bCs/>
-        </w:rPr>
-        <w:t xml:space="preserve">play</w:t>
-      </w:r>
-      <w:r>
-        <w:t xml:space="preserve"> </w:t>
-      </w:r>
-      <w:r>
-        <w:t xml:space="preserve">on? Is the track muted (</w:t>
-      </w:r>
-      <w:r>
-        <w:rPr>
-          <w:b/>
-          <w:bCs/>
-        </w:rPr>
-        <w:t xml:space="preserve">M</w:t>
-      </w:r>
-      <w:r>
-        <w:t xml:space="preserve">), or something else soloed (</w:t>
-      </w:r>
-      <w:r>
-        <w:rPr>
-          <w:b/>
-          <w:bCs/>
-        </w:rPr>
-        <w:t xml:space="preserve">S</w:t>
-      </w:r>
-      <w:r>
-        <w:t xml:space="preserve">)? Is the</w:t>
-      </w:r>
-      <w:r>
-        <w:t xml:space="preserve"> </w:t>
-      </w:r>
-      <w:r>
-        <w:t xml:space="preserve">wall faded out? Cmd-. and play again.</w:t>
+        <w:t xml:space="preserve">save / load</w:t>
+      </w:r>
+      <w:r>
+        <w:t xml:space="preserve"> </w:t>
+      </w:r>
+      <w:r>
+        <w:t xml:space="preserve">(top bar): a whole set (tracks, devices, sends, mods, scenes, song, MIDI maps,</w:t>
+      </w:r>
+      <w:r>
+        <w:t xml:space="preserve"> </w:t>
+      </w:r>
+      <w:r>
+        <w:t xml:space="preserve">the wall, loaded files’ paths) in one</w:t>
+      </w:r>
+      <w:r>
+        <w:t xml:space="preserve"> </w:t>
+      </w:r>
+      <w:r>
+        <w:rPr>
+          <w:rStyle w:val="VerbatimChar"/>
+        </w:rPr>
+        <w:t xml:space="preserve">.unsound</w:t>
+      </w:r>
+      <w:r>
+        <w:t xml:space="preserve"> </w:t>
+      </w:r>
+      <w:r>
+        <w:t xml:space="preserve">file. Sets go in</w:t>
+      </w:r>
+      <w:r>
+        <w:t xml:space="preserve"> </w:t>
+      </w:r>
+      <w:r>
+        <w:rPr>
+          <w:rStyle w:val="VerbatimChar"/>
+        </w:rPr>
+        <w:t xml:space="preserve">sets/</w:t>
+      </w:r>
+      <w:r>
+        <w:t xml:space="preserve"> </w:t>
+      </w:r>
+      <w:r>
+        <w:t xml:space="preserve">by default.</w:t>
       </w:r>
     </w:p>
     <w:p>
@@ -8706,16 +8588,25 @@
           <w:b/>
           <w:bCs/>
         </w:rPr>
-        <w:t xml:space="preserve">Way too loud</w:t>
-      </w:r>
-      <w:r>
-        <w:t xml:space="preserve">: the master’s limiter catches it; pull the master pad’s volume down, or turn the</w:t>
-      </w:r>
-      <w:r>
-        <w:t xml:space="preserve"> </w:t>
-      </w:r>
-      <w:r>
-        <w:t xml:space="preserve">takeover slider back to empty.</w:t>
+        <w:t xml:space="preserve">keeps</w:t>
+      </w:r>
+      <w:r>
+        <w:t xml:space="preserve"> </w:t>
+      </w:r>
+      <w:r>
+        <w:t xml:space="preserve">and recordings go to</w:t>
+      </w:r>
+      <w:r>
+        <w:t xml:space="preserve"> </w:t>
+      </w:r>
+      <w:r>
+        <w:rPr>
+          <w:rStyle w:val="VerbatimChar"/>
+        </w:rPr>
+        <w:t xml:space="preserve">~/Music/unsound/</w:t>
+      </w:r>
+      <w:r>
+        <w:t xml:space="preserve">.</w:t>
       </w:r>
     </w:p>
     <w:p>
@@ -8727,28 +8618,447 @@
         </w:numPr>
       </w:pPr>
       <w:r>
-        <w:rPr>
-          <w:b/>
-          <w:bCs/>
-        </w:rPr>
-        <w:t xml:space="preserve">The server won’t boot</w:t>
-      </w:r>
-      <w:r>
-        <w:t xml:space="preserve">: the input and output sample rates differ (e.g. AirPods mic). unsound</w:t>
-      </w:r>
-      <w:r>
-        <w:t xml:space="preserve"> </w:t>
-      </w:r>
-      <w:r>
-        <w:t xml:space="preserve">starts without inputs to avoid that; if it still fails, pick one output device in Audio MIDI Setup.</w:t>
-      </w:r>
+        <w:t xml:space="preserve">The sample folder is</w:t>
+      </w:r>
+      <w:r>
+        <w:t xml:space="preserve"> </w:t>
+      </w:r>
+      <w:r>
+        <w:rPr>
+          <w:rStyle w:val="VerbatimChar"/>
+        </w:rPr>
+        <w:t xml:space="preserve">~folder</w:t>
+      </w:r>
+      <w:r>
+        <w:t xml:space="preserve"> </w:t>
+      </w:r>
+      <w:r>
+        <w:t xml:space="preserve">in</w:t>
+      </w:r>
+      <w:r>
+        <w:t xml:space="preserve"> </w:t>
+      </w:r>
+      <w:r>
+        <w:rPr>
+          <w:rStyle w:val="VerbatimChar"/>
+        </w:rPr>
+        <w:t xml:space="preserve">play.scd</w:t>
+      </w:r>
+      <w:r>
+        <w:t xml:space="preserve">;</w:t>
+      </w:r>
+      <w:r>
+        <w:t xml:space="preserve"> </w:t>
+      </w:r>
+      <w:r>
+        <w:rPr>
+          <w:rStyle w:val="VerbatimChar"/>
+        </w:rPr>
+        <w:t xml:space="preserve">~reload.("~/some/folder")</w:t>
+      </w:r>
+      <w:r>
+        <w:t xml:space="preserve"> </w:t>
+      </w:r>
+      <w:r>
+        <w:t xml:space="preserve">swaps it while playing.</w:t>
+      </w:r>
+    </w:p>
+    <w:p>
+      <w:r>
+        <w:pict>
+          <v:rect style="width:0;height:1.5pt" o:hralign="center" o:hrstd="t" o:hr="t"/>
+        </w:pict>
+      </w:r>
+    </w:p>
+    <w:p>
+      <w:pPr>
+        <w:pStyle w:val="Heading2"/>
+      </w:pPr>
+      <w:bookmarkStart w:id="87" w:name="_41a0df473373c60c9872098155e6e0a6a20ee2d"/>
+      <w:r>
+        <w:t xml:space="preserve">16. From code (</w:t>
+      </w:r>
+      <w:r>
+        <w:rPr>
+          <w:rStyle w:val="VerbatimChar"/>
+        </w:rPr>
+        <w:t xml:space="preserve">play.scd</w:t>
+      </w:r>
+      <w:r>
+        <w:t xml:space="preserve">)</w:t>
+      </w:r>
+      <w:bookmarkEnd w:id="87"/>
+    </w:p>
+    <w:p>
+      <w:pPr>
+        <w:pStyle w:val="FirstParagraph"/>
+      </w:pPr>
+      <w:r>
+        <w:t xml:space="preserve">Everything in the window can be done from code. A few favourites:</w:t>
+      </w:r>
+    </w:p>
+    <w:p>
+      <w:pPr>
+        <w:pStyle w:val="SourceCode"/>
+      </w:pPr>
+      <w:r>
+        <w:rPr>
+          <w:rStyle w:val="VerbatimChar"/>
+        </w:rPr>
+        <w:t xml:space="preserve">~add.(\mouth);                         // a new track</w:t>
+      </w:r>
+      <w:r>
+        <w:br/>
+      </w:r>
+      <w:r>
+        <w:rPr>
+          <w:rStyle w:val="VerbatimChar"/>
+        </w:rPr>
+        <w:t xml:space="preserve">~dev.(\bytebeat, \overflow);           // an effect on a track</w:t>
+      </w:r>
+      <w:r>
+        <w:br/>
+      </w:r>
+      <w:r>
+        <w:rPr>
+          <w:rStyle w:val="VerbatimChar"/>
+        </w:rPr>
+        <w:t xml:space="preserve">~tset.(\mouth, \text, "hello");        // any track setting</w:t>
+      </w:r>
+      <w:r>
+        <w:br/>
+      </w:r>
+      <w:r>
+        <w:rPr>
+          <w:rStyle w:val="VerbatimChar"/>
+        </w:rPr>
+        <w:t xml:space="preserve">~send.(\grains, \A, 0.6);              // a send</w:t>
+      </w:r>
+      <w:r>
+        <w:br/>
+      </w:r>
+      <w:r>
+        <w:rPr>
+          <w:rStyle w:val="VerbatimChar"/>
+        </w:rPr>
+        <w:t xml:space="preserve">~ramp.(\bytebeat, \rate, 20000, 16);   // glide a setting over 16 beats</w:t>
+      </w:r>
+      <w:r>
+        <w:br/>
+      </w:r>
+      <w:r>
+        <w:rPr>
+          <w:rStyle w:val="VerbatimChar"/>
+        </w:rPr>
+        <w:t xml:space="preserve">~wallPick.(5);                         // the scream wall</w:t>
+      </w:r>
+      <w:r>
+        <w:br/>
+      </w:r>
+      <w:r>
+        <w:rPr>
+          <w:rStyle w:val="VerbatimChar"/>
+        </w:rPr>
+        <w:t xml:space="preserve">~takeover.(\bytebeat2, 1);             // takeover from code</w:t>
+      </w:r>
+      <w:r>
+        <w:br/>
+      </w:r>
+      <w:r>
+        <w:rPr>
+          <w:rStyle w:val="VerbatimChar"/>
+        </w:rPr>
+        <w:t xml:space="preserve">~keep.(120);                           // keep the last two minutes</w:t>
+      </w:r>
+      <w:r>
+        <w:br/>
+      </w:r>
+      <w:r>
+        <w:rPr>
+          <w:rStyle w:val="VerbatimChar"/>
+        </w:rPr>
+        <w:t xml:space="preserve">~song = List[[0, 16], [1, 8]]; ~playSong.();   // scenes in order: [scene, bars]</w:t>
+      </w:r>
+    </w:p>
+    <w:p>
+      <w:pPr>
+        <w:pStyle w:val="FirstParagraph"/>
+      </w:pPr>
+      <w:r>
+        <w:rPr>
+          <w:b/>
+          <w:bCs/>
+        </w:rPr>
+        <w:t xml:space="preserve">Make your own</w:t>
+      </w:r>
+      <w:r>
+        <w:t xml:space="preserve">:</w:t>
+      </w:r>
+      <w:r>
+        <w:t xml:space="preserve"> </w:t>
+      </w:r>
+      <w:r>
+        <w:t xml:space="preserve">- a</w:t>
+      </w:r>
+      <w:r>
+        <w:t xml:space="preserve"> </w:t>
+      </w:r>
+      <w:r>
+        <w:rPr>
+          <w:b/>
+          <w:bCs/>
+        </w:rPr>
+        <w:t xml:space="preserve">noise kind</w:t>
+      </w:r>
+      <w:r>
+        <w:t xml:space="preserve">: one line in</w:t>
+      </w:r>
+      <w:r>
+        <w:t xml:space="preserve"> </w:t>
+      </w:r>
+      <w:r>
+        <w:rPr>
+          <w:rStyle w:val="VerbatimChar"/>
+        </w:rPr>
+        <w:t xml:space="preserve">~noiseKinds</w:t>
+      </w:r>
+      <w:r>
+        <w:t xml:space="preserve"> </w:t>
+      </w:r>
+      <w:r>
+        <w:t xml:space="preserve">(</w:t>
+      </w:r>
+      <w:r>
+        <w:rPr>
+          <w:rStyle w:val="VerbatimChar"/>
+        </w:rPr>
+        <w:t xml:space="preserve">lib/voices/noisegen.scd</w:t>
+      </w:r>
+      <w:r>
+        <w:t xml:space="preserve">):</w:t>
+      </w:r>
+      <w:r>
+        <w:t xml:space="preserve"> </w:t>
+      </w:r>
+      <w:r>
+        <w:rPr>
+          <w:rStyle w:val="VerbatimChar"/>
+        </w:rPr>
+        <w:t xml:space="preserve">["name", { |rate, char| signal }]</w:t>
+      </w:r>
+      <w:r>
+        <w:t xml:space="preserve"> </w:t>
+      </w:r>
+      <w:r>
+        <w:t xml:space="preserve">- a</w:t>
+      </w:r>
+      <w:r>
+        <w:t xml:space="preserve"> </w:t>
+      </w:r>
+      <w:r>
+        <w:rPr>
+          <w:b/>
+          <w:bCs/>
+        </w:rPr>
+        <w:t xml:space="preserve">wall</w:t>
+      </w:r>
+      <w:r>
+        <w:t xml:space="preserve">: one line in</w:t>
+      </w:r>
+      <w:r>
+        <w:t xml:space="preserve"> </w:t>
+      </w:r>
+      <w:r>
+        <w:rPr>
+          <w:rStyle w:val="VerbatimChar"/>
+        </w:rPr>
+        <w:t xml:space="preserve">~wallTypes</w:t>
+      </w:r>
+      <w:r>
+        <w:t xml:space="preserve"> </w:t>
+      </w:r>
+      <w:r>
+        <w:t xml:space="preserve">(</w:t>
+      </w:r>
+      <w:r>
+        <w:rPr>
+          <w:rStyle w:val="VerbatimChar"/>
+        </w:rPr>
+        <w:t xml:space="preserve">lib/wall.scd</w:t>
+      </w:r>
+      <w:r>
+        <w:t xml:space="preserve">):</w:t>
+      </w:r>
+      <w:r>
+        <w:t xml:space="preserve"> </w:t>
+      </w:r>
+      <w:r>
+        <w:rPr>
+          <w:rStyle w:val="VerbatimChar"/>
+        </w:rPr>
+        <w:t xml:space="preserve">["name", { |dens, grit, motion| stereo signal }]</w:t>
+      </w:r>
+      <w:r>
+        <w:t xml:space="preserve"> </w:t>
+      </w:r>
+      <w:r>
+        <w:t xml:space="preserve">- an</w:t>
+      </w:r>
+      <w:r>
+        <w:t xml:space="preserve"> </w:t>
+      </w:r>
+      <w:r>
+        <w:rPr>
+          <w:b/>
+          <w:bCs/>
+        </w:rPr>
+        <w:t xml:space="preserve">effect</w:t>
+      </w:r>
+      <w:r>
+        <w:t xml:space="preserve">: a</w:t>
+      </w:r>
+      <w:r>
+        <w:t xml:space="preserve"> </w:t>
+      </w:r>
+      <w:r>
+        <w:rPr>
+          <w:rStyle w:val="VerbatimChar"/>
+        </w:rPr>
+        <w:t xml:space="preserve">~deviceDef</w:t>
+      </w:r>
+      <w:r>
+        <w:t xml:space="preserve"> </w:t>
+      </w:r>
+      <w:r>
+        <w:t xml:space="preserve">and an entry in</w:t>
+      </w:r>
+      <w:r>
+        <w:t xml:space="preserve"> </w:t>
+      </w:r>
+      <w:r>
+        <w:rPr>
+          <w:rStyle w:val="VerbatimChar"/>
+        </w:rPr>
+        <w:t xml:space="preserve">~deviceTypes</w:t>
+      </w:r>
+      <w:r>
+        <w:t xml:space="preserve"> </w:t>
+      </w:r>
+      <w:r>
+        <w:t xml:space="preserve">(</w:t>
+      </w:r>
+      <w:r>
+        <w:rPr>
+          <w:rStyle w:val="VerbatimChar"/>
+        </w:rPr>
+        <w:t xml:space="preserve">lib/devices.scd</w:t>
+      </w:r>
+      <w:r>
+        <w:t xml:space="preserve">), plus a</w:t>
+      </w:r>
+      <w:r>
+        <w:t xml:space="preserve"> </w:t>
+      </w:r>
+      <w:r>
+        <w:t xml:space="preserve">description in</w:t>
+      </w:r>
+      <w:r>
+        <w:t xml:space="preserve"> </w:t>
+      </w:r>
+      <w:r>
+        <w:rPr>
+          <w:rStyle w:val="VerbatimChar"/>
+        </w:rPr>
+        <w:t xml:space="preserve">lib/descriptions.scd</w:t>
+      </w:r>
+      <w:r>
+        <w:t xml:space="preserve"> </w:t>
+      </w:r>
+      <w:r>
+        <w:t xml:space="preserve">- an</w:t>
+      </w:r>
+      <w:r>
+        <w:t xml:space="preserve"> </w:t>
+      </w:r>
+      <w:r>
+        <w:rPr>
+          <w:b/>
+          <w:bCs/>
+        </w:rPr>
+        <w:t xml:space="preserve">instrument</w:t>
+      </w:r>
+      <w:r>
+        <w:t xml:space="preserve">: a file in</w:t>
+      </w:r>
+      <w:r>
+        <w:t xml:space="preserve"> </w:t>
+      </w:r>
+      <w:r>
+        <w:rPr>
+          <w:rStyle w:val="VerbatimChar"/>
+        </w:rPr>
+        <w:t xml:space="preserve">lib/voices/</w:t>
+      </w:r>
+      <w:r>
+        <w:t xml:space="preserve"> </w:t>
+      </w:r>
+      <w:r>
+        <w:t xml:space="preserve">registering</w:t>
+      </w:r>
+      <w:r>
+        <w:t xml:space="preserve"> </w:t>
+      </w:r>
+      <w:r>
+        <w:rPr>
+          <w:rStyle w:val="VerbatimChar"/>
+        </w:rPr>
+        <w:t xml:space="preserve">~voiceTypes[\name]</w:t>
+      </w:r>
+      <w:r>
+        <w:t xml:space="preserve"> </w:t>
+      </w:r>
+      <w:r>
+        <w:t xml:space="preserve">(copy one), added to</w:t>
+      </w:r>
+      <w:r>
+        <w:t xml:space="preserve"> </w:t>
+      </w:r>
+      <w:r>
+        <w:t xml:space="preserve">the list in</w:t>
+      </w:r>
+      <w:r>
+        <w:t xml:space="preserve"> </w:t>
+      </w:r>
+      <w:r>
+        <w:rPr>
+          <w:rStyle w:val="VerbatimChar"/>
+        </w:rPr>
+        <w:t xml:space="preserve">unsound.scd</w:t>
+      </w:r>
+    </w:p>
+    <w:p>
+      <w:r>
+        <w:pict>
+          <v:rect style="width:0;height:1.5pt" o:hralign="center" o:hrstd="t" o:hr="t"/>
+        </w:pict>
+      </w:r>
+    </w:p>
+    <w:p>
+      <w:pPr>
+        <w:pStyle w:val="Heading2"/>
+      </w:pPr>
+      <w:bookmarkStart w:id="88" w:name="_340fc2f84be01f35e34ce906de44e355ea89354"/>
+      <w:r>
+        <w:t xml:space="preserve">17. When something’s wrong</w:t>
+      </w:r>
+      <w:bookmarkEnd w:id="88"/>
     </w:p>
     <w:p>
       <w:pPr>
         <w:pStyle w:val="Compact"/>
         <w:numPr>
           <w:ilvl w:val="0"/>
-          <w:numId w:val="1014"/>
+          <w:numId w:val="1015"/>
         </w:numPr>
       </w:pPr>
       <w:r>
@@ -8756,31 +9066,52 @@
           <w:b/>
           <w:bCs/>
         </w:rPr>
-        <w:t xml:space="preserve">Memory</w:t>
-      </w:r>
-      <w:r>
-        <w:t xml:space="preserve">: the tape keeps 15 minutes in RAM (about 350 MB). Set</w:t>
-      </w:r>
-      <w:r>
-        <w:t xml:space="preserve"> </w:t>
-      </w:r>
-      <w:r>
-        <w:rPr>
-          <w:rStyle w:val="VerbatimChar"/>
-        </w:rPr>
-        <w:t xml:space="preserve">~tapeMinutes = 5</w:t>
-      </w:r>
-      <w:r>
-        <w:t xml:space="preserve"> </w:t>
-      </w:r>
-      <w:r>
-        <w:t xml:space="preserve">before loading</w:t>
-      </w:r>
-      <w:r>
-        <w:t xml:space="preserve"> </w:t>
-      </w:r>
-      <w:r>
-        <w:t xml:space="preserve">to use less.</w:t>
+        <w:t xml:space="preserve">Silence</w:t>
+      </w:r>
+      <w:r>
+        <w:t xml:space="preserve">: is</w:t>
+      </w:r>
+      <w:r>
+        <w:t xml:space="preserve"> </w:t>
+      </w:r>
+      <w:r>
+        <w:rPr>
+          <w:b/>
+          <w:bCs/>
+        </w:rPr>
+        <w:t xml:space="preserve">play</w:t>
+      </w:r>
+      <w:r>
+        <w:t xml:space="preserve"> </w:t>
+      </w:r>
+      <w:r>
+        <w:t xml:space="preserve">on? Is the track muted (</w:t>
+      </w:r>
+      <w:r>
+        <w:rPr>
+          <w:b/>
+          <w:bCs/>
+        </w:rPr>
+        <w:t xml:space="preserve">M</w:t>
+      </w:r>
+      <w:r>
+        <w:t xml:space="preserve">), or something else soloed (</w:t>
+      </w:r>
+      <w:r>
+        <w:rPr>
+          <w:b/>
+          <w:bCs/>
+        </w:rPr>
+        <w:t xml:space="preserve">S</w:t>
+      </w:r>
+      <w:r>
+        <w:t xml:space="preserve">)? Is the</w:t>
+      </w:r>
+      <w:r>
+        <w:t xml:space="preserve"> </w:t>
+      </w:r>
+      <w:r>
+        <w:t xml:space="preserve">wall faded out? Cmd-. and play again.</w:t>
       </w:r>
     </w:p>
     <w:p>
@@ -8788,7 +9119,97 @@
         <w:pStyle w:val="Compact"/>
         <w:numPr>
           <w:ilvl w:val="0"/>
-          <w:numId w:val="1014"/>
+          <w:numId w:val="1015"/>
+        </w:numPr>
+      </w:pPr>
+      <w:r>
+        <w:rPr>
+          <w:b/>
+          <w:bCs/>
+        </w:rPr>
+        <w:t xml:space="preserve">Way too loud</w:t>
+      </w:r>
+      <w:r>
+        <w:t xml:space="preserve">: the master’s limiter catches it; pull the master pad’s volume down, or turn the</w:t>
+      </w:r>
+      <w:r>
+        <w:t xml:space="preserve"> </w:t>
+      </w:r>
+      <w:r>
+        <w:t xml:space="preserve">takeover slider back to empty.</w:t>
+      </w:r>
+    </w:p>
+    <w:p>
+      <w:pPr>
+        <w:pStyle w:val="Compact"/>
+        <w:numPr>
+          <w:ilvl w:val="0"/>
+          <w:numId w:val="1015"/>
+        </w:numPr>
+      </w:pPr>
+      <w:r>
+        <w:rPr>
+          <w:b/>
+          <w:bCs/>
+        </w:rPr>
+        <w:t xml:space="preserve">The server won’t boot</w:t>
+      </w:r>
+      <w:r>
+        <w:t xml:space="preserve">: the input and output sample rates differ (e.g. AirPods mic). unsound</w:t>
+      </w:r>
+      <w:r>
+        <w:t xml:space="preserve"> </w:t>
+      </w:r>
+      <w:r>
+        <w:t xml:space="preserve">starts without inputs to avoid that; if it still fails, pick one output device in Audio MIDI Setup.</w:t>
+      </w:r>
+    </w:p>
+    <w:p>
+      <w:pPr>
+        <w:pStyle w:val="Compact"/>
+        <w:numPr>
+          <w:ilvl w:val="0"/>
+          <w:numId w:val="1015"/>
+        </w:numPr>
+      </w:pPr>
+      <w:r>
+        <w:rPr>
+          <w:b/>
+          <w:bCs/>
+        </w:rPr>
+        <w:t xml:space="preserve">Memory</w:t>
+      </w:r>
+      <w:r>
+        <w:t xml:space="preserve">: the tape keeps 15 minutes in RAM (about 350 MB). Set</w:t>
+      </w:r>
+      <w:r>
+        <w:t xml:space="preserve"> </w:t>
+      </w:r>
+      <w:r>
+        <w:rPr>
+          <w:rStyle w:val="VerbatimChar"/>
+        </w:rPr>
+        <w:t xml:space="preserve">~tapeMinutes = 5</w:t>
+      </w:r>
+      <w:r>
+        <w:t xml:space="preserve"> </w:t>
+      </w:r>
+      <w:r>
+        <w:t xml:space="preserve">before loading</w:t>
+      </w:r>
+      <w:r>
+        <w:t xml:space="preserve"> </w:t>
+      </w:r>
+      <w:r>
+        <w:t xml:space="preserve">to use less.</w:t>
+      </w:r>
+    </w:p>
+    <w:p>
+      <w:pPr>
+        <w:pStyle w:val="Compact"/>
+        <w:numPr>
+          <w:ilvl w:val="0"/>
+          <w:numId w:val="1015"/>
         </w:numPr>
       </w:pPr>
       <w:r>
@@ -9176,6 +9597,9 @@
     <w:abstractNumId w:val="991"/>
   </w:num>
   <w:num w:numId="1014">
+    <w:abstractNumId w:val="991"/>
+  </w:num>
+  <w:num w:numId="1015">
     <w:abstractNumId w:val="991"/>
   </w:num>
 </w:numbering>

</xml_diff>

<commit_message>
Record the whole session to disk, always
Everything played goes to ~/Music/unsound/sessions/session-<date>-<n>.wav (24-bit), starting
on the first play and pausing a few seconds after stop. A new part starts every 30 minutes,
overlapping the last by two seconds. keep still saves the last 15 minutes as a clip and now
marks the moment in session-<date>.txt. The top bar shows ● and the session time (click to
open the folder).

Co-Authored-By: Claude Opus 5.5 (1M context) <noreply@anthropic.com>
</commit_message>
<xml_diff>
--- a/docs/unsound-manual.docx
+++ b/docs/unsound-manual.docx
@@ -592,7 +592,23 @@
               <w:pStyle w:val="Compact"/>
             </w:pPr>
             <w:r>
-              <w:t xml:space="preserve">play, bpm, tape +</w:t>
+              <w:t xml:space="preserve">play, bpm,</w:t>
+            </w:r>
+            <w:r>
+              <w:t xml:space="preserve"> </w:t>
+            </w:r>
+            <w:r>
+              <w:rPr>
+                <w:b/>
+                <w:bCs/>
+              </w:rPr>
+              <w:t xml:space="preserve">●</w:t>
+            </w:r>
+            <w:r>
+              <w:t xml:space="preserve"> </w:t>
+            </w:r>
+            <w:r>
+              <w:t xml:space="preserve">session time, tape +</w:t>
             </w:r>
             <w:r>
               <w:t xml:space="preserve"> </w:t>
@@ -2494,9 +2510,9 @@
       <w:pPr>
         <w:pStyle w:val="Heading3"/>
       </w:pPr>
-      <w:bookmarkStart w:id="30" w:name="_83cb130c0efb3321bcd06dc65fbe6fb196ae1f9"/>
-      <w:r>
-        <w:t xml:space="preserve">Tape and keep</w:t>
+      <w:bookmarkStart w:id="30" w:name="_4a5a9cd8eb422cde65b305ece8f038561ff9b16"/>
+      <w:r>
+        <w:t xml:space="preserve">The session, tape and keep</w:t>
       </w:r>
       <w:bookmarkEnd w:id="30"/>
     </w:p>
@@ -2505,7 +2521,74 @@
         <w:pStyle w:val="FirstParagraph"/>
       </w:pPr>
       <w:r>
-        <w:t xml:space="preserve">unsound is always recording what you hear: the last</w:t>
+        <w:rPr>
+          <w:b/>
+          <w:bCs/>
+        </w:rPr>
+        <w:t xml:space="preserve">Everything you play is recorded to disk</w:t>
+      </w:r>
+      <w:r>
+        <w:t xml:space="preserve">, the whole time the transport runs:</w:t>
+      </w:r>
+      <w:r>
+        <w:t xml:space="preserve"> </w:t>
+      </w:r>
+      <w:r>
+        <w:rPr>
+          <w:rStyle w:val="VerbatimChar"/>
+        </w:rPr>
+        <w:t xml:space="preserve">~/Music/unsound/sessions/session-&lt;date&gt;-1.wav</w:t>
+      </w:r>
+      <w:r>
+        <w:t xml:space="preserve">,</w:t>
+      </w:r>
+      <w:r>
+        <w:t xml:space="preserve"> </w:t>
+      </w:r>
+      <w:r>
+        <w:rPr>
+          <w:rStyle w:val="VerbatimChar"/>
+        </w:rPr>
+        <w:t xml:space="preserve">-2.wav</w:t>
+      </w:r>
+      <w:r>
+        <w:t xml:space="preserve">… (24-bit, about 1 GB an hour). It starts</w:t>
+      </w:r>
+      <w:r>
+        <w:t xml:space="preserve"> </w:t>
+      </w:r>
+      <w:r>
+        <w:t xml:space="preserve">on the first play and pauses a few seconds after you stop (so tails are kept). Every 30 minutes it</w:t>
+      </w:r>
+      <w:r>
+        <w:t xml:space="preserve"> </w:t>
+      </w:r>
+      <w:r>
+        <w:t xml:space="preserve">starts a new part, overlapping the last one by two seconds, so nothing falls in between. The</w:t>
+      </w:r>
+      <w:r>
+        <w:t xml:space="preserve"> </w:t>
+      </w:r>
+      <w:r>
+        <w:rPr>
+          <w:b/>
+          <w:bCs/>
+        </w:rPr>
+        <w:t xml:space="preserve">●</w:t>
+      </w:r>
+      <w:r>
+        <w:t xml:space="preserve"> </w:t>
+      </w:r>
+      <w:r>
+        <w:t xml:space="preserve">in the top bar shows the session’s playing time; click it to open the folder.</w:t>
+      </w:r>
+    </w:p>
+    <w:p>
+      <w:pPr>
+        <w:pStyle w:val="BodyText"/>
+      </w:pPr>
+      <w:r>
+        <w:t xml:space="preserve">On top of that, the last</w:t>
       </w:r>
       <w:r>
         <w:t xml:space="preserve"> </w:t>
@@ -2518,13 +2601,10 @@
         <w:t xml:space="preserve">15 minutes</w:t>
       </w:r>
       <w:r>
-        <w:t xml:space="preserve">, in memory. The top bar shows</w:t>
-      </w:r>
-      <w:r>
-        <w:t xml:space="preserve"> </w:t>
-      </w:r>
-      <w:r>
-        <w:t xml:space="preserve">how much is on the tape.</w:t>
+        <w:t xml:space="preserve"> </w:t>
+      </w:r>
+      <w:r>
+        <w:t xml:space="preserve">are always in memory (the tape), for quick clips:</w:t>
       </w:r>
     </w:p>
     <w:p>
@@ -2559,7 +2639,7 @@
         <w:t xml:space="preserve">return</w:t>
       </w:r>
       <w:r>
-        <w:t xml:space="preserve">): save everything on the tape to</w:t>
+        <w:t xml:space="preserve">): save what’s on the tape to</w:t>
       </w:r>
       <w:r>
         <w:t xml:space="preserve"> </w:t>
@@ -2574,7 +2654,28 @@
         <w:t xml:space="preserve"> </w:t>
       </w:r>
       <w:r>
-        <w:t xml:space="preserve">(24-bit).</w:t>
+        <w:t xml:space="preserve">(24-bit),</w:t>
+      </w:r>
+      <w:r>
+        <w:t xml:space="preserve"> </w:t>
+      </w:r>
+      <w:r>
+        <w:t xml:space="preserve">and drop a marker in the session’s notes (</w:t>
+      </w:r>
+      <w:r>
+        <w:rPr>
+          <w:rStyle w:val="VerbatimChar"/>
+        </w:rPr>
+        <w:t xml:space="preserve">session-&lt;date&gt;.txt</w:t>
+      </w:r>
+      <w:r>
+        <w:t xml:space="preserve">: which part, how far in) so you can</w:t>
+      </w:r>
+      <w:r>
+        <w:t xml:space="preserve"> </w:t>
+      </w:r>
+      <w:r>
+        <w:t xml:space="preserve">find that moment in the long recording.</w:t>
       </w:r>
     </w:p>
     <w:p>
@@ -2601,7 +2702,40 @@
         <w:pStyle w:val="FirstParagraph"/>
       </w:pPr>
       <w:r>
-        <w:t xml:space="preserve">So play for half an hour without thinking about it, then keep it and cut it up later.</w:t>
+        <w:t xml:space="preserve">So play for as long as you like without thinking about recording; nothing is lost.</w:t>
+      </w:r>
+      <w:r>
+        <w:t xml:space="preserve"> </w:t>
+      </w:r>
+      <w:r>
+        <w:t xml:space="preserve">(</w:t>
+      </w:r>
+      <w:r>
+        <w:rPr>
+          <w:rStyle w:val="VerbatimChar"/>
+        </w:rPr>
+        <w:t xml:space="preserve">~sessionOn = false</w:t>
+      </w:r>
+      <w:r>
+        <w:t xml:space="preserve"> </w:t>
+      </w:r>
+      <w:r>
+        <w:t xml:space="preserve">in</w:t>
+      </w:r>
+      <w:r>
+        <w:t xml:space="preserve"> </w:t>
+      </w:r>
+      <w:r>
+        <w:rPr>
+          <w:rStyle w:val="VerbatimChar"/>
+        </w:rPr>
+        <w:t xml:space="preserve">play.scd</w:t>
+      </w:r>
+      <w:r>
+        <w:t xml:space="preserve"> </w:t>
+      </w:r>
+      <w:r>
+        <w:t xml:space="preserve">before loading turns the session recording off.)</w:t>
       </w:r>
       <w:r>
         <w:t xml:space="preserve"> </w:t>

</xml_diff>

<commit_message>
Save your own instruments and chains; foldable browser; CLAUDE.md
- save (by the track's name, or in the studio header) names the focused track and stores it with
  its settings, effect chain and mods (mods on mods, LFO links) under MY INSTRUMENTS; "just the
  effects" saves a chain under MY CHAINS. Right-click: show in Finder / delete.
- browser categories fold (remembered in ~/Music/unsound/unsound-prefs.scd)
- ~applyTrackState split out of ~applyState; ~addMods split out of ~applyMods
- CLAUDE.md: an overview for future sessions (architecture, ids, gotchas, the owner, dev log)
- tools/run.sh + smoke.scd: the headless test used throughout

Co-Authored-By: Claude Opus 5.5 (1M context) <noreply@anthropic.com>
</commit_message>
<xml_diff>
--- a/docs/unsound-manual.docx
+++ b/docs/unsound-manual.docx
@@ -1923,11 +1923,263 @@
       <w:pPr>
         <w:pStyle w:val="Heading2"/>
       </w:pPr>
-      <w:bookmarkStart w:id="20" w:name="_a0b985cf92b61cefb219375faba1d15ff7552cb"/>
+      <w:bookmarkStart w:id="20" w:name="_66df1163603b1c10dcdb7d370d2568b1ba1fff2"/>
+      <w:r>
+        <w:t xml:space="preserve">4½. Your own instruments and chains</w:t>
+      </w:r>
+      <w:bookmarkEnd w:id="20"/>
+    </w:p>
+    <w:p>
+      <w:pPr>
+        <w:pStyle w:val="FirstParagraph"/>
+      </w:pPr>
+      <w:r>
+        <w:t xml:space="preserve">Like Ableton presets: click</w:t>
+      </w:r>
+      <w:r>
+        <w:t xml:space="preserve"> </w:t>
+      </w:r>
+      <w:r>
+        <w:rPr>
+          <w:b/>
+          <w:bCs/>
+        </w:rPr>
+        <w:t xml:space="preserve">save</w:t>
+      </w:r>
+      <w:r>
+        <w:t xml:space="preserve"> </w:t>
+      </w:r>
+      <w:r>
+        <w:t xml:space="preserve">next to the track’s name (top of the focus column, or in the</w:t>
+      </w:r>
+      <w:r>
+        <w:t xml:space="preserve"> </w:t>
+      </w:r>
+      <w:r>
+        <w:t xml:space="preserve">studio window’s header), type a name,</w:t>
+      </w:r>
+      <w:r>
+        <w:t xml:space="preserve"> </w:t>
+      </w:r>
+      <w:r>
+        <w:rPr>
+          <w:b/>
+          <w:bCs/>
+        </w:rPr>
+        <w:t xml:space="preserve">save</w:t>
+      </w:r>
+      <w:r>
+        <w:t xml:space="preserve">.</w:t>
+      </w:r>
+    </w:p>
+    <w:p>
+      <w:pPr>
+        <w:pStyle w:val="Compact"/>
+        <w:numPr>
+          <w:ilvl w:val="0"/>
+          <w:numId w:val="1004"/>
+        </w:numPr>
+      </w:pPr>
+      <w:r>
+        <w:t xml:space="preserve">An</w:t>
+      </w:r>
+      <w:r>
+        <w:t xml:space="preserve"> </w:t>
+      </w:r>
+      <w:r>
+        <w:rPr>
+          <w:b/>
+          <w:bCs/>
+        </w:rPr>
+        <w:t xml:space="preserve">instrument</w:t>
+      </w:r>
+      <w:r>
+        <w:t xml:space="preserve"> </w:t>
+      </w:r>
+      <w:r>
+        <w:t xml:space="preserve">keeps everything: the instrument and all its settings (patterns, drawn waves,</w:t>
+      </w:r>
+      <w:r>
+        <w:t xml:space="preserve"> </w:t>
+      </w:r>
+      <w:r>
+        <w:t xml:space="preserve">loaded files, sends), its whole effect chain, and its mods (mods on mods too; an LFO link is kept</w:t>
+      </w:r>
+      <w:r>
+        <w:t xml:space="preserve"> </w:t>
+      </w:r>
+      <w:r>
+        <w:t xml:space="preserve">if that LFO exists when you load it). It appears in the browser under</w:t>
+      </w:r>
+      <w:r>
+        <w:t xml:space="preserve"> </w:t>
+      </w:r>
+      <w:r>
+        <w:rPr>
+          <w:b/>
+          <w:bCs/>
+        </w:rPr>
+        <w:t xml:space="preserve">MY INSTRUMENTS</w:t>
+      </w:r>
+      <w:r>
+        <w:t xml:space="preserve">:</w:t>
+      </w:r>
+      <w:r>
+        <w:t xml:space="preserve"> </w:t>
+      </w:r>
+      <w:r>
+        <w:t xml:space="preserve">double-click or drag it for a new track, exactly as you saved it.</w:t>
+      </w:r>
+    </w:p>
+    <w:p>
+      <w:pPr>
+        <w:pStyle w:val="Compact"/>
+        <w:numPr>
+          <w:ilvl w:val="0"/>
+          <w:numId w:val="1004"/>
+        </w:numPr>
+      </w:pPr>
+      <w:r>
+        <w:t xml:space="preserve">Tick</w:t>
+      </w:r>
+      <w:r>
+        <w:t xml:space="preserve"> </w:t>
+      </w:r>
+      <w:r>
+        <w:rPr>
+          <w:b/>
+          <w:bCs/>
+        </w:rPr>
+        <w:t xml:space="preserve">just the effects</w:t>
+      </w:r>
+      <w:r>
+        <w:t xml:space="preserve"> </w:t>
+      </w:r>
+      <w:r>
+        <w:t xml:space="preserve">to save the chain instead (from a return or the master, that’s all it</w:t>
+      </w:r>
+      <w:r>
+        <w:t xml:space="preserve"> </w:t>
+      </w:r>
+      <w:r>
+        <w:t xml:space="preserve">can save). It appears under</w:t>
+      </w:r>
+      <w:r>
+        <w:t xml:space="preserve"> </w:t>
+      </w:r>
+      <w:r>
+        <w:rPr>
+          <w:b/>
+          <w:bCs/>
+        </w:rPr>
+        <w:t xml:space="preserve">MY CHAINS</w:t>
+      </w:r>
+      <w:r>
+        <w:t xml:space="preserve">: drop it on any track.</w:t>
+      </w:r>
+    </w:p>
+    <w:p>
+      <w:pPr>
+        <w:pStyle w:val="Compact"/>
+        <w:numPr>
+          <w:ilvl w:val="0"/>
+          <w:numId w:val="1004"/>
+        </w:numPr>
+      </w:pPr>
+      <w:r>
+        <w:rPr>
+          <w:b/>
+          <w:bCs/>
+        </w:rPr>
+        <w:t xml:space="preserve">Right-click</w:t>
+      </w:r>
+      <w:r>
+        <w:t xml:space="preserve"> </w:t>
+      </w:r>
+      <w:r>
+        <w:t xml:space="preserve">one of yours:</w:t>
+      </w:r>
+      <w:r>
+        <w:t xml:space="preserve"> </w:t>
+      </w:r>
+      <w:r>
+        <w:rPr>
+          <w:b/>
+          <w:bCs/>
+        </w:rPr>
+        <w:t xml:space="preserve">show in Finder</w:t>
+      </w:r>
+      <w:r>
+        <w:t xml:space="preserve"> </w:t>
+      </w:r>
+      <w:r>
+        <w:t xml:space="preserve">/</w:t>
+      </w:r>
+      <w:r>
+        <w:t xml:space="preserve"> </w:t>
+      </w:r>
+      <w:r>
+        <w:rPr>
+          <w:b/>
+          <w:bCs/>
+        </w:rPr>
+        <w:t xml:space="preserve">delete</w:t>
+      </w:r>
+      <w:r>
+        <w:t xml:space="preserve">. They’re files in</w:t>
+      </w:r>
+      <w:r>
+        <w:t xml:space="preserve"> </w:t>
+      </w:r>
+      <w:r>
+        <w:rPr>
+          <w:rStyle w:val="VerbatimChar"/>
+        </w:rPr>
+        <w:t xml:space="preserve">~/Music/unsound/instruments/</w:t>
+      </w:r>
+      <w:r>
+        <w:t xml:space="preserve"> </w:t>
+      </w:r>
+      <w:r>
+        <w:t xml:space="preserve">and</w:t>
+      </w:r>
+      <w:r>
+        <w:t xml:space="preserve"> </w:t>
+      </w:r>
+      <w:r>
+        <w:rPr>
+          <w:rStyle w:val="VerbatimChar"/>
+        </w:rPr>
+        <w:t xml:space="preserve">~/Music/unsound/chains/</w:t>
+      </w:r>
+      <w:r>
+        <w:t xml:space="preserve">.</w:t>
+      </w:r>
+    </w:p>
+    <w:p>
+      <w:pPr>
+        <w:pStyle w:val="FirstParagraph"/>
+      </w:pPr>
+      <w:r>
+        <w:rPr>
+          <w:b/>
+          <w:bCs/>
+        </w:rPr>
+        <w:t xml:space="preserve">Browser categories fold</w:t>
+      </w:r>
+      <w:r>
+        <w:t xml:space="preserve">: click a header (▾ / ▸). It remembers which ones you folded.</w:t>
+      </w:r>
+    </w:p>
+    <w:p>
+      <w:pPr>
+        <w:pStyle w:val="Heading2"/>
+      </w:pPr>
+      <w:bookmarkStart w:id="21" w:name="_a0b985cf92b61cefb219375faba1d15ff7552cb"/>
       <w:r>
         <w:t xml:space="preserve">5. Pop-out windows</w:t>
       </w:r>
-      <w:bookmarkEnd w:id="20"/>
+      <w:bookmarkEnd w:id="21"/>
     </w:p>
     <w:p>
       <w:pPr>
@@ -2012,18 +2264,18 @@
           <wp:inline>
             <wp:extent cx="5334000" cy="4676140"/>
             <wp:effectExtent b="0" l="0" r="0" t="0"/>
-            <wp:docPr descr="a device in its own window" title="" id="22" name="Picture"/>
+            <wp:docPr descr="a device in its own window" title="" id="23" name="Picture"/>
             <a:graphic>
               <a:graphicData uri="http://schemas.openxmlformats.org/drawingml/2006/picture">
                 <pic:pic>
                   <pic:nvPicPr>
-                    <pic:cNvPr descr="docs/img/popout.png" id="23" name="Picture"/>
+                    <pic:cNvPr descr="docs/img/popout.png" id="24" name="Picture"/>
                     <pic:cNvPicPr>
                       <a:picLocks noChangeArrowheads="1" noChangeAspect="1"/>
                     </pic:cNvPicPr>
                   </pic:nvPicPr>
                   <pic:blipFill>
-                    <a:blip r:embed="rId21"/>
+                    <a:blip r:embed="rId22"/>
                     <a:stretch>
                       <a:fillRect/>
                     </a:stretch>
@@ -2069,21 +2321,21 @@
       <w:pPr>
         <w:pStyle w:val="Heading2"/>
       </w:pPr>
-      <w:bookmarkStart w:id="24" w:name="_eae3c6da90e9f011fd430eae310c85c18822aca"/>
+      <w:bookmarkStart w:id="25" w:name="_eae3c6da90e9f011fd430eae310c85c18822aca"/>
       <w:r>
         <w:t xml:space="preserve">6. The machine: wall, takeover, tape</w:t>
       </w:r>
-      <w:bookmarkEnd w:id="24"/>
+      <w:bookmarkEnd w:id="25"/>
     </w:p>
     <w:p>
       <w:pPr>
         <w:pStyle w:val="Heading3"/>
       </w:pPr>
-      <w:bookmarkStart w:id="25" w:name="_f7b8c54ea76f0cde2c42cdb2f6fc36eb6566a46"/>
+      <w:bookmarkStart w:id="26" w:name="_f7b8c54ea76f0cde2c42cdb2f6fc36eb6566a46"/>
       <w:r>
         <w:t xml:space="preserve">The wall</w:t>
       </w:r>
-      <w:bookmarkEnd w:id="25"/>
+      <w:bookmarkEnd w:id="26"/>
     </w:p>
     <w:p>
       <w:pPr>
@@ -2094,18 +2346,18 @@
           <wp:inline>
             <wp:extent cx="5334000" cy="3275076"/>
             <wp:effectExtent b="0" l="0" r="0" t="0"/>
-            <wp:docPr descr="the wall" title="" id="27" name="Picture"/>
+            <wp:docPr descr="the wall" title="" id="28" name="Picture"/>
             <a:graphic>
               <a:graphicData uri="http://schemas.openxmlformats.org/drawingml/2006/picture">
                 <pic:pic>
                   <pic:nvPicPr>
-                    <pic:cNvPr descr="docs/img/wall.png" id="28" name="Picture"/>
+                    <pic:cNvPr descr="docs/img/wall.png" id="29" name="Picture"/>
                     <pic:cNvPicPr>
                       <a:picLocks noChangeArrowheads="1" noChangeAspect="1"/>
                     </pic:cNvPicPr>
                   </pic:nvPicPr>
                   <pic:blipFill>
-                    <a:blip r:embed="rId26"/>
+                    <a:blip r:embed="rId27"/>
                     <a:stretch>
                       <a:fillRect/>
                     </a:stretch>
@@ -2153,7 +2405,7 @@
         <w:pStyle w:val="Compact"/>
         <w:numPr>
           <w:ilvl w:val="0"/>
-          <w:numId w:val="1004"/>
+          <w:numId w:val="1005"/>
         </w:numPr>
       </w:pPr>
       <w:r>
@@ -2194,204 +2446,6 @@
       </w:r>
       <w:r>
         <w:t xml:space="preserve">.</w:t>
-      </w:r>
-    </w:p>
-    <w:p>
-      <w:pPr>
-        <w:pStyle w:val="Compact"/>
-        <w:numPr>
-          <w:ilvl w:val="0"/>
-          <w:numId w:val="1004"/>
-        </w:numPr>
-      </w:pPr>
-      <w:r>
-        <w:rPr>
-          <w:b/>
-          <w:bCs/>
-        </w:rPr>
-        <w:t xml:space="preserve">wall in</w:t>
-      </w:r>
-      <w:r>
-        <w:t xml:space="preserve"> </w:t>
-      </w:r>
-      <w:r>
-        <w:t xml:space="preserve">(or the wall pad’s</w:t>
-      </w:r>
-      <w:r>
-        <w:t xml:space="preserve"> </w:t>
-      </w:r>
-      <w:r>
-        <w:rPr>
-          <w:b/>
-          <w:bCs/>
-        </w:rPr>
-        <w:t xml:space="preserve">M</w:t>
-      </w:r>
-      <w:r>
-        <w:t xml:space="preserve">): fade the whole wall in or out.</w:t>
-      </w:r>
-    </w:p>
-    <w:p>
-      <w:pPr>
-        <w:pStyle w:val="Compact"/>
-        <w:numPr>
-          <w:ilvl w:val="0"/>
-          <w:numId w:val="1004"/>
-        </w:numPr>
-      </w:pPr>
-      <w:r>
-        <w:rPr>
-          <w:b/>
-          <w:bCs/>
-        </w:rPr>
-        <w:t xml:space="preserve">dens</w:t>
-      </w:r>
-      <w:r>
-        <w:t xml:space="preserve"> </w:t>
-      </w:r>
-      <w:r>
-        <w:t xml:space="preserve">(density / rate),</w:t>
-      </w:r>
-      <w:r>
-        <w:t xml:space="preserve"> </w:t>
-      </w:r>
-      <w:r>
-        <w:rPr>
-          <w:b/>
-          <w:bCs/>
-        </w:rPr>
-        <w:t xml:space="preserve">grit</w:t>
-      </w:r>
-      <w:r>
-        <w:t xml:space="preserve"> </w:t>
-      </w:r>
-      <w:r>
-        <w:t xml:space="preserve">(how broken),</w:t>
-      </w:r>
-      <w:r>
-        <w:t xml:space="preserve"> </w:t>
-      </w:r>
-      <w:r>
-        <w:rPr>
-          <w:b/>
-          <w:bCs/>
-        </w:rPr>
-        <w:t xml:space="preserve">motion</w:t>
-      </w:r>
-      <w:r>
-        <w:t xml:space="preserve"> </w:t>
-      </w:r>
-      <w:r>
-        <w:t xml:space="preserve">(how much it moves by itself),</w:t>
-      </w:r>
-      <w:r>
-        <w:t xml:space="preserve"> </w:t>
-      </w:r>
-      <w:r>
-        <w:rPr>
-          <w:b/>
-          <w:bCs/>
-        </w:rPr>
-        <w:t xml:space="preserve">level</w:t>
-      </w:r>
-      <w:r>
-        <w:t xml:space="preserve">.</w:t>
-      </w:r>
-    </w:p>
-    <w:p>
-      <w:pPr>
-        <w:pStyle w:val="Compact"/>
-        <w:numPr>
-          <w:ilvl w:val="0"/>
-          <w:numId w:val="1004"/>
-        </w:numPr>
-      </w:pPr>
-      <w:r>
-        <w:t xml:space="preserve">Its chain starts with</w:t>
-      </w:r>
-      <w:r>
-        <w:t xml:space="preserve"> </w:t>
-      </w:r>
-      <w:r>
-        <w:rPr>
-          <w:b/>
-          <w:bCs/>
-        </w:rPr>
-        <w:t xml:space="preserve">band</w:t>
-      </w:r>
-      <w:r>
-        <w:t xml:space="preserve"> </w:t>
-      </w:r>
-      <w:r>
-        <w:t xml:space="preserve">(shape it: lows and highs) and a hard clip. Add anything else.</w:t>
-      </w:r>
-    </w:p>
-    <w:p>
-      <w:pPr>
-        <w:pStyle w:val="FirstParagraph"/>
-      </w:pPr>
-      <w:r>
-        <w:t xml:space="preserve">Solo works on it like any track (it goes quiet when you solo something else, and it has its own</w:t>
-      </w:r>
-      <w:r>
-        <w:t xml:space="preserve"> </w:t>
-      </w:r>
-      <w:r>
-        <w:rPr>
-          <w:b/>
-          <w:bCs/>
-        </w:rPr>
-        <w:t xml:space="preserve">S</w:t>
-      </w:r>
-      <w:r>
-        <w:t xml:space="preserve">). Dice and glide leave it alone: it’s yours to shape.</w:t>
-      </w:r>
-    </w:p>
-    <w:p>
-      <w:pPr>
-        <w:pStyle w:val="Heading3"/>
-      </w:pPr>
-      <w:bookmarkStart w:id="29" w:name="_takeover"/>
-      <w:r>
-        <w:t xml:space="preserve">Takeover</w:t>
-      </w:r>
-      <w:bookmarkEnd w:id="29"/>
-    </w:p>
-    <w:p>
-      <w:pPr>
-        <w:pStyle w:val="FirstParagraph"/>
-      </w:pPr>
-      <w:r>
-        <w:t xml:space="preserve">In the top bar, the orange-outlined</w:t>
-      </w:r>
-      <w:r>
-        <w:t xml:space="preserve"> </w:t>
-      </w:r>
-      <w:r>
-        <w:rPr>
-          <w:b/>
-          <w:bCs/>
-        </w:rPr>
-        <w:t xml:space="preserve">takeover</w:t>
-      </w:r>
-      <w:r>
-        <w:t xml:space="preserve"> </w:t>
-      </w:r>
-      <w:r>
-        <w:t xml:space="preserve">slider and</w:t>
-      </w:r>
-      <w:r>
-        <w:t xml:space="preserve"> </w:t>
-      </w:r>
-      <w:r>
-        <w:rPr>
-          <w:b/>
-          <w:bCs/>
-        </w:rPr>
-        <w:t xml:space="preserve">∞</w:t>
-      </w:r>
-      <w:r>
-        <w:t xml:space="preserve">:</w:t>
       </w:r>
     </w:p>
     <w:p>
@@ -2407,51 +2461,26 @@
           <w:b/>
           <w:bCs/>
         </w:rPr>
-        <w:t xml:space="preserve">takeover</w:t>
-      </w:r>
-      <w:r>
-        <w:t xml:space="preserve"> </w:t>
-      </w:r>
-      <w:r>
-        <w:t xml:space="preserve">(slider): pushes the</w:t>
-      </w:r>
-      <w:r>
-        <w:t xml:space="preserve"> </w:t>
-      </w:r>
-      <w:r>
-        <w:rPr>
-          <w:b/>
-          <w:bCs/>
-        </w:rPr>
-        <w:t xml:space="preserve">focused track</w:t>
-      </w:r>
-      <w:r>
-        <w:t xml:space="preserve"> </w:t>
-      </w:r>
-      <w:r>
-        <w:t xml:space="preserve">toward infinity (driven into digital</w:t>
-      </w:r>
-      <w:r>
-        <w:t xml:space="preserve"> </w:t>
-      </w:r>
-      <w:r>
-        <w:t xml:space="preserve">clipping and up in level) while every other track and the wall</w:t>
-      </w:r>
-      <w:r>
-        <w:t xml:space="preserve"> </w:t>
-      </w:r>
-      <w:r>
-        <w:rPr>
-          <w:b/>
-          <w:bCs/>
-        </w:rPr>
-        <w:t xml:space="preserve">duck</w:t>
-      </w:r>
-      <w:r>
-        <w:t xml:space="preserve"> </w:t>
-      </w:r>
-      <w:r>
-        <w:t xml:space="preserve">under it.</w:t>
+        <w:t xml:space="preserve">wall in</w:t>
+      </w:r>
+      <w:r>
+        <w:t xml:space="preserve"> </w:t>
+      </w:r>
+      <w:r>
+        <w:t xml:space="preserve">(or the wall pad’s</w:t>
+      </w:r>
+      <w:r>
+        <w:t xml:space="preserve"> </w:t>
+      </w:r>
+      <w:r>
+        <w:rPr>
+          <w:b/>
+          <w:bCs/>
+        </w:rPr>
+        <w:t xml:space="preserve">M</w:t>
+      </w:r>
+      <w:r>
+        <w:t xml:space="preserve">): fade the whole wall in or out.</w:t>
       </w:r>
     </w:p>
     <w:p>
@@ -2467,144 +2496,154 @@
           <w:b/>
           <w:bCs/>
         </w:rPr>
+        <w:t xml:space="preserve">dens</w:t>
+      </w:r>
+      <w:r>
+        <w:t xml:space="preserve"> </w:t>
+      </w:r>
+      <w:r>
+        <w:t xml:space="preserve">(density / rate),</w:t>
+      </w:r>
+      <w:r>
+        <w:t xml:space="preserve"> </w:t>
+      </w:r>
+      <w:r>
+        <w:rPr>
+          <w:b/>
+          <w:bCs/>
+        </w:rPr>
+        <w:t xml:space="preserve">grit</w:t>
+      </w:r>
+      <w:r>
+        <w:t xml:space="preserve"> </w:t>
+      </w:r>
+      <w:r>
+        <w:t xml:space="preserve">(how broken),</w:t>
+      </w:r>
+      <w:r>
+        <w:t xml:space="preserve"> </w:t>
+      </w:r>
+      <w:r>
+        <w:rPr>
+          <w:b/>
+          <w:bCs/>
+        </w:rPr>
+        <w:t xml:space="preserve">motion</w:t>
+      </w:r>
+      <w:r>
+        <w:t xml:space="preserve"> </w:t>
+      </w:r>
+      <w:r>
+        <w:t xml:space="preserve">(how much it moves by itself),</w:t>
+      </w:r>
+      <w:r>
+        <w:t xml:space="preserve"> </w:t>
+      </w:r>
+      <w:r>
+        <w:rPr>
+          <w:b/>
+          <w:bCs/>
+        </w:rPr>
+        <w:t xml:space="preserve">level</w:t>
+      </w:r>
+      <w:r>
+        <w:t xml:space="preserve">.</w:t>
+      </w:r>
+    </w:p>
+    <w:p>
+      <w:pPr>
+        <w:pStyle w:val="Compact"/>
+        <w:numPr>
+          <w:ilvl w:val="0"/>
+          <w:numId w:val="1005"/>
+        </w:numPr>
+      </w:pPr>
+      <w:r>
+        <w:t xml:space="preserve">Its chain starts with</w:t>
+      </w:r>
+      <w:r>
+        <w:t xml:space="preserve"> </w:t>
+      </w:r>
+      <w:r>
+        <w:rPr>
+          <w:b/>
+          <w:bCs/>
+        </w:rPr>
+        <w:t xml:space="preserve">band</w:t>
+      </w:r>
+      <w:r>
+        <w:t xml:space="preserve"> </w:t>
+      </w:r>
+      <w:r>
+        <w:t xml:space="preserve">(shape it: lows and highs) and a hard clip. Add anything else.</w:t>
+      </w:r>
+    </w:p>
+    <w:p>
+      <w:pPr>
+        <w:pStyle w:val="FirstParagraph"/>
+      </w:pPr>
+      <w:r>
+        <w:t xml:space="preserve">Solo works on it like any track (it goes quiet when you solo something else, and it has its own</w:t>
+      </w:r>
+      <w:r>
+        <w:t xml:space="preserve"> </w:t>
+      </w:r>
+      <w:r>
+        <w:rPr>
+          <w:b/>
+          <w:bCs/>
+        </w:rPr>
+        <w:t xml:space="preserve">S</w:t>
+      </w:r>
+      <w:r>
+        <w:t xml:space="preserve">). Dice and glide leave it alone: it’s yours to shape.</w:t>
+      </w:r>
+    </w:p>
+    <w:p>
+      <w:pPr>
+        <w:pStyle w:val="Heading3"/>
+      </w:pPr>
+      <w:bookmarkStart w:id="30" w:name="_takeover"/>
+      <w:r>
+        <w:t xml:space="preserve">Takeover</w:t>
+      </w:r>
+      <w:bookmarkEnd w:id="30"/>
+    </w:p>
+    <w:p>
+      <w:pPr>
+        <w:pStyle w:val="FirstParagraph"/>
+      </w:pPr>
+      <w:r>
+        <w:t xml:space="preserve">In the top bar, the orange-outlined</w:t>
+      </w:r>
+      <w:r>
+        <w:t xml:space="preserve"> </w:t>
+      </w:r>
+      <w:r>
+        <w:rPr>
+          <w:b/>
+          <w:bCs/>
+        </w:rPr>
+        <w:t xml:space="preserve">takeover</w:t>
+      </w:r>
+      <w:r>
+        <w:t xml:space="preserve"> </w:t>
+      </w:r>
+      <w:r>
+        <w:t xml:space="preserve">slider and</w:t>
+      </w:r>
+      <w:r>
+        <w:t xml:space="preserve"> </w:t>
+      </w:r>
+      <w:r>
+        <w:rPr>
+          <w:b/>
+          <w:bCs/>
+        </w:rPr>
         <w:t xml:space="preserve">∞</w:t>
       </w:r>
       <w:r>
-        <w:t xml:space="preserve"> </w:t>
-      </w:r>
-      <w:r>
-        <w:t xml:space="preserve">(hold) or hold the</w:t>
-      </w:r>
-      <w:r>
-        <w:t xml:space="preserve"> </w:t>
-      </w:r>
-      <w:r>
-        <w:rPr>
-          <w:b/>
-          <w:bCs/>
-        </w:rPr>
-        <w:t xml:space="preserve">’</w:t>
-      </w:r>
-      <w:r>
-        <w:t xml:space="preserve"> </w:t>
-      </w:r>
-      <w:r>
-        <w:t xml:space="preserve">key: all the way, for as long as you hold it.</w:t>
-      </w:r>
-    </w:p>
-    <w:p>
-      <w:pPr>
-        <w:pStyle w:val="FirstParagraph"/>
-      </w:pPr>
-      <w:r>
-        <w:t xml:space="preserve">Takeover follows focus: click another pad and it moves there. Returns aren’t ducked, so the</w:t>
-      </w:r>
-      <w:r>
-        <w:t xml:space="preserve"> </w:t>
-      </w:r>
-      <w:r>
-        <w:t xml:space="preserve">taken-over track’s echoes still come through.</w:t>
-      </w:r>
-    </w:p>
-    <w:p>
-      <w:pPr>
-        <w:pStyle w:val="Heading3"/>
-      </w:pPr>
-      <w:bookmarkStart w:id="30" w:name="_4a5a9cd8eb422cde65b305ece8f038561ff9b16"/>
-      <w:r>
-        <w:t xml:space="preserve">The session, tape and keep</w:t>
-      </w:r>
-      <w:bookmarkEnd w:id="30"/>
-    </w:p>
-    <w:p>
-      <w:pPr>
-        <w:pStyle w:val="FirstParagraph"/>
-      </w:pPr>
-      <w:r>
-        <w:rPr>
-          <w:b/>
-          <w:bCs/>
-        </w:rPr>
-        <w:t xml:space="preserve">Everything you play is recorded to disk</w:t>
-      </w:r>
-      <w:r>
-        <w:t xml:space="preserve">, the whole time the transport runs:</w:t>
-      </w:r>
-      <w:r>
-        <w:t xml:space="preserve"> </w:t>
-      </w:r>
-      <w:r>
-        <w:rPr>
-          <w:rStyle w:val="VerbatimChar"/>
-        </w:rPr>
-        <w:t xml:space="preserve">~/Music/unsound/sessions/session-&lt;date&gt;-1.wav</w:t>
-      </w:r>
-      <w:r>
-        <w:t xml:space="preserve">,</w:t>
-      </w:r>
-      <w:r>
-        <w:t xml:space="preserve"> </w:t>
-      </w:r>
-      <w:r>
-        <w:rPr>
-          <w:rStyle w:val="VerbatimChar"/>
-        </w:rPr>
-        <w:t xml:space="preserve">-2.wav</w:t>
-      </w:r>
-      <w:r>
-        <w:t xml:space="preserve">… (24-bit, about 1 GB an hour). It starts</w:t>
-      </w:r>
-      <w:r>
-        <w:t xml:space="preserve"> </w:t>
-      </w:r>
-      <w:r>
-        <w:t xml:space="preserve">on the first play and pauses a few seconds after you stop (so tails are kept). Every 30 minutes it</w:t>
-      </w:r>
-      <w:r>
-        <w:t xml:space="preserve"> </w:t>
-      </w:r>
-      <w:r>
-        <w:t xml:space="preserve">starts a new part, overlapping the last one by two seconds, so nothing falls in between. The</w:t>
-      </w:r>
-      <w:r>
-        <w:t xml:space="preserve"> </w:t>
-      </w:r>
-      <w:r>
-        <w:rPr>
-          <w:b/>
-          <w:bCs/>
-        </w:rPr>
-        <w:t xml:space="preserve">●</w:t>
-      </w:r>
-      <w:r>
-        <w:t xml:space="preserve"> </w:t>
-      </w:r>
-      <w:r>
-        <w:t xml:space="preserve">in the top bar shows the session’s playing time; click it to open the folder.</w:t>
-      </w:r>
-    </w:p>
-    <w:p>
-      <w:pPr>
-        <w:pStyle w:val="BodyText"/>
-      </w:pPr>
-      <w:r>
-        <w:t xml:space="preserve">On top of that, the last</w:t>
-      </w:r>
-      <w:r>
-        <w:t xml:space="preserve"> </w:t>
-      </w:r>
-      <w:r>
-        <w:rPr>
-          <w:b/>
-          <w:bCs/>
-        </w:rPr>
-        <w:t xml:space="preserve">15 minutes</w:t>
-      </w:r>
-      <w:r>
-        <w:t xml:space="preserve"> </w:t>
-      </w:r>
-      <w:r>
-        <w:t xml:space="preserve">are always in memory (the tape), for quick clips:</w:t>
+        <w:t xml:space="preserve">:</w:t>
       </w:r>
     </w:p>
     <w:p>
@@ -2620,62 +2659,51 @@
           <w:b/>
           <w:bCs/>
         </w:rPr>
-        <w:t xml:space="preserve">keep</w:t>
-      </w:r>
-      <w:r>
-        <w:t xml:space="preserve"> </w:t>
-      </w:r>
-      <w:r>
-        <w:t xml:space="preserve">(or</w:t>
-      </w:r>
-      <w:r>
-        <w:t xml:space="preserve"> </w:t>
-      </w:r>
-      <w:r>
-        <w:rPr>
-          <w:b/>
-          <w:bCs/>
-        </w:rPr>
-        <w:t xml:space="preserve">return</w:t>
-      </w:r>
-      <w:r>
-        <w:t xml:space="preserve">): save what’s on the tape to</w:t>
-      </w:r>
-      <w:r>
-        <w:t xml:space="preserve"> </w:t>
-      </w:r>
-      <w:r>
-        <w:rPr>
-          <w:rStyle w:val="VerbatimChar"/>
-        </w:rPr>
-        <w:t xml:space="preserve">~/Music/unsound/keep-&lt;date&gt;.wav</w:t>
-      </w:r>
-      <w:r>
-        <w:t xml:space="preserve"> </w:t>
-      </w:r>
-      <w:r>
-        <w:t xml:space="preserve">(24-bit),</w:t>
-      </w:r>
-      <w:r>
-        <w:t xml:space="preserve"> </w:t>
-      </w:r>
-      <w:r>
-        <w:t xml:space="preserve">and drop a marker in the session’s notes (</w:t>
-      </w:r>
-      <w:r>
-        <w:rPr>
-          <w:rStyle w:val="VerbatimChar"/>
-        </w:rPr>
-        <w:t xml:space="preserve">session-&lt;date&gt;.txt</w:t>
-      </w:r>
-      <w:r>
-        <w:t xml:space="preserve">: which part, how far in) so you can</w:t>
-      </w:r>
-      <w:r>
-        <w:t xml:space="preserve"> </w:t>
-      </w:r>
-      <w:r>
-        <w:t xml:space="preserve">find that moment in the long recording.</w:t>
+        <w:t xml:space="preserve">takeover</w:t>
+      </w:r>
+      <w:r>
+        <w:t xml:space="preserve"> </w:t>
+      </w:r>
+      <w:r>
+        <w:t xml:space="preserve">(slider): pushes the</w:t>
+      </w:r>
+      <w:r>
+        <w:t xml:space="preserve"> </w:t>
+      </w:r>
+      <w:r>
+        <w:rPr>
+          <w:b/>
+          <w:bCs/>
+        </w:rPr>
+        <w:t xml:space="preserve">focused track</w:t>
+      </w:r>
+      <w:r>
+        <w:t xml:space="preserve"> </w:t>
+      </w:r>
+      <w:r>
+        <w:t xml:space="preserve">toward infinity (driven into digital</w:t>
+      </w:r>
+      <w:r>
+        <w:t xml:space="preserve"> </w:t>
+      </w:r>
+      <w:r>
+        <w:t xml:space="preserve">clipping and up in level) while every other track and the wall</w:t>
+      </w:r>
+      <w:r>
+        <w:t xml:space="preserve"> </w:t>
+      </w:r>
+      <w:r>
+        <w:rPr>
+          <w:b/>
+          <w:bCs/>
+        </w:rPr>
+        <w:t xml:space="preserve">duck</w:t>
+      </w:r>
+      <w:r>
+        <w:t xml:space="preserve"> </w:t>
+      </w:r>
+      <w:r>
+        <w:t xml:space="preserve">under it.</w:t>
       </w:r>
     </w:p>
     <w:p>
@@ -2691,6 +2719,230 @@
           <w:b/>
           <w:bCs/>
         </w:rPr>
+        <w:t xml:space="preserve">∞</w:t>
+      </w:r>
+      <w:r>
+        <w:t xml:space="preserve"> </w:t>
+      </w:r>
+      <w:r>
+        <w:t xml:space="preserve">(hold) or hold the</w:t>
+      </w:r>
+      <w:r>
+        <w:t xml:space="preserve"> </w:t>
+      </w:r>
+      <w:r>
+        <w:rPr>
+          <w:b/>
+          <w:bCs/>
+        </w:rPr>
+        <w:t xml:space="preserve">’</w:t>
+      </w:r>
+      <w:r>
+        <w:t xml:space="preserve"> </w:t>
+      </w:r>
+      <w:r>
+        <w:t xml:space="preserve">key: all the way, for as long as you hold it.</w:t>
+      </w:r>
+    </w:p>
+    <w:p>
+      <w:pPr>
+        <w:pStyle w:val="FirstParagraph"/>
+      </w:pPr>
+      <w:r>
+        <w:t xml:space="preserve">Takeover follows focus: click another pad and it moves there. Returns aren’t ducked, so the</w:t>
+      </w:r>
+      <w:r>
+        <w:t xml:space="preserve"> </w:t>
+      </w:r>
+      <w:r>
+        <w:t xml:space="preserve">taken-over track’s echoes still come through.</w:t>
+      </w:r>
+    </w:p>
+    <w:p>
+      <w:pPr>
+        <w:pStyle w:val="Heading3"/>
+      </w:pPr>
+      <w:bookmarkStart w:id="31" w:name="_4a5a9cd8eb422cde65b305ece8f038561ff9b16"/>
+      <w:r>
+        <w:t xml:space="preserve">The session, tape and keep</w:t>
+      </w:r>
+      <w:bookmarkEnd w:id="31"/>
+    </w:p>
+    <w:p>
+      <w:pPr>
+        <w:pStyle w:val="FirstParagraph"/>
+      </w:pPr>
+      <w:r>
+        <w:rPr>
+          <w:b/>
+          <w:bCs/>
+        </w:rPr>
+        <w:t xml:space="preserve">Everything you play is recorded to disk</w:t>
+      </w:r>
+      <w:r>
+        <w:t xml:space="preserve">, the whole time the transport runs:</w:t>
+      </w:r>
+      <w:r>
+        <w:t xml:space="preserve"> </w:t>
+      </w:r>
+      <w:r>
+        <w:rPr>
+          <w:rStyle w:val="VerbatimChar"/>
+        </w:rPr>
+        <w:t xml:space="preserve">~/Music/unsound/sessions/session-&lt;date&gt;-1.wav</w:t>
+      </w:r>
+      <w:r>
+        <w:t xml:space="preserve">,</w:t>
+      </w:r>
+      <w:r>
+        <w:t xml:space="preserve"> </w:t>
+      </w:r>
+      <w:r>
+        <w:rPr>
+          <w:rStyle w:val="VerbatimChar"/>
+        </w:rPr>
+        <w:t xml:space="preserve">-2.wav</w:t>
+      </w:r>
+      <w:r>
+        <w:t xml:space="preserve">… (24-bit, about 1 GB an hour). It starts</w:t>
+      </w:r>
+      <w:r>
+        <w:t xml:space="preserve"> </w:t>
+      </w:r>
+      <w:r>
+        <w:t xml:space="preserve">on the first play and pauses a few seconds after you stop (so tails are kept). Every 30 minutes it</w:t>
+      </w:r>
+      <w:r>
+        <w:t xml:space="preserve"> </w:t>
+      </w:r>
+      <w:r>
+        <w:t xml:space="preserve">starts a new part, overlapping the last one by two seconds, so nothing falls in between. The</w:t>
+      </w:r>
+      <w:r>
+        <w:t xml:space="preserve"> </w:t>
+      </w:r>
+      <w:r>
+        <w:rPr>
+          <w:b/>
+          <w:bCs/>
+        </w:rPr>
+        <w:t xml:space="preserve">●</w:t>
+      </w:r>
+      <w:r>
+        <w:t xml:space="preserve"> </w:t>
+      </w:r>
+      <w:r>
+        <w:t xml:space="preserve">in the top bar shows the session’s playing time; click it to open the folder.</w:t>
+      </w:r>
+    </w:p>
+    <w:p>
+      <w:pPr>
+        <w:pStyle w:val="BodyText"/>
+      </w:pPr>
+      <w:r>
+        <w:t xml:space="preserve">On top of that, the last</w:t>
+      </w:r>
+      <w:r>
+        <w:t xml:space="preserve"> </w:t>
+      </w:r>
+      <w:r>
+        <w:rPr>
+          <w:b/>
+          <w:bCs/>
+        </w:rPr>
+        <w:t xml:space="preserve">15 minutes</w:t>
+      </w:r>
+      <w:r>
+        <w:t xml:space="preserve"> </w:t>
+      </w:r>
+      <w:r>
+        <w:t xml:space="preserve">are always in memory (the tape), for quick clips:</w:t>
+      </w:r>
+    </w:p>
+    <w:p>
+      <w:pPr>
+        <w:pStyle w:val="Compact"/>
+        <w:numPr>
+          <w:ilvl w:val="0"/>
+          <w:numId w:val="1007"/>
+        </w:numPr>
+      </w:pPr>
+      <w:r>
+        <w:rPr>
+          <w:b/>
+          <w:bCs/>
+        </w:rPr>
+        <w:t xml:space="preserve">keep</w:t>
+      </w:r>
+      <w:r>
+        <w:t xml:space="preserve"> </w:t>
+      </w:r>
+      <w:r>
+        <w:t xml:space="preserve">(or</w:t>
+      </w:r>
+      <w:r>
+        <w:t xml:space="preserve"> </w:t>
+      </w:r>
+      <w:r>
+        <w:rPr>
+          <w:b/>
+          <w:bCs/>
+        </w:rPr>
+        <w:t xml:space="preserve">return</w:t>
+      </w:r>
+      <w:r>
+        <w:t xml:space="preserve">): save what’s on the tape to</w:t>
+      </w:r>
+      <w:r>
+        <w:t xml:space="preserve"> </w:t>
+      </w:r>
+      <w:r>
+        <w:rPr>
+          <w:rStyle w:val="VerbatimChar"/>
+        </w:rPr>
+        <w:t xml:space="preserve">~/Music/unsound/keep-&lt;date&gt;.wav</w:t>
+      </w:r>
+      <w:r>
+        <w:t xml:space="preserve"> </w:t>
+      </w:r>
+      <w:r>
+        <w:t xml:space="preserve">(24-bit),</w:t>
+      </w:r>
+      <w:r>
+        <w:t xml:space="preserve"> </w:t>
+      </w:r>
+      <w:r>
+        <w:t xml:space="preserve">and drop a marker in the session’s notes (</w:t>
+      </w:r>
+      <w:r>
+        <w:rPr>
+          <w:rStyle w:val="VerbatimChar"/>
+        </w:rPr>
+        <w:t xml:space="preserve">session-&lt;date&gt;.txt</w:t>
+      </w:r>
+      <w:r>
+        <w:t xml:space="preserve">: which part, how far in) so you can</w:t>
+      </w:r>
+      <w:r>
+        <w:t xml:space="preserve"> </w:t>
+      </w:r>
+      <w:r>
+        <w:t xml:space="preserve">find that moment in the long recording.</w:t>
+      </w:r>
+    </w:p>
+    <w:p>
+      <w:pPr>
+        <w:pStyle w:val="Compact"/>
+        <w:numPr>
+          <w:ilvl w:val="0"/>
+          <w:numId w:val="1007"/>
+        </w:numPr>
+      </w:pPr>
+      <w:r>
+        <w:rPr>
+          <w:b/>
+          <w:bCs/>
+        </w:rPr>
         <w:t xml:space="preserve">shift-return</w:t>
       </w:r>
       <w:r>
@@ -2771,11 +3023,11 @@
       <w:pPr>
         <w:pStyle w:val="Heading2"/>
       </w:pPr>
-      <w:bookmarkStart w:id="31" w:name="_925d228922843c08f1254ae02d11cdfde5cff09"/>
+      <w:bookmarkStart w:id="32" w:name="_925d228922843c08f1254ae02d11cdfde5cff09"/>
       <w:r>
         <w:t xml:space="preserve">7. Modulation: everything moves everything</w:t>
       </w:r>
-      <w:bookmarkEnd w:id="31"/>
+      <w:bookmarkEnd w:id="32"/>
     </w:p>
     <w:p>
       <w:pPr>
@@ -2853,18 +3105,18 @@
           <wp:inline>
             <wp:extent cx="5334000" cy="3275076"/>
             <wp:effectExtent b="0" l="0" r="0" t="0"/>
-            <wp:docPr descr="mods as a tree" title="" id="33" name="Picture"/>
+            <wp:docPr descr="mods as a tree" title="" id="34" name="Picture"/>
             <a:graphic>
               <a:graphicData uri="http://schemas.openxmlformats.org/drawingml/2006/picture">
                 <pic:pic>
                   <pic:nvPicPr>
-                    <pic:cNvPr descr="docs/img/box-bytebeat.png" id="34" name="Picture"/>
+                    <pic:cNvPr descr="docs/img/box-bytebeat.png" id="35" name="Picture"/>
                     <pic:cNvPicPr>
                       <a:picLocks noChangeArrowheads="1" noChangeAspect="1"/>
                     </pic:cNvPicPr>
                   </pic:nvPicPr>
                   <pic:blipFill>
-                    <a:blip r:embed="rId32"/>
+                    <a:blip r:embed="rId33"/>
                     <a:stretch>
                       <a:fillRect/>
                     </a:stretch>
@@ -2912,7 +3164,7 @@
         <w:pStyle w:val="Compact"/>
         <w:numPr>
           <w:ilvl w:val="0"/>
-          <w:numId w:val="1007"/>
+          <w:numId w:val="1008"/>
         </w:numPr>
       </w:pPr>
       <w:r>
@@ -2924,227 +3176,6 @@
       </w:r>
       <w:r>
         <w:t xml:space="preserve">: sine, tri, square, saw, random, drunk, chaos, burst</w:t>
-      </w:r>
-    </w:p>
-    <w:p>
-      <w:pPr>
-        <w:pStyle w:val="Compact"/>
-        <w:numPr>
-          <w:ilvl w:val="0"/>
-          <w:numId w:val="1007"/>
-        </w:numPr>
-      </w:pPr>
-      <w:r>
-        <w:rPr>
-          <w:b/>
-          <w:bCs/>
-        </w:rPr>
-        <w:t xml:space="preserve">rate</w:t>
-      </w:r>
-      <w:r>
-        <w:t xml:space="preserve"> </w:t>
-      </w:r>
-      <w:r>
-        <w:t xml:space="preserve">and</w:t>
-      </w:r>
-      <w:r>
-        <w:t xml:space="preserve"> </w:t>
-      </w:r>
-      <w:r>
-        <w:rPr>
-          <w:b/>
-          <w:bCs/>
-        </w:rPr>
-        <w:t xml:space="preserve">depth</w:t>
-      </w:r>
-      <w:r>
-        <w:t xml:space="preserve"> </w:t>
-      </w:r>
-      <w:r>
-        <w:t xml:space="preserve">(negative depth inverts it)</w:t>
-      </w:r>
-    </w:p>
-    <w:p>
-      <w:pPr>
-        <w:pStyle w:val="Compact"/>
-        <w:numPr>
-          <w:ilvl w:val="0"/>
-          <w:numId w:val="1007"/>
-        </w:numPr>
-      </w:pPr>
-      <w:r>
-        <w:rPr>
-          <w:b/>
-          <w:bCs/>
-        </w:rPr>
-        <w:t xml:space="preserve">source</w:t>
-      </w:r>
-      <w:r>
-        <w:t xml:space="preserve">:</w:t>
-      </w:r>
-      <w:r>
-        <w:t xml:space="preserve"> </w:t>
-      </w:r>
-      <w:r>
-        <w:rPr>
-          <w:i/>
-          <w:iCs/>
-        </w:rPr>
-        <w:t xml:space="preserve">own shape</w:t>
-      </w:r>
-      <w:r>
-        <w:t xml:space="preserve">, or</w:t>
-      </w:r>
-      <w:r>
-        <w:t xml:space="preserve"> </w:t>
-      </w:r>
-      <w:r>
-        <w:rPr>
-          <w:i/>
-          <w:iCs/>
-        </w:rPr>
-        <w:t xml:space="preserve">follows</w:t>
-      </w:r>
-      <w:r>
-        <w:rPr>
-          <w:i/>
-          <w:iCs/>
-        </w:rPr>
-        <w:t xml:space="preserve"> </w:t>
-      </w:r>
-      <w:r>
-        <w:t xml:space="preserve"> </w:t>
-      </w:r>
-      <w:r>
-        <w:t xml:space="preserve">(moves with that track’s loudness: negative depth</w:t>
-      </w:r>
-      <w:r>
-        <w:t xml:space="preserve"> </w:t>
-      </w:r>
-      <w:r>
-        <w:t xml:space="preserve">= ducking), or</w:t>
-      </w:r>
-      <w:r>
-        <w:t xml:space="preserve"> </w:t>
-      </w:r>
-      <w:r>
-        <w:rPr>
-          <w:i/>
-          <w:iCs/>
-        </w:rPr>
-        <w:t xml:space="preserve">driven by</w:t>
-      </w:r>
-      <w:r>
-        <w:rPr>
-          <w:i/>
-          <w:iCs/>
-        </w:rPr>
-        <w:t xml:space="preserve"> </w:t>
-      </w:r>
-    </w:p>
-    <w:p>
-      <w:pPr>
-        <w:pStyle w:val="Compact"/>
-        <w:numPr>
-          <w:ilvl w:val="0"/>
-          <w:numId w:val="1007"/>
-        </w:numPr>
-      </w:pPr>
-      <w:r>
-        <w:rPr>
-          <w:b/>
-          <w:bCs/>
-        </w:rPr>
-        <w:t xml:space="preserve">x</w:t>
-      </w:r>
-      <w:r>
-        <w:t xml:space="preserve"> </w:t>
-      </w:r>
-      <w:r>
-        <w:t xml:space="preserve">removes it (and any mods on it)</w:t>
-      </w:r>
-    </w:p>
-    <w:p>
-      <w:pPr>
-        <w:pStyle w:val="FirstParagraph"/>
-      </w:pPr>
-      <w:r>
-        <w:rPr>
-          <w:b/>
-          <w:bCs/>
-        </w:rPr>
-        <w:t xml:space="preserve">Mods into mods</w:t>
-      </w:r>
-      <w:r>
-        <w:t xml:space="preserve">: a mod’s</w:t>
-      </w:r>
-      <w:r>
-        <w:t xml:space="preserve"> </w:t>
-      </w:r>
-      <w:r>
-        <w:rPr>
-          <w:b/>
-          <w:bCs/>
-        </w:rPr>
-        <w:t xml:space="preserve">rate</w:t>
-      </w:r>
-      <w:r>
-        <w:t xml:space="preserve"> </w:t>
-      </w:r>
-      <w:r>
-        <w:t xml:space="preserve">and</w:t>
-      </w:r>
-      <w:r>
-        <w:t xml:space="preserve"> </w:t>
-      </w:r>
-      <w:r>
-        <w:rPr>
-          <w:b/>
-          <w:bCs/>
-        </w:rPr>
-        <w:t xml:space="preserve">depth</w:t>
-      </w:r>
-      <w:r>
-        <w:t xml:space="preserve"> </w:t>
-      </w:r>
-      <w:r>
-        <w:t xml:space="preserve">are knobs too. Right-click one, and the mod that</w:t>
-      </w:r>
-      <w:r>
-        <w:t xml:space="preserve"> </w:t>
-      </w:r>
-      <w:r>
-        <w:t xml:space="preserve">moves</w:t>
-      </w:r>
-      <w:r>
-        <w:t xml:space="preserve"> </w:t>
-      </w:r>
-      <w:r>
-        <w:rPr>
-          <w:i/>
-          <w:iCs/>
-        </w:rPr>
-        <w:t xml:space="preserve">it</w:t>
-      </w:r>
-      <w:r>
-        <w:t xml:space="preserve"> </w:t>
-      </w:r>
-      <w:r>
-        <w:t xml:space="preserve">appears indented underneath (</w:t>
-      </w:r>
-      <w:r>
-        <w:t xml:space="preserve">“↳ rate of …”</w:t>
-      </w:r>
-      <w:r>
-        <w:t xml:space="preserve">). Keep going as deep as you like.</w:t>
-      </w:r>
-    </w:p>
-    <w:p>
-      <w:pPr>
-        <w:pStyle w:val="BodyText"/>
-      </w:pPr>
-      <w:r>
-        <w:t xml:space="preserve">Also:</w:t>
       </w:r>
     </w:p>
     <w:p>
@@ -3160,48 +3191,29 @@
           <w:b/>
           <w:bCs/>
         </w:rPr>
-        <w:t xml:space="preserve">infect</w:t>
-      </w:r>
-      <w:r>
-        <w:t xml:space="preserve"> </w:t>
-      </w:r>
-      <w:r>
-        <w:t xml:space="preserve">(button, or</w:t>
-      </w:r>
-      <w:r>
-        <w:t xml:space="preserve"> </w:t>
-      </w:r>
-      <w:r>
-        <w:rPr>
-          <w:b/>
-          <w:bCs/>
-        </w:rPr>
-        <w:t xml:space="preserve">I</w:t>
-      </w:r>
-      <w:r>
-        <w:t xml:space="preserve">): scatters random mods (some following other tracks, some on other</w:t>
-      </w:r>
-      <w:r>
-        <w:t xml:space="preserve"> </w:t>
-      </w:r>
-      <w:r>
-        <w:t xml:space="preserve">mods). The mods panel’s own</w:t>
-      </w:r>
-      <w:r>
-        <w:t xml:space="preserve"> </w:t>
-      </w:r>
-      <w:r>
-        <w:rPr>
-          <w:b/>
-          <w:bCs/>
-        </w:rPr>
-        <w:t xml:space="preserve">infect</w:t>
-      </w:r>
-      <w:r>
-        <w:t xml:space="preserve"> </w:t>
-      </w:r>
-      <w:r>
-        <w:t xml:space="preserve">only touches the focused track.</w:t>
+        <w:t xml:space="preserve">rate</w:t>
+      </w:r>
+      <w:r>
+        <w:t xml:space="preserve"> </w:t>
+      </w:r>
+      <w:r>
+        <w:t xml:space="preserve">and</w:t>
+      </w:r>
+      <w:r>
+        <w:t xml:space="preserve"> </w:t>
+      </w:r>
+      <w:r>
+        <w:rPr>
+          <w:b/>
+          <w:bCs/>
+        </w:rPr>
+        <w:t xml:space="preserve">depth</w:t>
+      </w:r>
+      <w:r>
+        <w:t xml:space="preserve"> </w:t>
+      </w:r>
+      <w:r>
+        <w:t xml:space="preserve">(negative depth inverts it)</w:t>
       </w:r>
     </w:p>
     <w:p>
@@ -3217,42 +3229,69 @@
           <w:b/>
           <w:bCs/>
         </w:rPr>
-        <w:t xml:space="preserve">cure</w:t>
-      </w:r>
-      <w:r>
-        <w:t xml:space="preserve"> </w:t>
-      </w:r>
-      <w:r>
-        <w:t xml:space="preserve">(or</w:t>
-      </w:r>
-      <w:r>
-        <w:t xml:space="preserve"> </w:t>
-      </w:r>
-      <w:r>
-        <w:rPr>
-          <w:b/>
-          <w:bCs/>
-        </w:rPr>
-        <w:t xml:space="preserve">\</w:t>
-      </w:r>
-      <w:r>
-        <w:t xml:space="preserve">): removes every mod. The mods panel’s</w:t>
-      </w:r>
-      <w:r>
-        <w:t xml:space="preserve"> </w:t>
-      </w:r>
-      <w:r>
-        <w:rPr>
-          <w:b/>
-          <w:bCs/>
-        </w:rPr>
-        <w:t xml:space="preserve">cure</w:t>
-      </w:r>
-      <w:r>
-        <w:t xml:space="preserve"> </w:t>
-      </w:r>
-      <w:r>
-        <w:t xml:space="preserve">only touches this track.</w:t>
+        <w:t xml:space="preserve">source</w:t>
+      </w:r>
+      <w:r>
+        <w:t xml:space="preserve">:</w:t>
+      </w:r>
+      <w:r>
+        <w:t xml:space="preserve"> </w:t>
+      </w:r>
+      <w:r>
+        <w:rPr>
+          <w:i/>
+          <w:iCs/>
+        </w:rPr>
+        <w:t xml:space="preserve">own shape</w:t>
+      </w:r>
+      <w:r>
+        <w:t xml:space="preserve">, or</w:t>
+      </w:r>
+      <w:r>
+        <w:t xml:space="preserve"> </w:t>
+      </w:r>
+      <w:r>
+        <w:rPr>
+          <w:i/>
+          <w:iCs/>
+        </w:rPr>
+        <w:t xml:space="preserve">follows</w:t>
+      </w:r>
+      <w:r>
+        <w:rPr>
+          <w:i/>
+          <w:iCs/>
+        </w:rPr>
+        <w:t xml:space="preserve"> </w:t>
+      </w:r>
+      <w:r>
+        <w:t xml:space="preserve"> </w:t>
+      </w:r>
+      <w:r>
+        <w:t xml:space="preserve">(moves with that track’s loudness: negative depth</w:t>
+      </w:r>
+      <w:r>
+        <w:t xml:space="preserve"> </w:t>
+      </w:r>
+      <w:r>
+        <w:t xml:space="preserve">= ducking), or</w:t>
+      </w:r>
+      <w:r>
+        <w:t xml:space="preserve"> </w:t>
+      </w:r>
+      <w:r>
+        <w:rPr>
+          <w:i/>
+          <w:iCs/>
+        </w:rPr>
+        <w:t xml:space="preserve">driven by</w:t>
+      </w:r>
+      <w:r>
+        <w:rPr>
+          <w:i/>
+          <w:iCs/>
+        </w:rPr>
+        <w:t xml:space="preserve"> </w:t>
       </w:r>
     </w:p>
     <w:p>
@@ -3268,13 +3307,96 @@
           <w:b/>
           <w:bCs/>
         </w:rPr>
-        <w:t xml:space="preserve">alive</w:t>
-      </w:r>
-      <w:r>
-        <w:t xml:space="preserve"> </w:t>
-      </w:r>
-      <w:r>
-        <w:t xml:space="preserve">(studio window): new tracks and devices arrive already moving.</w:t>
+        <w:t xml:space="preserve">x</w:t>
+      </w:r>
+      <w:r>
+        <w:t xml:space="preserve"> </w:t>
+      </w:r>
+      <w:r>
+        <w:t xml:space="preserve">removes it (and any mods on it)</w:t>
+      </w:r>
+    </w:p>
+    <w:p>
+      <w:pPr>
+        <w:pStyle w:val="FirstParagraph"/>
+      </w:pPr>
+      <w:r>
+        <w:rPr>
+          <w:b/>
+          <w:bCs/>
+        </w:rPr>
+        <w:t xml:space="preserve">Mods into mods</w:t>
+      </w:r>
+      <w:r>
+        <w:t xml:space="preserve">: a mod’s</w:t>
+      </w:r>
+      <w:r>
+        <w:t xml:space="preserve"> </w:t>
+      </w:r>
+      <w:r>
+        <w:rPr>
+          <w:b/>
+          <w:bCs/>
+        </w:rPr>
+        <w:t xml:space="preserve">rate</w:t>
+      </w:r>
+      <w:r>
+        <w:t xml:space="preserve"> </w:t>
+      </w:r>
+      <w:r>
+        <w:t xml:space="preserve">and</w:t>
+      </w:r>
+      <w:r>
+        <w:t xml:space="preserve"> </w:t>
+      </w:r>
+      <w:r>
+        <w:rPr>
+          <w:b/>
+          <w:bCs/>
+        </w:rPr>
+        <w:t xml:space="preserve">depth</w:t>
+      </w:r>
+      <w:r>
+        <w:t xml:space="preserve"> </w:t>
+      </w:r>
+      <w:r>
+        <w:t xml:space="preserve">are knobs too. Right-click one, and the mod that</w:t>
+      </w:r>
+      <w:r>
+        <w:t xml:space="preserve"> </w:t>
+      </w:r>
+      <w:r>
+        <w:t xml:space="preserve">moves</w:t>
+      </w:r>
+      <w:r>
+        <w:t xml:space="preserve"> </w:t>
+      </w:r>
+      <w:r>
+        <w:rPr>
+          <w:i/>
+          <w:iCs/>
+        </w:rPr>
+        <w:t xml:space="preserve">it</w:t>
+      </w:r>
+      <w:r>
+        <w:t xml:space="preserve"> </w:t>
+      </w:r>
+      <w:r>
+        <w:t xml:space="preserve">appears indented underneath (</w:t>
+      </w:r>
+      <w:r>
+        <w:t xml:space="preserve">“↳ rate of …”</w:t>
+      </w:r>
+      <w:r>
+        <w:t xml:space="preserve">). Keep going as deep as you like.</w:t>
+      </w:r>
+    </w:p>
+    <w:p>
+      <w:pPr>
+        <w:pStyle w:val="BodyText"/>
+      </w:pPr>
+      <w:r>
+        <w:t xml:space="preserve">Also:</w:t>
       </w:r>
     </w:p>
     <w:p>
@@ -3282,17 +3404,56 @@
         <w:pStyle w:val="Compact"/>
         <w:numPr>
           <w:ilvl w:val="0"/>
-          <w:numId w:val="1008"/>
+          <w:numId w:val="1009"/>
         </w:numPr>
       </w:pPr>
       <w:r>
-        <w:t xml:space="preserve">Anything with a knob can be modulated: device settings, instrument settings, sends, pan, the</w:t>
-      </w:r>
-      <w:r>
-        <w:t xml:space="preserve"> </w:t>
-      </w:r>
-      <w:r>
-        <w:t xml:space="preserve">every-so-often sliders, takeover, tempo…</w:t>
+        <w:rPr>
+          <w:b/>
+          <w:bCs/>
+        </w:rPr>
+        <w:t xml:space="preserve">infect</w:t>
+      </w:r>
+      <w:r>
+        <w:t xml:space="preserve"> </w:t>
+      </w:r>
+      <w:r>
+        <w:t xml:space="preserve">(button, or</w:t>
+      </w:r>
+      <w:r>
+        <w:t xml:space="preserve"> </w:t>
+      </w:r>
+      <w:r>
+        <w:rPr>
+          <w:b/>
+          <w:bCs/>
+        </w:rPr>
+        <w:t xml:space="preserve">I</w:t>
+      </w:r>
+      <w:r>
+        <w:t xml:space="preserve">): scatters random mods (some following other tracks, some on other</w:t>
+      </w:r>
+      <w:r>
+        <w:t xml:space="preserve"> </w:t>
+      </w:r>
+      <w:r>
+        <w:t xml:space="preserve">mods). The mods panel’s own</w:t>
+      </w:r>
+      <w:r>
+        <w:t xml:space="preserve"> </w:t>
+      </w:r>
+      <w:r>
+        <w:rPr>
+          <w:b/>
+          <w:bCs/>
+        </w:rPr>
+        <w:t xml:space="preserve">infect</w:t>
+      </w:r>
+      <w:r>
+        <w:t xml:space="preserve"> </w:t>
+      </w:r>
+      <w:r>
+        <w:t xml:space="preserve">only touches the focused track.</w:t>
       </w:r>
     </w:p>
     <w:p>
@@ -3300,11 +3461,50 @@
         <w:pStyle w:val="Compact"/>
         <w:numPr>
           <w:ilvl w:val="0"/>
-          <w:numId w:val="1008"/>
+          <w:numId w:val="1009"/>
         </w:numPr>
       </w:pPr>
       <w:r>
-        <w:t xml:space="preserve">The master is never infected. It’s yours, by hand.</w:t>
+        <w:rPr>
+          <w:b/>
+          <w:bCs/>
+        </w:rPr>
+        <w:t xml:space="preserve">cure</w:t>
+      </w:r>
+      <w:r>
+        <w:t xml:space="preserve"> </w:t>
+      </w:r>
+      <w:r>
+        <w:t xml:space="preserve">(or</w:t>
+      </w:r>
+      <w:r>
+        <w:t xml:space="preserve"> </w:t>
+      </w:r>
+      <w:r>
+        <w:rPr>
+          <w:b/>
+          <w:bCs/>
+        </w:rPr>
+        <w:t xml:space="preserve">\</w:t>
+      </w:r>
+      <w:r>
+        <w:t xml:space="preserve">): removes every mod. The mods panel’s</w:t>
+      </w:r>
+      <w:r>
+        <w:t xml:space="preserve"> </w:t>
+      </w:r>
+      <w:r>
+        <w:rPr>
+          <w:b/>
+          <w:bCs/>
+        </w:rPr>
+        <w:t xml:space="preserve">cure</w:t>
+      </w:r>
+      <w:r>
+        <w:t xml:space="preserve"> </w:t>
+      </w:r>
+      <w:r>
+        <w:t xml:space="preserve">only touches this track.</w:t>
       </w:r>
     </w:p>
     <w:p>
@@ -3312,7 +3512,59 @@
         <w:pStyle w:val="Compact"/>
         <w:numPr>
           <w:ilvl w:val="0"/>
-          <w:numId w:val="1008"/>
+          <w:numId w:val="1009"/>
+        </w:numPr>
+      </w:pPr>
+      <w:r>
+        <w:rPr>
+          <w:b/>
+          <w:bCs/>
+        </w:rPr>
+        <w:t xml:space="preserve">alive</w:t>
+      </w:r>
+      <w:r>
+        <w:t xml:space="preserve"> </w:t>
+      </w:r>
+      <w:r>
+        <w:t xml:space="preserve">(studio window): new tracks and devices arrive already moving.</w:t>
+      </w:r>
+    </w:p>
+    <w:p>
+      <w:pPr>
+        <w:pStyle w:val="Compact"/>
+        <w:numPr>
+          <w:ilvl w:val="0"/>
+          <w:numId w:val="1009"/>
+        </w:numPr>
+      </w:pPr>
+      <w:r>
+        <w:t xml:space="preserve">Anything with a knob can be modulated: device settings, instrument settings, sends, pan, the</w:t>
+      </w:r>
+      <w:r>
+        <w:t xml:space="preserve"> </w:t>
+      </w:r>
+      <w:r>
+        <w:t xml:space="preserve">every-so-often sliders, takeover, tempo…</w:t>
+      </w:r>
+    </w:p>
+    <w:p>
+      <w:pPr>
+        <w:pStyle w:val="Compact"/>
+        <w:numPr>
+          <w:ilvl w:val="0"/>
+          <w:numId w:val="1009"/>
+        </w:numPr>
+      </w:pPr>
+      <w:r>
+        <w:t xml:space="preserve">The master is never infected. It’s yours, by hand.</w:t>
+      </w:r>
+    </w:p>
+    <w:p>
+      <w:pPr>
+        <w:pStyle w:val="Compact"/>
+        <w:numPr>
+          <w:ilvl w:val="0"/>
+          <w:numId w:val="1009"/>
         </w:numPr>
       </w:pPr>
       <w:r>
@@ -3346,11 +3598,11 @@
       <w:pPr>
         <w:pStyle w:val="Heading2"/>
       </w:pPr>
-      <w:bookmarkStart w:id="35" w:name="_b53aca093982d2d13ec993337bfc1422c678be5"/>
+      <w:bookmarkStart w:id="36" w:name="_b53aca093982d2d13ec993337bfc1422c678be5"/>
       <w:r>
         <w:t xml:space="preserve">7½. LFOs (Serum / Vital style)</w:t>
       </w:r>
-      <w:bookmarkEnd w:id="35"/>
+      <w:bookmarkEnd w:id="36"/>
     </w:p>
     <w:p>
       <w:pPr>
@@ -3361,18 +3613,18 @@
           <wp:inline>
             <wp:extent cx="5334000" cy="648729"/>
             <wp:effectExtent b="0" l="0" r="0" t="0"/>
-            <wp:docPr descr="the LFO row" title="" id="37" name="Picture"/>
+            <wp:docPr descr="the LFO row" title="" id="38" name="Picture"/>
             <a:graphic>
               <a:graphicData uri="http://schemas.openxmlformats.org/drawingml/2006/picture">
                 <pic:pic>
                   <pic:nvPicPr>
-                    <pic:cNvPr descr="docs/img/lfos.png" id="38" name="Picture"/>
+                    <pic:cNvPr descr="docs/img/lfos.png" id="39" name="Picture"/>
                     <pic:cNvPicPr>
                       <a:picLocks noChangeArrowheads="1" noChangeAspect="1"/>
                     </pic:cNvPicPr>
                   </pic:nvPicPr>
                   <pic:blipFill>
-                    <a:blip r:embed="rId36"/>
+                    <a:blip r:embed="rId37"/>
                     <a:stretch>
                       <a:fillRect/>
                     </a:stretch>
@@ -3436,7 +3688,7 @@
         <w:pStyle w:val="Compact"/>
         <w:numPr>
           <w:ilvl w:val="0"/>
-          <w:numId w:val="1009"/>
+          <w:numId w:val="1010"/>
         </w:numPr>
       </w:pPr>
       <w:r>
@@ -3483,7 +3735,7 @@
         <w:pStyle w:val="Compact"/>
         <w:numPr>
           <w:ilvl w:val="0"/>
-          <w:numId w:val="1009"/>
+          <w:numId w:val="1010"/>
         </w:numPr>
       </w:pPr>
       <w:r>
@@ -3518,7 +3770,7 @@
         <w:pStyle w:val="Compact"/>
         <w:numPr>
           <w:ilvl w:val="0"/>
-          <w:numId w:val="1009"/>
+          <w:numId w:val="1010"/>
         </w:numPr>
       </w:pPr>
       <w:r>
@@ -3581,7 +3833,7 @@
         <w:pStyle w:val="Compact"/>
         <w:numPr>
           <w:ilvl w:val="0"/>
-          <w:numId w:val="1009"/>
+          <w:numId w:val="1010"/>
         </w:numPr>
       </w:pPr>
       <w:r>
@@ -3638,7 +3890,7 @@
         <w:pStyle w:val="Compact"/>
         <w:numPr>
           <w:ilvl w:val="0"/>
-          <w:numId w:val="1009"/>
+          <w:numId w:val="1010"/>
         </w:numPr>
       </w:pPr>
       <w:r>
@@ -3697,7 +3949,7 @@
         <w:pStyle w:val="Compact"/>
         <w:numPr>
           <w:ilvl w:val="0"/>
-          <w:numId w:val="1009"/>
+          <w:numId w:val="1010"/>
         </w:numPr>
       </w:pPr>
       <w:r>
@@ -3735,7 +3987,7 @@
         <w:pStyle w:val="Compact"/>
         <w:numPr>
           <w:ilvl w:val="0"/>
-          <w:numId w:val="1009"/>
+          <w:numId w:val="1010"/>
         </w:numPr>
       </w:pPr>
       <w:r>
@@ -3754,11 +4006,11 @@
       <w:pPr>
         <w:pStyle w:val="Heading2"/>
       </w:pPr>
-      <w:bookmarkStart w:id="39" w:name="_38b93c7fafd2d68f4d39234d80887dd163dcf58"/>
+      <w:bookmarkStart w:id="40" w:name="_38b93c7fafd2d68f4d39234d80887dd163dcf58"/>
       <w:r>
         <w:t xml:space="preserve">8. Every so often</w:t>
       </w:r>
-      <w:bookmarkEnd w:id="39"/>
+      <w:bookmarkEnd w:id="40"/>
     </w:p>
     <w:p>
       <w:pPr>
@@ -4297,11 +4549,11 @@
       <w:pPr>
         <w:pStyle w:val="Heading2"/>
       </w:pPr>
-      <w:bookmarkStart w:id="40" w:name="_6b61a8d1df24a4a32d0531f830638a730b9b572"/>
+      <w:bookmarkStart w:id="41" w:name="_6b61a8d1df24a4a32d0531f830638a730b9b572"/>
       <w:r>
         <w:t xml:space="preserve">9. Big moves</w:t>
       </w:r>
-      <w:bookmarkEnd w:id="40"/>
+      <w:bookmarkEnd w:id="41"/>
     </w:p>
     <w:tbl>
       <w:tblPr>
@@ -4620,21 +4872,21 @@
       <w:pPr>
         <w:pStyle w:val="Heading2"/>
       </w:pPr>
-      <w:bookmarkStart w:id="41" w:name="_instruments"/>
+      <w:bookmarkStart w:id="42" w:name="_instruments"/>
       <w:r>
         <w:t xml:space="preserve">10. Instruments</w:t>
       </w:r>
-      <w:bookmarkEnd w:id="41"/>
+      <w:bookmarkEnd w:id="42"/>
     </w:p>
     <w:p>
       <w:pPr>
         <w:pStyle w:val="Heading3"/>
       </w:pPr>
-      <w:bookmarkStart w:id="42" w:name="_36f252bfda2a5e22f3ebeddac50f9d63ae6b5d7"/>
+      <w:bookmarkStart w:id="43" w:name="_36f252bfda2a5e22f3ebeddac50f9d63ae6b5d7"/>
       <w:r>
         <w:t xml:space="preserve">bytebeat (the bitmeister)</w:t>
       </w:r>
-      <w:bookmarkEnd w:id="42"/>
+      <w:bookmarkEnd w:id="43"/>
     </w:p>
     <w:p>
       <w:pPr>
@@ -4712,11 +4964,11 @@
       <w:pPr>
         <w:pStyle w:val="Heading3"/>
       </w:pPr>
-      <w:bookmarkStart w:id="43" w:name="_grains"/>
+      <w:bookmarkStart w:id="44" w:name="_grains"/>
       <w:r>
         <w:t xml:space="preserve">grains</w:t>
       </w:r>
-      <w:bookmarkEnd w:id="43"/>
+      <w:bookmarkEnd w:id="44"/>
     </w:p>
     <w:p>
       <w:pPr>
@@ -4727,18 +4979,18 @@
           <wp:inline>
             <wp:extent cx="5334000" cy="3275076"/>
             <wp:effectExtent b="0" l="0" r="0" t="0"/>
-            <wp:docPr descr="grains" title="" id="45" name="Picture"/>
+            <wp:docPr descr="grains" title="" id="46" name="Picture"/>
             <a:graphic>
               <a:graphicData uri="http://schemas.openxmlformats.org/drawingml/2006/picture">
                 <pic:pic>
                   <pic:nvPicPr>
-                    <pic:cNvPr descr="docs/img/grains.png" id="46" name="Picture"/>
+                    <pic:cNvPr descr="docs/img/grains.png" id="47" name="Picture"/>
                     <pic:cNvPicPr>
                       <a:picLocks noChangeArrowheads="1" noChangeAspect="1"/>
                     </pic:cNvPicPr>
                   </pic:nvPicPr>
                   <pic:blipFill>
-                    <a:blip r:embed="rId44"/>
+                    <a:blip r:embed="rId45"/>
                     <a:stretch>
                       <a:fillRect/>
                     </a:stretch>
@@ -4878,11 +5130,11 @@
       <w:pPr>
         <w:pStyle w:val="Heading3"/>
       </w:pPr>
-      <w:bookmarkStart w:id="47" w:name="_noise"/>
+      <w:bookmarkStart w:id="48" w:name="_noise"/>
       <w:r>
         <w:t xml:space="preserve">noise</w:t>
       </w:r>
-      <w:bookmarkEnd w:id="47"/>
+      <w:bookmarkEnd w:id="48"/>
     </w:p>
     <w:p>
       <w:pPr>
@@ -4893,18 +5145,18 @@
           <wp:inline>
             <wp:extent cx="5334000" cy="3253740"/>
             <wp:effectExtent b="0" l="0" r="0" t="0"/>
-            <wp:docPr descr="noise" title="" id="49" name="Picture"/>
+            <wp:docPr descr="noise" title="" id="50" name="Picture"/>
             <a:graphic>
               <a:graphicData uri="http://schemas.openxmlformats.org/drawingml/2006/picture">
                 <pic:pic>
                   <pic:nvPicPr>
-                    <pic:cNvPr descr="docs/img/noise.png" id="50" name="Picture"/>
+                    <pic:cNvPr descr="docs/img/noise.png" id="51" name="Picture"/>
                     <pic:cNvPicPr>
                       <a:picLocks noChangeArrowheads="1" noChangeAspect="1"/>
                     </pic:cNvPicPr>
                   </pic:nvPicPr>
                   <pic:blipFill>
-                    <a:blip r:embed="rId48"/>
+                    <a:blip r:embed="rId49"/>
                     <a:stretch>
                       <a:fillRect/>
                     </a:stretch>
@@ -5102,11 +5354,11 @@
       <w:pPr>
         <w:pStyle w:val="Heading3"/>
       </w:pPr>
-      <w:bookmarkStart w:id="51" w:name="_mouth"/>
+      <w:bookmarkStart w:id="52" w:name="_mouth"/>
       <w:r>
         <w:t xml:space="preserve">mouth</w:t>
       </w:r>
-      <w:bookmarkEnd w:id="51"/>
+      <w:bookmarkEnd w:id="52"/>
     </w:p>
     <w:p>
       <w:pPr>
@@ -5117,18 +5369,18 @@
           <wp:inline>
             <wp:extent cx="5334000" cy="3253740"/>
             <wp:effectExtent b="0" l="0" r="0" t="0"/>
-            <wp:docPr descr="mouth" title="" id="53" name="Picture"/>
+            <wp:docPr descr="mouth" title="" id="54" name="Picture"/>
             <a:graphic>
               <a:graphicData uri="http://schemas.openxmlformats.org/drawingml/2006/picture">
                 <pic:pic>
                   <pic:nvPicPr>
-                    <pic:cNvPr descr="docs/img/mouth.png" id="54" name="Picture"/>
+                    <pic:cNvPr descr="docs/img/mouth.png" id="55" name="Picture"/>
                     <pic:cNvPicPr>
                       <a:picLocks noChangeArrowheads="1" noChangeAspect="1"/>
                     </pic:cNvPicPr>
                   </pic:nvPicPr>
                   <pic:blipFill>
-                    <a:blip r:embed="rId52"/>
+                    <a:blip r:embed="rId53"/>
                     <a:stretch>
                       <a:fillRect/>
                     </a:stretch>
@@ -5363,11 +5615,11 @@
       <w:pPr>
         <w:pStyle w:val="Heading3"/>
       </w:pPr>
-      <w:bookmarkStart w:id="55" w:name="_deck"/>
+      <w:bookmarkStart w:id="56" w:name="_deck"/>
       <w:r>
         <w:t xml:space="preserve">deck</w:t>
       </w:r>
-      <w:bookmarkEnd w:id="55"/>
+      <w:bookmarkEnd w:id="56"/>
     </w:p>
     <w:p>
       <w:pPr>
@@ -5378,18 +5630,18 @@
           <wp:inline>
             <wp:extent cx="5334000" cy="3253740"/>
             <wp:effectExtent b="0" l="0" r="0" t="0"/>
-            <wp:docPr descr="deck" title="" id="57" name="Picture"/>
+            <wp:docPr descr="deck" title="" id="58" name="Picture"/>
             <a:graphic>
               <a:graphicData uri="http://schemas.openxmlformats.org/drawingml/2006/picture">
                 <pic:pic>
                   <pic:nvPicPr>
-                    <pic:cNvPr descr="docs/img/deck.png" id="58" name="Picture"/>
+                    <pic:cNvPr descr="docs/img/deck.png" id="59" name="Picture"/>
                     <pic:cNvPicPr>
                       <a:picLocks noChangeArrowheads="1" noChangeAspect="1"/>
                     </pic:cNvPicPr>
                   </pic:nvPicPr>
                   <pic:blipFill>
-                    <a:blip r:embed="rId56"/>
+                    <a:blip r:embed="rId57"/>
                     <a:stretch>
                       <a:fillRect/>
                     </a:stretch>
@@ -5696,11 +5948,11 @@
       <w:pPr>
         <w:pStyle w:val="Heading3"/>
       </w:pPr>
-      <w:bookmarkStart w:id="59" w:name="_osc3"/>
+      <w:bookmarkStart w:id="60" w:name="_osc3"/>
       <w:r>
         <w:t xml:space="preserve">osc3</w:t>
       </w:r>
-      <w:bookmarkEnd w:id="59"/>
+      <w:bookmarkEnd w:id="60"/>
     </w:p>
     <w:p>
       <w:pPr>
@@ -5711,18 +5963,18 @@
           <wp:inline>
             <wp:extent cx="5334000" cy="3253740"/>
             <wp:effectExtent b="0" l="0" r="0" t="0"/>
-            <wp:docPr descr="osc3" title="" id="61" name="Picture"/>
+            <wp:docPr descr="osc3" title="" id="62" name="Picture"/>
             <a:graphic>
               <a:graphicData uri="http://schemas.openxmlformats.org/drawingml/2006/picture">
                 <pic:pic>
                   <pic:nvPicPr>
-                    <pic:cNvPr descr="docs/img/osc3.png" id="62" name="Picture"/>
+                    <pic:cNvPr descr="docs/img/osc3.png" id="63" name="Picture"/>
                     <pic:cNvPicPr>
                       <a:picLocks noChangeArrowheads="1" noChangeAspect="1"/>
                     </pic:cNvPicPr>
                   </pic:nvPicPr>
                   <pic:blipFill>
-                    <a:blip r:embed="rId60"/>
+                    <a:blip r:embed="rId61"/>
                     <a:stretch>
                       <a:fillRect/>
                     </a:stretch>
@@ -5898,11 +6150,11 @@
       <w:pPr>
         <w:pStyle w:val="Heading3"/>
       </w:pPr>
-      <w:bookmarkStart w:id="63" w:name="_atari"/>
+      <w:bookmarkStart w:id="64" w:name="_atari"/>
       <w:r>
         <w:t xml:space="preserve">atari</w:t>
       </w:r>
-      <w:bookmarkEnd w:id="63"/>
+      <w:bookmarkEnd w:id="64"/>
     </w:p>
     <w:p>
       <w:pPr>
@@ -5913,18 +6165,18 @@
           <wp:inline>
             <wp:extent cx="5334000" cy="3253740"/>
             <wp:effectExtent b="0" l="0" r="0" t="0"/>
-            <wp:docPr descr="atari" title="" id="65" name="Picture"/>
+            <wp:docPr descr="atari" title="" id="66" name="Picture"/>
             <a:graphic>
               <a:graphicData uri="http://schemas.openxmlformats.org/drawingml/2006/picture">
                 <pic:pic>
                   <pic:nvPicPr>
-                    <pic:cNvPr descr="docs/img/atari.png" id="66" name="Picture"/>
+                    <pic:cNvPr descr="docs/img/atari.png" id="67" name="Picture"/>
                     <pic:cNvPicPr>
                       <a:picLocks noChangeArrowheads="1" noChangeAspect="1"/>
                     </pic:cNvPicPr>
                   </pic:nvPicPr>
                   <pic:blipFill>
-                    <a:blip r:embed="rId64"/>
+                    <a:blip r:embed="rId65"/>
                     <a:stretch>
                       <a:fillRect/>
                     </a:stretch>
@@ -6063,11 +6315,11 @@
       <w:pPr>
         <w:pStyle w:val="Heading3"/>
       </w:pPr>
-      <w:bookmarkStart w:id="67" w:name="_drums"/>
+      <w:bookmarkStart w:id="68" w:name="_drums"/>
       <w:r>
         <w:t xml:space="preserve">drums</w:t>
       </w:r>
-      <w:bookmarkEnd w:id="67"/>
+      <w:bookmarkEnd w:id="68"/>
     </w:p>
     <w:p>
       <w:pPr>
@@ -6078,18 +6330,18 @@
           <wp:inline>
             <wp:extent cx="5334000" cy="3253740"/>
             <wp:effectExtent b="0" l="0" r="0" t="0"/>
-            <wp:docPr descr="drums" title="" id="69" name="Picture"/>
+            <wp:docPr descr="drums" title="" id="70" name="Picture"/>
             <a:graphic>
               <a:graphicData uri="http://schemas.openxmlformats.org/drawingml/2006/picture">
                 <pic:pic>
                   <pic:nvPicPr>
-                    <pic:cNvPr descr="docs/img/drums.png" id="70" name="Picture"/>
+                    <pic:cNvPr descr="docs/img/drums.png" id="71" name="Picture"/>
                     <pic:cNvPicPr>
                       <a:picLocks noChangeArrowheads="1" noChangeAspect="1"/>
                     </pic:cNvPicPr>
                   </pic:nvPicPr>
                   <pic:blipFill>
-                    <a:blip r:embed="rId68"/>
+                    <a:blip r:embed="rId69"/>
                     <a:stretch>
                       <a:fillRect/>
                     </a:stretch>
@@ -6356,11 +6608,11 @@
       <w:pPr>
         <w:pStyle w:val="Heading3"/>
       </w:pPr>
-      <w:bookmarkStart w:id="71" w:name="_558c07a85e7114cb4f79c9c835359eb0d2e8c09"/>
+      <w:bookmarkStart w:id="72" w:name="_558c07a85e7114cb4f79c9c835359eb0d2e8c09"/>
       <w:r>
         <w:t xml:space="preserve">creature, hum</w:t>
       </w:r>
-      <w:bookmarkEnd w:id="71"/>
+      <w:bookmarkEnd w:id="72"/>
     </w:p>
     <w:p>
       <w:pPr>
@@ -6371,18 +6623,18 @@
           <wp:inline>
             <wp:extent cx="5334000" cy="3171952"/>
             <wp:effectExtent b="0" l="0" r="0" t="0"/>
-            <wp:docPr descr="creature" title="" id="73" name="Picture"/>
+            <wp:docPr descr="creature" title="" id="74" name="Picture"/>
             <a:graphic>
               <a:graphicData uri="http://schemas.openxmlformats.org/drawingml/2006/picture">
                 <pic:pic>
                   <pic:nvPicPr>
-                    <pic:cNvPr descr="docs/img/creature.png" id="74" name="Picture"/>
+                    <pic:cNvPr descr="docs/img/creature.png" id="75" name="Picture"/>
                     <pic:cNvPicPr>
                       <a:picLocks noChangeArrowheads="1" noChangeAspect="1"/>
                     </pic:cNvPicPr>
                   </pic:nvPicPr>
                   <pic:blipFill>
-                    <a:blip r:embed="rId72"/>
+                    <a:blip r:embed="rId73"/>
                     <a:stretch>
                       <a:fillRect/>
                     </a:stretch>
@@ -6457,11 +6709,11 @@
       <w:pPr>
         <w:pStyle w:val="Heading3"/>
       </w:pPr>
-      <w:bookmarkStart w:id="75" w:name="_b519c9889491143f9f1bbe1f0f598ee8766c00f"/>
+      <w:bookmarkStart w:id="76" w:name="_b519c9889491143f9f1bbe1f0f598ee8766c00f"/>
       <w:r>
         <w:t xml:space="preserve">keys, fm, kick</w:t>
       </w:r>
-      <w:bookmarkEnd w:id="75"/>
+      <w:bookmarkEnd w:id="76"/>
     </w:p>
     <w:p>
       <w:pPr>
@@ -6588,11 +6840,11 @@
       <w:pPr>
         <w:pStyle w:val="Heading2"/>
       </w:pPr>
-      <w:bookmarkStart w:id="76" w:name="_effects"/>
+      <w:bookmarkStart w:id="77" w:name="_effects"/>
       <w:r>
         <w:t xml:space="preserve">11. Effects</w:t>
       </w:r>
-      <w:bookmarkEnd w:id="76"/>
+      <w:bookmarkEnd w:id="77"/>
     </w:p>
     <w:p>
       <w:pPr>
@@ -6607,7 +6859,7 @@
         <w:pStyle w:val="Compact"/>
         <w:numPr>
           <w:ilvl w:val="0"/>
-          <w:numId w:val="1010"/>
+          <w:numId w:val="1011"/>
         </w:numPr>
       </w:pPr>
       <w:r>
@@ -6626,7 +6878,7 @@
         <w:pStyle w:val="Compact"/>
         <w:numPr>
           <w:ilvl w:val="0"/>
-          <w:numId w:val="1010"/>
+          <w:numId w:val="1011"/>
         </w:numPr>
       </w:pPr>
       <w:r>
@@ -6648,7 +6900,7 @@
         <w:pStyle w:val="Compact"/>
         <w:numPr>
           <w:ilvl w:val="1"/>
-          <w:numId w:val="1011"/>
+          <w:numId w:val="1012"/>
         </w:numPr>
       </w:pPr>
       <w:r>
@@ -6667,7 +6919,7 @@
         <w:pStyle w:val="Compact"/>
         <w:numPr>
           <w:ilvl w:val="1"/>
-          <w:numId w:val="1011"/>
+          <w:numId w:val="1012"/>
         </w:numPr>
       </w:pPr>
       <w:r>
@@ -6696,7 +6948,7 @@
         <w:pStyle w:val="Compact"/>
         <w:numPr>
           <w:ilvl w:val="1"/>
-          <w:numId w:val="1011"/>
+          <w:numId w:val="1012"/>
         </w:numPr>
       </w:pPr>
       <w:r>
@@ -6731,7 +6983,7 @@
         <w:pStyle w:val="Compact"/>
         <w:numPr>
           <w:ilvl w:val="1"/>
-          <w:numId w:val="1011"/>
+          <w:numId w:val="1012"/>
         </w:numPr>
       </w:pPr>
       <w:r>
@@ -6783,7 +7035,7 @@
         <w:pStyle w:val="Compact"/>
         <w:numPr>
           <w:ilvl w:val="1"/>
-          <w:numId w:val="1011"/>
+          <w:numId w:val="1012"/>
         </w:numPr>
       </w:pPr>
       <w:r>
@@ -6815,7 +7067,7 @@
         <w:pStyle w:val="Compact"/>
         <w:numPr>
           <w:ilvl w:val="1"/>
-          <w:numId w:val="1011"/>
+          <w:numId w:val="1012"/>
         </w:numPr>
       </w:pPr>
       <w:r>
@@ -6834,7 +7086,7 @@
         <w:pStyle w:val="Compact"/>
         <w:numPr>
           <w:ilvl w:val="0"/>
-          <w:numId w:val="1010"/>
+          <w:numId w:val="1011"/>
         </w:numPr>
       </w:pPr>
       <w:r>
@@ -6894,7 +7146,7 @@
         <w:pStyle w:val="Compact"/>
         <w:numPr>
           <w:ilvl w:val="0"/>
-          <w:numId w:val="1010"/>
+          <w:numId w:val="1011"/>
         </w:numPr>
       </w:pPr>
       <w:r>
@@ -6913,7 +7165,7 @@
         <w:pStyle w:val="Compact"/>
         <w:numPr>
           <w:ilvl w:val="0"/>
-          <w:numId w:val="1010"/>
+          <w:numId w:val="1011"/>
         </w:numPr>
       </w:pPr>
       <w:r>
@@ -6932,7 +7184,7 @@
         <w:pStyle w:val="Compact"/>
         <w:numPr>
           <w:ilvl w:val="0"/>
-          <w:numId w:val="1010"/>
+          <w:numId w:val="1011"/>
         </w:numPr>
       </w:pPr>
       <w:r>
@@ -6951,7 +7203,7 @@
         <w:pStyle w:val="Compact"/>
         <w:numPr>
           <w:ilvl w:val="0"/>
-          <w:numId w:val="1010"/>
+          <w:numId w:val="1011"/>
         </w:numPr>
       </w:pPr>
       <w:r>
@@ -7095,11 +7347,11 @@
       <w:pPr>
         <w:pStyle w:val="Heading2"/>
       </w:pPr>
-      <w:bookmarkStart w:id="77" w:name="_4a04b088d11928ce66d92febf57955f2c36ecae"/>
+      <w:bookmarkStart w:id="78" w:name="_4a04b088d11928ce66d92febf57955f2c36ecae"/>
       <w:r>
         <w:t xml:space="preserve">12. The 8 encoders and MIDI</w:t>
       </w:r>
-      <w:bookmarkEnd w:id="77"/>
+      <w:bookmarkEnd w:id="78"/>
     </w:p>
     <w:p>
       <w:pPr>
@@ -7178,7 +7430,7 @@
         <w:pStyle w:val="Compact"/>
         <w:numPr>
           <w:ilvl w:val="0"/>
-          <w:numId w:val="1012"/>
+          <w:numId w:val="1013"/>
         </w:numPr>
       </w:pPr>
       <w:r>
@@ -7206,7 +7458,7 @@
         <w:pStyle w:val="Compact"/>
         <w:numPr>
           <w:ilvl w:val="0"/>
-          <w:numId w:val="1012"/>
+          <w:numId w:val="1013"/>
         </w:numPr>
       </w:pPr>
       <w:r>
@@ -7253,7 +7505,7 @@
         <w:pStyle w:val="Compact"/>
         <w:numPr>
           <w:ilvl w:val="0"/>
-          <w:numId w:val="1012"/>
+          <w:numId w:val="1013"/>
         </w:numPr>
       </w:pPr>
       <w:r>
@@ -7362,7 +7614,7 @@
         <w:pStyle w:val="Compact"/>
         <w:numPr>
           <w:ilvl w:val="0"/>
-          <w:numId w:val="1012"/>
+          <w:numId w:val="1013"/>
         </w:numPr>
       </w:pPr>
       <w:r>
@@ -7374,7 +7626,7 @@
         <w:pStyle w:val="Compact"/>
         <w:numPr>
           <w:ilvl w:val="0"/>
-          <w:numId w:val="1012"/>
+          <w:numId w:val="1013"/>
         </w:numPr>
       </w:pPr>
       <w:r>
@@ -7386,7 +7638,7 @@
         <w:pStyle w:val="Compact"/>
         <w:numPr>
           <w:ilvl w:val="0"/>
-          <w:numId w:val="1012"/>
+          <w:numId w:val="1013"/>
         </w:numPr>
       </w:pPr>
       <w:r>
@@ -7408,7 +7660,7 @@
         <w:pStyle w:val="Compact"/>
         <w:numPr>
           <w:ilvl w:val="0"/>
-          <w:numId w:val="1012"/>
+          <w:numId w:val="1013"/>
         </w:numPr>
       </w:pPr>
       <w:r>
@@ -7426,11 +7678,11 @@
       <w:pPr>
         <w:pStyle w:val="Heading2"/>
       </w:pPr>
-      <w:bookmarkStart w:id="78" w:name="_dcb5886c37b9352b56e327030ed2248e18665e3"/>
+      <w:bookmarkStart w:id="79" w:name="_dcb5886c37b9352b56e327030ed2248e18665e3"/>
       <w:r>
         <w:t xml:space="preserve">13. Playing it from the keyboard</w:t>
       </w:r>
-      <w:bookmarkEnd w:id="78"/>
+      <w:bookmarkEnd w:id="79"/>
     </w:p>
     <w:tbl>
       <w:tblPr>
@@ -8110,11 +8362,11 @@
       <w:pPr>
         <w:pStyle w:val="Heading2"/>
       </w:pPr>
-      <w:bookmarkStart w:id="79" w:name="_358e8f8637f9e8f3f8dcdc2e2eeccd6f387f989"/>
+      <w:bookmarkStart w:id="80" w:name="_358e8f8637f9e8f3f8dcdc2e2eeccd6f387f989"/>
       <w:r>
         <w:t xml:space="preserve">14. The studio window</w:t>
       </w:r>
-      <w:bookmarkEnd w:id="79"/>
+      <w:bookmarkEnd w:id="80"/>
     </w:p>
     <w:p>
       <w:pPr>
@@ -8125,18 +8377,18 @@
           <wp:inline>
             <wp:extent cx="5334000" cy="3136392"/>
             <wp:effectExtent b="0" l="0" r="0" t="0"/>
-            <wp:docPr descr="studio" title="" id="81" name="Picture"/>
+            <wp:docPr descr="studio" title="" id="82" name="Picture"/>
             <a:graphic>
               <a:graphicData uri="http://schemas.openxmlformats.org/drawingml/2006/picture">
                 <pic:pic>
                   <pic:nvPicPr>
-                    <pic:cNvPr descr="docs/img/studio.png" id="82" name="Picture"/>
+                    <pic:cNvPr descr="docs/img/studio.png" id="83" name="Picture"/>
                     <pic:cNvPicPr>
                       <a:picLocks noChangeArrowheads="1" noChangeAspect="1"/>
                     </pic:cNvPicPr>
                   </pic:nvPicPr>
                   <pic:blipFill>
-                    <a:blip r:embed="rId80"/>
+                    <a:blip r:embed="rId81"/>
                     <a:stretch>
                       <a:fillRect/>
                     </a:stretch>
@@ -8213,7 +8465,7 @@
         <w:pStyle w:val="Compact"/>
         <w:numPr>
           <w:ilvl w:val="0"/>
-          <w:numId w:val="1013"/>
+          <w:numId w:val="1014"/>
         </w:numPr>
       </w:pPr>
       <w:r>
@@ -8286,7 +8538,7 @@
         <w:pStyle w:val="Compact"/>
         <w:numPr>
           <w:ilvl w:val="0"/>
-          <w:numId w:val="1013"/>
+          <w:numId w:val="1014"/>
         </w:numPr>
       </w:pPr>
       <w:r>
@@ -8397,7 +8649,7 @@
         <w:pStyle w:val="Compact"/>
         <w:numPr>
           <w:ilvl w:val="0"/>
-          <w:numId w:val="1013"/>
+          <w:numId w:val="1014"/>
         </w:numPr>
       </w:pPr>
       <w:r>
@@ -8441,7 +8693,7 @@
         <w:pStyle w:val="Compact"/>
         <w:numPr>
           <w:ilvl w:val="0"/>
-          <w:numId w:val="1013"/>
+          <w:numId w:val="1014"/>
         </w:numPr>
       </w:pPr>
       <w:r>
@@ -8562,7 +8814,7 @@
         <w:pStyle w:val="Compact"/>
         <w:numPr>
           <w:ilvl w:val="0"/>
-          <w:numId w:val="1013"/>
+          <w:numId w:val="1014"/>
         </w:numPr>
       </w:pPr>
       <w:r>
@@ -8588,18 +8840,18 @@
           <wp:inline>
             <wp:extent cx="5334000" cy="3136392"/>
             <wp:effectExtent b="0" l="0" r="0" t="0"/>
-            <wp:docPr descr="every mod in the set" title="" id="84" name="Picture"/>
+            <wp:docPr descr="every mod in the set" title="" id="85" name="Picture"/>
             <a:graphic>
               <a:graphicData uri="http://schemas.openxmlformats.org/drawingml/2006/picture">
                 <pic:pic>
                   <pic:nvPicPr>
-                    <pic:cNvPr descr="docs/img/studio-mods.png" id="85" name="Picture"/>
+                    <pic:cNvPr descr="docs/img/studio-mods.png" id="86" name="Picture"/>
                     <pic:cNvPicPr>
                       <a:picLocks noChangeArrowheads="1" noChangeAspect="1"/>
                     </pic:cNvPicPr>
                   </pic:nvPicPr>
                   <pic:blipFill>
-                    <a:blip r:embed="rId83"/>
+                    <a:blip r:embed="rId84"/>
                     <a:stretch>
                       <a:fillRect/>
                     </a:stretch>
@@ -8645,547 +8897,11 @@
       <w:pPr>
         <w:pStyle w:val="Heading2"/>
       </w:pPr>
-      <w:bookmarkStart w:id="86" w:name="_09631190d1167c1cfccf743b08f42330a821ecc"/>
+      <w:bookmarkStart w:id="87" w:name="_09631190d1167c1cfccf743b08f42330a821ecc"/>
       <w:r>
         <w:t xml:space="preserve">15. Sets, scenes, files</w:t>
       </w:r>
-      <w:bookmarkEnd w:id="86"/>
-    </w:p>
-    <w:p>
-      <w:pPr>
-        <w:pStyle w:val="Compact"/>
-        <w:numPr>
-          <w:ilvl w:val="0"/>
-          <w:numId w:val="1014"/>
-        </w:numPr>
-      </w:pPr>
-      <w:r>
-        <w:rPr>
-          <w:b/>
-          <w:bCs/>
-        </w:rPr>
-        <w:t xml:space="preserve">save / load</w:t>
-      </w:r>
-      <w:r>
-        <w:t xml:space="preserve"> </w:t>
-      </w:r>
-      <w:r>
-        <w:t xml:space="preserve">(top bar): a whole set (tracks, devices, sends, mods, scenes, song, MIDI maps,</w:t>
-      </w:r>
-      <w:r>
-        <w:t xml:space="preserve"> </w:t>
-      </w:r>
-      <w:r>
-        <w:t xml:space="preserve">the wall, loaded files’ paths) in one</w:t>
-      </w:r>
-      <w:r>
-        <w:t xml:space="preserve"> </w:t>
-      </w:r>
-      <w:r>
-        <w:rPr>
-          <w:rStyle w:val="VerbatimChar"/>
-        </w:rPr>
-        <w:t xml:space="preserve">.unsound</w:t>
-      </w:r>
-      <w:r>
-        <w:t xml:space="preserve"> </w:t>
-      </w:r>
-      <w:r>
-        <w:t xml:space="preserve">file. Sets go in</w:t>
-      </w:r>
-      <w:r>
-        <w:t xml:space="preserve"> </w:t>
-      </w:r>
-      <w:r>
-        <w:rPr>
-          <w:rStyle w:val="VerbatimChar"/>
-        </w:rPr>
-        <w:t xml:space="preserve">sets/</w:t>
-      </w:r>
-      <w:r>
-        <w:t xml:space="preserve"> </w:t>
-      </w:r>
-      <w:r>
-        <w:t xml:space="preserve">by default.</w:t>
-      </w:r>
-    </w:p>
-    <w:p>
-      <w:pPr>
-        <w:pStyle w:val="Compact"/>
-        <w:numPr>
-          <w:ilvl w:val="0"/>
-          <w:numId w:val="1014"/>
-        </w:numPr>
-      </w:pPr>
-      <w:r>
-        <w:rPr>
-          <w:b/>
-          <w:bCs/>
-        </w:rPr>
-        <w:t xml:space="preserve">keeps</w:t>
-      </w:r>
-      <w:r>
-        <w:t xml:space="preserve"> </w:t>
-      </w:r>
-      <w:r>
-        <w:t xml:space="preserve">and recordings go to</w:t>
-      </w:r>
-      <w:r>
-        <w:t xml:space="preserve"> </w:t>
-      </w:r>
-      <w:r>
-        <w:rPr>
-          <w:rStyle w:val="VerbatimChar"/>
-        </w:rPr>
-        <w:t xml:space="preserve">~/Music/unsound/</w:t>
-      </w:r>
-      <w:r>
-        <w:t xml:space="preserve">.</w:t>
-      </w:r>
-    </w:p>
-    <w:p>
-      <w:pPr>
-        <w:pStyle w:val="Compact"/>
-        <w:numPr>
-          <w:ilvl w:val="0"/>
-          <w:numId w:val="1014"/>
-        </w:numPr>
-      </w:pPr>
-      <w:r>
-        <w:t xml:space="preserve">The sample folder is</w:t>
-      </w:r>
-      <w:r>
-        <w:t xml:space="preserve"> </w:t>
-      </w:r>
-      <w:r>
-        <w:rPr>
-          <w:rStyle w:val="VerbatimChar"/>
-        </w:rPr>
-        <w:t xml:space="preserve">~folder</w:t>
-      </w:r>
-      <w:r>
-        <w:t xml:space="preserve"> </w:t>
-      </w:r>
-      <w:r>
-        <w:t xml:space="preserve">in</w:t>
-      </w:r>
-      <w:r>
-        <w:t xml:space="preserve"> </w:t>
-      </w:r>
-      <w:r>
-        <w:rPr>
-          <w:rStyle w:val="VerbatimChar"/>
-        </w:rPr>
-        <w:t xml:space="preserve">play.scd</w:t>
-      </w:r>
-      <w:r>
-        <w:t xml:space="preserve">;</w:t>
-      </w:r>
-      <w:r>
-        <w:t xml:space="preserve"> </w:t>
-      </w:r>
-      <w:r>
-        <w:rPr>
-          <w:rStyle w:val="VerbatimChar"/>
-        </w:rPr>
-        <w:t xml:space="preserve">~reload.("~/some/folder")</w:t>
-      </w:r>
-      <w:r>
-        <w:t xml:space="preserve"> </w:t>
-      </w:r>
-      <w:r>
-        <w:t xml:space="preserve">swaps it while playing.</w:t>
-      </w:r>
-    </w:p>
-    <w:p>
-      <w:r>
-        <w:pict>
-          <v:rect style="width:0;height:1.5pt" o:hralign="center" o:hrstd="t" o:hr="t"/>
-        </w:pict>
-      </w:r>
-    </w:p>
-    <w:p>
-      <w:pPr>
-        <w:pStyle w:val="Heading2"/>
-      </w:pPr>
-      <w:bookmarkStart w:id="87" w:name="_41a0df473373c60c9872098155e6e0a6a20ee2d"/>
-      <w:r>
-        <w:t xml:space="preserve">16. From code (</w:t>
-      </w:r>
-      <w:r>
-        <w:rPr>
-          <w:rStyle w:val="VerbatimChar"/>
-        </w:rPr>
-        <w:t xml:space="preserve">play.scd</w:t>
-      </w:r>
-      <w:r>
-        <w:t xml:space="preserve">)</w:t>
-      </w:r>
       <w:bookmarkEnd w:id="87"/>
-    </w:p>
-    <w:p>
-      <w:pPr>
-        <w:pStyle w:val="FirstParagraph"/>
-      </w:pPr>
-      <w:r>
-        <w:t xml:space="preserve">Everything in the window can be done from code. A few favourites:</w:t>
-      </w:r>
-    </w:p>
-    <w:p>
-      <w:pPr>
-        <w:pStyle w:val="SourceCode"/>
-      </w:pPr>
-      <w:r>
-        <w:rPr>
-          <w:rStyle w:val="VerbatimChar"/>
-        </w:rPr>
-        <w:t xml:space="preserve">~add.(\mouth);                         // a new track</w:t>
-      </w:r>
-      <w:r>
-        <w:br/>
-      </w:r>
-      <w:r>
-        <w:rPr>
-          <w:rStyle w:val="VerbatimChar"/>
-        </w:rPr>
-        <w:t xml:space="preserve">~dev.(\bytebeat, \overflow);           // an effect on a track</w:t>
-      </w:r>
-      <w:r>
-        <w:br/>
-      </w:r>
-      <w:r>
-        <w:rPr>
-          <w:rStyle w:val="VerbatimChar"/>
-        </w:rPr>
-        <w:t xml:space="preserve">~tset.(\mouth, \text, "hello");        // any track setting</w:t>
-      </w:r>
-      <w:r>
-        <w:br/>
-      </w:r>
-      <w:r>
-        <w:rPr>
-          <w:rStyle w:val="VerbatimChar"/>
-        </w:rPr>
-        <w:t xml:space="preserve">~send.(\grains, \A, 0.6);              // a send</w:t>
-      </w:r>
-      <w:r>
-        <w:br/>
-      </w:r>
-      <w:r>
-        <w:rPr>
-          <w:rStyle w:val="VerbatimChar"/>
-        </w:rPr>
-        <w:t xml:space="preserve">~ramp.(\bytebeat, \rate, 20000, 16);   // glide a setting over 16 beats</w:t>
-      </w:r>
-      <w:r>
-        <w:br/>
-      </w:r>
-      <w:r>
-        <w:rPr>
-          <w:rStyle w:val="VerbatimChar"/>
-        </w:rPr>
-        <w:t xml:space="preserve">~wallPick.(5);                         // the scream wall</w:t>
-      </w:r>
-      <w:r>
-        <w:br/>
-      </w:r>
-      <w:r>
-        <w:rPr>
-          <w:rStyle w:val="VerbatimChar"/>
-        </w:rPr>
-        <w:t xml:space="preserve">~takeover.(\bytebeat2, 1);             // takeover from code</w:t>
-      </w:r>
-      <w:r>
-        <w:br/>
-      </w:r>
-      <w:r>
-        <w:rPr>
-          <w:rStyle w:val="VerbatimChar"/>
-        </w:rPr>
-        <w:t xml:space="preserve">~keep.(120);                           // keep the last two minutes</w:t>
-      </w:r>
-      <w:r>
-        <w:br/>
-      </w:r>
-      <w:r>
-        <w:rPr>
-          <w:rStyle w:val="VerbatimChar"/>
-        </w:rPr>
-        <w:t xml:space="preserve">~song = List[[0, 16], [1, 8]]; ~playSong.();   // scenes in order: [scene, bars]</w:t>
-      </w:r>
-    </w:p>
-    <w:p>
-      <w:pPr>
-        <w:pStyle w:val="FirstParagraph"/>
-      </w:pPr>
-      <w:r>
-        <w:rPr>
-          <w:b/>
-          <w:bCs/>
-        </w:rPr>
-        <w:t xml:space="preserve">Make your own</w:t>
-      </w:r>
-      <w:r>
-        <w:t xml:space="preserve">:</w:t>
-      </w:r>
-      <w:r>
-        <w:t xml:space="preserve"> </w:t>
-      </w:r>
-      <w:r>
-        <w:t xml:space="preserve">- a</w:t>
-      </w:r>
-      <w:r>
-        <w:t xml:space="preserve"> </w:t>
-      </w:r>
-      <w:r>
-        <w:rPr>
-          <w:b/>
-          <w:bCs/>
-        </w:rPr>
-        <w:t xml:space="preserve">noise kind</w:t>
-      </w:r>
-      <w:r>
-        <w:t xml:space="preserve">: one line in</w:t>
-      </w:r>
-      <w:r>
-        <w:t xml:space="preserve"> </w:t>
-      </w:r>
-      <w:r>
-        <w:rPr>
-          <w:rStyle w:val="VerbatimChar"/>
-        </w:rPr>
-        <w:t xml:space="preserve">~noiseKinds</w:t>
-      </w:r>
-      <w:r>
-        <w:t xml:space="preserve"> </w:t>
-      </w:r>
-      <w:r>
-        <w:t xml:space="preserve">(</w:t>
-      </w:r>
-      <w:r>
-        <w:rPr>
-          <w:rStyle w:val="VerbatimChar"/>
-        </w:rPr>
-        <w:t xml:space="preserve">lib/voices/noisegen.scd</w:t>
-      </w:r>
-      <w:r>
-        <w:t xml:space="preserve">):</w:t>
-      </w:r>
-      <w:r>
-        <w:t xml:space="preserve"> </w:t>
-      </w:r>
-      <w:r>
-        <w:rPr>
-          <w:rStyle w:val="VerbatimChar"/>
-        </w:rPr>
-        <w:t xml:space="preserve">["name", { |rate, char| signal }]</w:t>
-      </w:r>
-      <w:r>
-        <w:t xml:space="preserve"> </w:t>
-      </w:r>
-      <w:r>
-        <w:t xml:space="preserve">- a</w:t>
-      </w:r>
-      <w:r>
-        <w:t xml:space="preserve"> </w:t>
-      </w:r>
-      <w:r>
-        <w:rPr>
-          <w:b/>
-          <w:bCs/>
-        </w:rPr>
-        <w:t xml:space="preserve">wall</w:t>
-      </w:r>
-      <w:r>
-        <w:t xml:space="preserve">: one line in</w:t>
-      </w:r>
-      <w:r>
-        <w:t xml:space="preserve"> </w:t>
-      </w:r>
-      <w:r>
-        <w:rPr>
-          <w:rStyle w:val="VerbatimChar"/>
-        </w:rPr>
-        <w:t xml:space="preserve">~wallTypes</w:t>
-      </w:r>
-      <w:r>
-        <w:t xml:space="preserve"> </w:t>
-      </w:r>
-      <w:r>
-        <w:t xml:space="preserve">(</w:t>
-      </w:r>
-      <w:r>
-        <w:rPr>
-          <w:rStyle w:val="VerbatimChar"/>
-        </w:rPr>
-        <w:t xml:space="preserve">lib/wall.scd</w:t>
-      </w:r>
-      <w:r>
-        <w:t xml:space="preserve">):</w:t>
-      </w:r>
-      <w:r>
-        <w:t xml:space="preserve"> </w:t>
-      </w:r>
-      <w:r>
-        <w:rPr>
-          <w:rStyle w:val="VerbatimChar"/>
-        </w:rPr>
-        <w:t xml:space="preserve">["name", { |dens, grit, motion| stereo signal }]</w:t>
-      </w:r>
-      <w:r>
-        <w:t xml:space="preserve"> </w:t>
-      </w:r>
-      <w:r>
-        <w:t xml:space="preserve">- an</w:t>
-      </w:r>
-      <w:r>
-        <w:t xml:space="preserve"> </w:t>
-      </w:r>
-      <w:r>
-        <w:rPr>
-          <w:b/>
-          <w:bCs/>
-        </w:rPr>
-        <w:t xml:space="preserve">effect</w:t>
-      </w:r>
-      <w:r>
-        <w:t xml:space="preserve">: a</w:t>
-      </w:r>
-      <w:r>
-        <w:t xml:space="preserve"> </w:t>
-      </w:r>
-      <w:r>
-        <w:rPr>
-          <w:rStyle w:val="VerbatimChar"/>
-        </w:rPr>
-        <w:t xml:space="preserve">~deviceDef</w:t>
-      </w:r>
-      <w:r>
-        <w:t xml:space="preserve"> </w:t>
-      </w:r>
-      <w:r>
-        <w:t xml:space="preserve">and an entry in</w:t>
-      </w:r>
-      <w:r>
-        <w:t xml:space="preserve"> </w:t>
-      </w:r>
-      <w:r>
-        <w:rPr>
-          <w:rStyle w:val="VerbatimChar"/>
-        </w:rPr>
-        <w:t xml:space="preserve">~deviceTypes</w:t>
-      </w:r>
-      <w:r>
-        <w:t xml:space="preserve"> </w:t>
-      </w:r>
-      <w:r>
-        <w:t xml:space="preserve">(</w:t>
-      </w:r>
-      <w:r>
-        <w:rPr>
-          <w:rStyle w:val="VerbatimChar"/>
-        </w:rPr>
-        <w:t xml:space="preserve">lib/devices.scd</w:t>
-      </w:r>
-      <w:r>
-        <w:t xml:space="preserve">), plus a</w:t>
-      </w:r>
-      <w:r>
-        <w:t xml:space="preserve"> </w:t>
-      </w:r>
-      <w:r>
-        <w:t xml:space="preserve">description in</w:t>
-      </w:r>
-      <w:r>
-        <w:t xml:space="preserve"> </w:t>
-      </w:r>
-      <w:r>
-        <w:rPr>
-          <w:rStyle w:val="VerbatimChar"/>
-        </w:rPr>
-        <w:t xml:space="preserve">lib/descriptions.scd</w:t>
-      </w:r>
-      <w:r>
-        <w:t xml:space="preserve"> </w:t>
-      </w:r>
-      <w:r>
-        <w:t xml:space="preserve">- an</w:t>
-      </w:r>
-      <w:r>
-        <w:t xml:space="preserve"> </w:t>
-      </w:r>
-      <w:r>
-        <w:rPr>
-          <w:b/>
-          <w:bCs/>
-        </w:rPr>
-        <w:t xml:space="preserve">instrument</w:t>
-      </w:r>
-      <w:r>
-        <w:t xml:space="preserve">: a file in</w:t>
-      </w:r>
-      <w:r>
-        <w:t xml:space="preserve"> </w:t>
-      </w:r>
-      <w:r>
-        <w:rPr>
-          <w:rStyle w:val="VerbatimChar"/>
-        </w:rPr>
-        <w:t xml:space="preserve">lib/voices/</w:t>
-      </w:r>
-      <w:r>
-        <w:t xml:space="preserve"> </w:t>
-      </w:r>
-      <w:r>
-        <w:t xml:space="preserve">registering</w:t>
-      </w:r>
-      <w:r>
-        <w:t xml:space="preserve"> </w:t>
-      </w:r>
-      <w:r>
-        <w:rPr>
-          <w:rStyle w:val="VerbatimChar"/>
-        </w:rPr>
-        <w:t xml:space="preserve">~voiceTypes[\name]</w:t>
-      </w:r>
-      <w:r>
-        <w:t xml:space="preserve"> </w:t>
-      </w:r>
-      <w:r>
-        <w:t xml:space="preserve">(copy one), added to</w:t>
-      </w:r>
-      <w:r>
-        <w:t xml:space="preserve"> </w:t>
-      </w:r>
-      <w:r>
-        <w:t xml:space="preserve">the list in</w:t>
-      </w:r>
-      <w:r>
-        <w:t xml:space="preserve"> </w:t>
-      </w:r>
-      <w:r>
-        <w:rPr>
-          <w:rStyle w:val="VerbatimChar"/>
-        </w:rPr>
-        <w:t xml:space="preserve">unsound.scd</w:t>
-      </w:r>
-    </w:p>
-    <w:p>
-      <w:r>
-        <w:pict>
-          <v:rect style="width:0;height:1.5pt" o:hralign="center" o:hrstd="t" o:hr="t"/>
-        </w:pict>
-      </w:r>
-    </w:p>
-    <w:p>
-      <w:pPr>
-        <w:pStyle w:val="Heading2"/>
-      </w:pPr>
-      <w:bookmarkStart w:id="88" w:name="_340fc2f84be01f35e34ce906de44e355ea89354"/>
-      <w:r>
-        <w:t xml:space="preserve">17. When something’s wrong</w:t>
-      </w:r>
-      <w:bookmarkEnd w:id="88"/>
     </w:p>
     <w:p>
       <w:pPr>
@@ -9200,52 +8916,49 @@
           <w:b/>
           <w:bCs/>
         </w:rPr>
-        <w:t xml:space="preserve">Silence</w:t>
-      </w:r>
-      <w:r>
-        <w:t xml:space="preserve">: is</w:t>
-      </w:r>
-      <w:r>
-        <w:t xml:space="preserve"> </w:t>
-      </w:r>
-      <w:r>
-        <w:rPr>
-          <w:b/>
-          <w:bCs/>
-        </w:rPr>
-        <w:t xml:space="preserve">play</w:t>
-      </w:r>
-      <w:r>
-        <w:t xml:space="preserve"> </w:t>
-      </w:r>
-      <w:r>
-        <w:t xml:space="preserve">on? Is the track muted (</w:t>
-      </w:r>
-      <w:r>
-        <w:rPr>
-          <w:b/>
-          <w:bCs/>
-        </w:rPr>
-        <w:t xml:space="preserve">M</w:t>
-      </w:r>
-      <w:r>
-        <w:t xml:space="preserve">), or something else soloed (</w:t>
-      </w:r>
-      <w:r>
-        <w:rPr>
-          <w:b/>
-          <w:bCs/>
-        </w:rPr>
-        <w:t xml:space="preserve">S</w:t>
-      </w:r>
-      <w:r>
-        <w:t xml:space="preserve">)? Is the</w:t>
-      </w:r>
-      <w:r>
-        <w:t xml:space="preserve"> </w:t>
-      </w:r>
-      <w:r>
-        <w:t xml:space="preserve">wall faded out? Cmd-. and play again.</w:t>
+        <w:t xml:space="preserve">save / load</w:t>
+      </w:r>
+      <w:r>
+        <w:t xml:space="preserve"> </w:t>
+      </w:r>
+      <w:r>
+        <w:t xml:space="preserve">(top bar): a whole set (tracks, devices, sends, mods, scenes, song, MIDI maps,</w:t>
+      </w:r>
+      <w:r>
+        <w:t xml:space="preserve"> </w:t>
+      </w:r>
+      <w:r>
+        <w:t xml:space="preserve">the wall, loaded files’ paths) in one</w:t>
+      </w:r>
+      <w:r>
+        <w:t xml:space="preserve"> </w:t>
+      </w:r>
+      <w:r>
+        <w:rPr>
+          <w:rStyle w:val="VerbatimChar"/>
+        </w:rPr>
+        <w:t xml:space="preserve">.unsound</w:t>
+      </w:r>
+      <w:r>
+        <w:t xml:space="preserve"> </w:t>
+      </w:r>
+      <w:r>
+        <w:t xml:space="preserve">file. Sets go in</w:t>
+      </w:r>
+      <w:r>
+        <w:t xml:space="preserve"> </w:t>
+      </w:r>
+      <w:r>
+        <w:rPr>
+          <w:rStyle w:val="VerbatimChar"/>
+        </w:rPr>
+        <w:t xml:space="preserve">sets/</w:t>
+      </w:r>
+      <w:r>
+        <w:t xml:space="preserve"> </w:t>
+      </w:r>
+      <w:r>
+        <w:t xml:space="preserve">by default.</w:t>
       </w:r>
     </w:p>
     <w:p>
@@ -9261,16 +8974,25 @@
           <w:b/>
           <w:bCs/>
         </w:rPr>
-        <w:t xml:space="preserve">Way too loud</w:t>
-      </w:r>
-      <w:r>
-        <w:t xml:space="preserve">: the master’s limiter catches it; pull the master pad’s volume down, or turn the</w:t>
-      </w:r>
-      <w:r>
-        <w:t xml:space="preserve"> </w:t>
-      </w:r>
-      <w:r>
-        <w:t xml:space="preserve">takeover slider back to empty.</w:t>
+        <w:t xml:space="preserve">keeps</w:t>
+      </w:r>
+      <w:r>
+        <w:t xml:space="preserve"> </w:t>
+      </w:r>
+      <w:r>
+        <w:t xml:space="preserve">and recordings go to</w:t>
+      </w:r>
+      <w:r>
+        <w:t xml:space="preserve"> </w:t>
+      </w:r>
+      <w:r>
+        <w:rPr>
+          <w:rStyle w:val="VerbatimChar"/>
+        </w:rPr>
+        <w:t xml:space="preserve">~/Music/unsound/</w:t>
+      </w:r>
+      <w:r>
+        <w:t xml:space="preserve">.</w:t>
       </w:r>
     </w:p>
     <w:p>
@@ -9282,28 +9004,447 @@
         </w:numPr>
       </w:pPr>
       <w:r>
-        <w:rPr>
-          <w:b/>
-          <w:bCs/>
-        </w:rPr>
-        <w:t xml:space="preserve">The server won’t boot</w:t>
-      </w:r>
-      <w:r>
-        <w:t xml:space="preserve">: the input and output sample rates differ (e.g. AirPods mic). unsound</w:t>
-      </w:r>
-      <w:r>
-        <w:t xml:space="preserve"> </w:t>
-      </w:r>
-      <w:r>
-        <w:t xml:space="preserve">starts without inputs to avoid that; if it still fails, pick one output device in Audio MIDI Setup.</w:t>
-      </w:r>
+        <w:t xml:space="preserve">The sample folder is</w:t>
+      </w:r>
+      <w:r>
+        <w:t xml:space="preserve"> </w:t>
+      </w:r>
+      <w:r>
+        <w:rPr>
+          <w:rStyle w:val="VerbatimChar"/>
+        </w:rPr>
+        <w:t xml:space="preserve">~folder</w:t>
+      </w:r>
+      <w:r>
+        <w:t xml:space="preserve"> </w:t>
+      </w:r>
+      <w:r>
+        <w:t xml:space="preserve">in</w:t>
+      </w:r>
+      <w:r>
+        <w:t xml:space="preserve"> </w:t>
+      </w:r>
+      <w:r>
+        <w:rPr>
+          <w:rStyle w:val="VerbatimChar"/>
+        </w:rPr>
+        <w:t xml:space="preserve">play.scd</w:t>
+      </w:r>
+      <w:r>
+        <w:t xml:space="preserve">;</w:t>
+      </w:r>
+      <w:r>
+        <w:t xml:space="preserve"> </w:t>
+      </w:r>
+      <w:r>
+        <w:rPr>
+          <w:rStyle w:val="VerbatimChar"/>
+        </w:rPr>
+        <w:t xml:space="preserve">~reload.("~/some/folder")</w:t>
+      </w:r>
+      <w:r>
+        <w:t xml:space="preserve"> </w:t>
+      </w:r>
+      <w:r>
+        <w:t xml:space="preserve">swaps it while playing.</w:t>
+      </w:r>
+    </w:p>
+    <w:p>
+      <w:r>
+        <w:pict>
+          <v:rect style="width:0;height:1.5pt" o:hralign="center" o:hrstd="t" o:hr="t"/>
+        </w:pict>
+      </w:r>
+    </w:p>
+    <w:p>
+      <w:pPr>
+        <w:pStyle w:val="Heading2"/>
+      </w:pPr>
+      <w:bookmarkStart w:id="88" w:name="_41a0df473373c60c9872098155e6e0a6a20ee2d"/>
+      <w:r>
+        <w:t xml:space="preserve">16. From code (</w:t>
+      </w:r>
+      <w:r>
+        <w:rPr>
+          <w:rStyle w:val="VerbatimChar"/>
+        </w:rPr>
+        <w:t xml:space="preserve">play.scd</w:t>
+      </w:r>
+      <w:r>
+        <w:t xml:space="preserve">)</w:t>
+      </w:r>
+      <w:bookmarkEnd w:id="88"/>
+    </w:p>
+    <w:p>
+      <w:pPr>
+        <w:pStyle w:val="FirstParagraph"/>
+      </w:pPr>
+      <w:r>
+        <w:t xml:space="preserve">Everything in the window can be done from code. A few favourites:</w:t>
+      </w:r>
+    </w:p>
+    <w:p>
+      <w:pPr>
+        <w:pStyle w:val="SourceCode"/>
+      </w:pPr>
+      <w:r>
+        <w:rPr>
+          <w:rStyle w:val="VerbatimChar"/>
+        </w:rPr>
+        <w:t xml:space="preserve">~add.(\mouth);                         // a new track</w:t>
+      </w:r>
+      <w:r>
+        <w:br/>
+      </w:r>
+      <w:r>
+        <w:rPr>
+          <w:rStyle w:val="VerbatimChar"/>
+        </w:rPr>
+        <w:t xml:space="preserve">~dev.(\bytebeat, \overflow);           // an effect on a track</w:t>
+      </w:r>
+      <w:r>
+        <w:br/>
+      </w:r>
+      <w:r>
+        <w:rPr>
+          <w:rStyle w:val="VerbatimChar"/>
+        </w:rPr>
+        <w:t xml:space="preserve">~tset.(\mouth, \text, "hello");        // any track setting</w:t>
+      </w:r>
+      <w:r>
+        <w:br/>
+      </w:r>
+      <w:r>
+        <w:rPr>
+          <w:rStyle w:val="VerbatimChar"/>
+        </w:rPr>
+        <w:t xml:space="preserve">~send.(\grains, \A, 0.6);              // a send</w:t>
+      </w:r>
+      <w:r>
+        <w:br/>
+      </w:r>
+      <w:r>
+        <w:rPr>
+          <w:rStyle w:val="VerbatimChar"/>
+        </w:rPr>
+        <w:t xml:space="preserve">~ramp.(\bytebeat, \rate, 20000, 16);   // glide a setting over 16 beats</w:t>
+      </w:r>
+      <w:r>
+        <w:br/>
+      </w:r>
+      <w:r>
+        <w:rPr>
+          <w:rStyle w:val="VerbatimChar"/>
+        </w:rPr>
+        <w:t xml:space="preserve">~wallPick.(5);                         // the scream wall</w:t>
+      </w:r>
+      <w:r>
+        <w:br/>
+      </w:r>
+      <w:r>
+        <w:rPr>
+          <w:rStyle w:val="VerbatimChar"/>
+        </w:rPr>
+        <w:t xml:space="preserve">~takeover.(\bytebeat2, 1);             // takeover from code</w:t>
+      </w:r>
+      <w:r>
+        <w:br/>
+      </w:r>
+      <w:r>
+        <w:rPr>
+          <w:rStyle w:val="VerbatimChar"/>
+        </w:rPr>
+        <w:t xml:space="preserve">~keep.(120);                           // keep the last two minutes</w:t>
+      </w:r>
+      <w:r>
+        <w:br/>
+      </w:r>
+      <w:r>
+        <w:rPr>
+          <w:rStyle w:val="VerbatimChar"/>
+        </w:rPr>
+        <w:t xml:space="preserve">~song = List[[0, 16], [1, 8]]; ~playSong.();   // scenes in order: [scene, bars]</w:t>
+      </w:r>
+    </w:p>
+    <w:p>
+      <w:pPr>
+        <w:pStyle w:val="FirstParagraph"/>
+      </w:pPr>
+      <w:r>
+        <w:rPr>
+          <w:b/>
+          <w:bCs/>
+        </w:rPr>
+        <w:t xml:space="preserve">Make your own</w:t>
+      </w:r>
+      <w:r>
+        <w:t xml:space="preserve">:</w:t>
+      </w:r>
+      <w:r>
+        <w:t xml:space="preserve"> </w:t>
+      </w:r>
+      <w:r>
+        <w:t xml:space="preserve">- a</w:t>
+      </w:r>
+      <w:r>
+        <w:t xml:space="preserve"> </w:t>
+      </w:r>
+      <w:r>
+        <w:rPr>
+          <w:b/>
+          <w:bCs/>
+        </w:rPr>
+        <w:t xml:space="preserve">noise kind</w:t>
+      </w:r>
+      <w:r>
+        <w:t xml:space="preserve">: one line in</w:t>
+      </w:r>
+      <w:r>
+        <w:t xml:space="preserve"> </w:t>
+      </w:r>
+      <w:r>
+        <w:rPr>
+          <w:rStyle w:val="VerbatimChar"/>
+        </w:rPr>
+        <w:t xml:space="preserve">~noiseKinds</w:t>
+      </w:r>
+      <w:r>
+        <w:t xml:space="preserve"> </w:t>
+      </w:r>
+      <w:r>
+        <w:t xml:space="preserve">(</w:t>
+      </w:r>
+      <w:r>
+        <w:rPr>
+          <w:rStyle w:val="VerbatimChar"/>
+        </w:rPr>
+        <w:t xml:space="preserve">lib/voices/noisegen.scd</w:t>
+      </w:r>
+      <w:r>
+        <w:t xml:space="preserve">):</w:t>
+      </w:r>
+      <w:r>
+        <w:t xml:space="preserve"> </w:t>
+      </w:r>
+      <w:r>
+        <w:rPr>
+          <w:rStyle w:val="VerbatimChar"/>
+        </w:rPr>
+        <w:t xml:space="preserve">["name", { |rate, char| signal }]</w:t>
+      </w:r>
+      <w:r>
+        <w:t xml:space="preserve"> </w:t>
+      </w:r>
+      <w:r>
+        <w:t xml:space="preserve">- a</w:t>
+      </w:r>
+      <w:r>
+        <w:t xml:space="preserve"> </w:t>
+      </w:r>
+      <w:r>
+        <w:rPr>
+          <w:b/>
+          <w:bCs/>
+        </w:rPr>
+        <w:t xml:space="preserve">wall</w:t>
+      </w:r>
+      <w:r>
+        <w:t xml:space="preserve">: one line in</w:t>
+      </w:r>
+      <w:r>
+        <w:t xml:space="preserve"> </w:t>
+      </w:r>
+      <w:r>
+        <w:rPr>
+          <w:rStyle w:val="VerbatimChar"/>
+        </w:rPr>
+        <w:t xml:space="preserve">~wallTypes</w:t>
+      </w:r>
+      <w:r>
+        <w:t xml:space="preserve"> </w:t>
+      </w:r>
+      <w:r>
+        <w:t xml:space="preserve">(</w:t>
+      </w:r>
+      <w:r>
+        <w:rPr>
+          <w:rStyle w:val="VerbatimChar"/>
+        </w:rPr>
+        <w:t xml:space="preserve">lib/wall.scd</w:t>
+      </w:r>
+      <w:r>
+        <w:t xml:space="preserve">):</w:t>
+      </w:r>
+      <w:r>
+        <w:t xml:space="preserve"> </w:t>
+      </w:r>
+      <w:r>
+        <w:rPr>
+          <w:rStyle w:val="VerbatimChar"/>
+        </w:rPr>
+        <w:t xml:space="preserve">["name", { |dens, grit, motion| stereo signal }]</w:t>
+      </w:r>
+      <w:r>
+        <w:t xml:space="preserve"> </w:t>
+      </w:r>
+      <w:r>
+        <w:t xml:space="preserve">- an</w:t>
+      </w:r>
+      <w:r>
+        <w:t xml:space="preserve"> </w:t>
+      </w:r>
+      <w:r>
+        <w:rPr>
+          <w:b/>
+          <w:bCs/>
+        </w:rPr>
+        <w:t xml:space="preserve">effect</w:t>
+      </w:r>
+      <w:r>
+        <w:t xml:space="preserve">: a</w:t>
+      </w:r>
+      <w:r>
+        <w:t xml:space="preserve"> </w:t>
+      </w:r>
+      <w:r>
+        <w:rPr>
+          <w:rStyle w:val="VerbatimChar"/>
+        </w:rPr>
+        <w:t xml:space="preserve">~deviceDef</w:t>
+      </w:r>
+      <w:r>
+        <w:t xml:space="preserve"> </w:t>
+      </w:r>
+      <w:r>
+        <w:t xml:space="preserve">and an entry in</w:t>
+      </w:r>
+      <w:r>
+        <w:t xml:space="preserve"> </w:t>
+      </w:r>
+      <w:r>
+        <w:rPr>
+          <w:rStyle w:val="VerbatimChar"/>
+        </w:rPr>
+        <w:t xml:space="preserve">~deviceTypes</w:t>
+      </w:r>
+      <w:r>
+        <w:t xml:space="preserve"> </w:t>
+      </w:r>
+      <w:r>
+        <w:t xml:space="preserve">(</w:t>
+      </w:r>
+      <w:r>
+        <w:rPr>
+          <w:rStyle w:val="VerbatimChar"/>
+        </w:rPr>
+        <w:t xml:space="preserve">lib/devices.scd</w:t>
+      </w:r>
+      <w:r>
+        <w:t xml:space="preserve">), plus a</w:t>
+      </w:r>
+      <w:r>
+        <w:t xml:space="preserve"> </w:t>
+      </w:r>
+      <w:r>
+        <w:t xml:space="preserve">description in</w:t>
+      </w:r>
+      <w:r>
+        <w:t xml:space="preserve"> </w:t>
+      </w:r>
+      <w:r>
+        <w:rPr>
+          <w:rStyle w:val="VerbatimChar"/>
+        </w:rPr>
+        <w:t xml:space="preserve">lib/descriptions.scd</w:t>
+      </w:r>
+      <w:r>
+        <w:t xml:space="preserve"> </w:t>
+      </w:r>
+      <w:r>
+        <w:t xml:space="preserve">- an</w:t>
+      </w:r>
+      <w:r>
+        <w:t xml:space="preserve"> </w:t>
+      </w:r>
+      <w:r>
+        <w:rPr>
+          <w:b/>
+          <w:bCs/>
+        </w:rPr>
+        <w:t xml:space="preserve">instrument</w:t>
+      </w:r>
+      <w:r>
+        <w:t xml:space="preserve">: a file in</w:t>
+      </w:r>
+      <w:r>
+        <w:t xml:space="preserve"> </w:t>
+      </w:r>
+      <w:r>
+        <w:rPr>
+          <w:rStyle w:val="VerbatimChar"/>
+        </w:rPr>
+        <w:t xml:space="preserve">lib/voices/</w:t>
+      </w:r>
+      <w:r>
+        <w:t xml:space="preserve"> </w:t>
+      </w:r>
+      <w:r>
+        <w:t xml:space="preserve">registering</w:t>
+      </w:r>
+      <w:r>
+        <w:t xml:space="preserve"> </w:t>
+      </w:r>
+      <w:r>
+        <w:rPr>
+          <w:rStyle w:val="VerbatimChar"/>
+        </w:rPr>
+        <w:t xml:space="preserve">~voiceTypes[\name]</w:t>
+      </w:r>
+      <w:r>
+        <w:t xml:space="preserve"> </w:t>
+      </w:r>
+      <w:r>
+        <w:t xml:space="preserve">(copy one), added to</w:t>
+      </w:r>
+      <w:r>
+        <w:t xml:space="preserve"> </w:t>
+      </w:r>
+      <w:r>
+        <w:t xml:space="preserve">the list in</w:t>
+      </w:r>
+      <w:r>
+        <w:t xml:space="preserve"> </w:t>
+      </w:r>
+      <w:r>
+        <w:rPr>
+          <w:rStyle w:val="VerbatimChar"/>
+        </w:rPr>
+        <w:t xml:space="preserve">unsound.scd</w:t>
+      </w:r>
+    </w:p>
+    <w:p>
+      <w:r>
+        <w:pict>
+          <v:rect style="width:0;height:1.5pt" o:hralign="center" o:hrstd="t" o:hr="t"/>
+        </w:pict>
+      </w:r>
+    </w:p>
+    <w:p>
+      <w:pPr>
+        <w:pStyle w:val="Heading2"/>
+      </w:pPr>
+      <w:bookmarkStart w:id="89" w:name="_340fc2f84be01f35e34ce906de44e355ea89354"/>
+      <w:r>
+        <w:t xml:space="preserve">17. When something’s wrong</w:t>
+      </w:r>
+      <w:bookmarkEnd w:id="89"/>
     </w:p>
     <w:p>
       <w:pPr>
         <w:pStyle w:val="Compact"/>
         <w:numPr>
           <w:ilvl w:val="0"/>
-          <w:numId w:val="1015"/>
+          <w:numId w:val="1016"/>
         </w:numPr>
       </w:pPr>
       <w:r>
@@ -9311,31 +9452,52 @@
           <w:b/>
           <w:bCs/>
         </w:rPr>
-        <w:t xml:space="preserve">Memory</w:t>
-      </w:r>
-      <w:r>
-        <w:t xml:space="preserve">: the tape keeps 15 minutes in RAM (about 350 MB). Set</w:t>
-      </w:r>
-      <w:r>
-        <w:t xml:space="preserve"> </w:t>
-      </w:r>
-      <w:r>
-        <w:rPr>
-          <w:rStyle w:val="VerbatimChar"/>
-        </w:rPr>
-        <w:t xml:space="preserve">~tapeMinutes = 5</w:t>
-      </w:r>
-      <w:r>
-        <w:t xml:space="preserve"> </w:t>
-      </w:r>
-      <w:r>
-        <w:t xml:space="preserve">before loading</w:t>
-      </w:r>
-      <w:r>
-        <w:t xml:space="preserve"> </w:t>
-      </w:r>
-      <w:r>
-        <w:t xml:space="preserve">to use less.</w:t>
+        <w:t xml:space="preserve">Silence</w:t>
+      </w:r>
+      <w:r>
+        <w:t xml:space="preserve">: is</w:t>
+      </w:r>
+      <w:r>
+        <w:t xml:space="preserve"> </w:t>
+      </w:r>
+      <w:r>
+        <w:rPr>
+          <w:b/>
+          <w:bCs/>
+        </w:rPr>
+        <w:t xml:space="preserve">play</w:t>
+      </w:r>
+      <w:r>
+        <w:t xml:space="preserve"> </w:t>
+      </w:r>
+      <w:r>
+        <w:t xml:space="preserve">on? Is the track muted (</w:t>
+      </w:r>
+      <w:r>
+        <w:rPr>
+          <w:b/>
+          <w:bCs/>
+        </w:rPr>
+        <w:t xml:space="preserve">M</w:t>
+      </w:r>
+      <w:r>
+        <w:t xml:space="preserve">), or something else soloed (</w:t>
+      </w:r>
+      <w:r>
+        <w:rPr>
+          <w:b/>
+          <w:bCs/>
+        </w:rPr>
+        <w:t xml:space="preserve">S</w:t>
+      </w:r>
+      <w:r>
+        <w:t xml:space="preserve">)? Is the</w:t>
+      </w:r>
+      <w:r>
+        <w:t xml:space="preserve"> </w:t>
+      </w:r>
+      <w:r>
+        <w:t xml:space="preserve">wall faded out? Cmd-. and play again.</w:t>
       </w:r>
     </w:p>
     <w:p>
@@ -9343,7 +9505,97 @@
         <w:pStyle w:val="Compact"/>
         <w:numPr>
           <w:ilvl w:val="0"/>
-          <w:numId w:val="1015"/>
+          <w:numId w:val="1016"/>
+        </w:numPr>
+      </w:pPr>
+      <w:r>
+        <w:rPr>
+          <w:b/>
+          <w:bCs/>
+        </w:rPr>
+        <w:t xml:space="preserve">Way too loud</w:t>
+      </w:r>
+      <w:r>
+        <w:t xml:space="preserve">: the master’s limiter catches it; pull the master pad’s volume down, or turn the</w:t>
+      </w:r>
+      <w:r>
+        <w:t xml:space="preserve"> </w:t>
+      </w:r>
+      <w:r>
+        <w:t xml:space="preserve">takeover slider back to empty.</w:t>
+      </w:r>
+    </w:p>
+    <w:p>
+      <w:pPr>
+        <w:pStyle w:val="Compact"/>
+        <w:numPr>
+          <w:ilvl w:val="0"/>
+          <w:numId w:val="1016"/>
+        </w:numPr>
+      </w:pPr>
+      <w:r>
+        <w:rPr>
+          <w:b/>
+          <w:bCs/>
+        </w:rPr>
+        <w:t xml:space="preserve">The server won’t boot</w:t>
+      </w:r>
+      <w:r>
+        <w:t xml:space="preserve">: the input and output sample rates differ (e.g. AirPods mic). unsound</w:t>
+      </w:r>
+      <w:r>
+        <w:t xml:space="preserve"> </w:t>
+      </w:r>
+      <w:r>
+        <w:t xml:space="preserve">starts without inputs to avoid that; if it still fails, pick one output device in Audio MIDI Setup.</w:t>
+      </w:r>
+    </w:p>
+    <w:p>
+      <w:pPr>
+        <w:pStyle w:val="Compact"/>
+        <w:numPr>
+          <w:ilvl w:val="0"/>
+          <w:numId w:val="1016"/>
+        </w:numPr>
+      </w:pPr>
+      <w:r>
+        <w:rPr>
+          <w:b/>
+          <w:bCs/>
+        </w:rPr>
+        <w:t xml:space="preserve">Memory</w:t>
+      </w:r>
+      <w:r>
+        <w:t xml:space="preserve">: the tape keeps 15 minutes in RAM (about 350 MB). Set</w:t>
+      </w:r>
+      <w:r>
+        <w:t xml:space="preserve"> </w:t>
+      </w:r>
+      <w:r>
+        <w:rPr>
+          <w:rStyle w:val="VerbatimChar"/>
+        </w:rPr>
+        <w:t xml:space="preserve">~tapeMinutes = 5</w:t>
+      </w:r>
+      <w:r>
+        <w:t xml:space="preserve"> </w:t>
+      </w:r>
+      <w:r>
+        <w:t xml:space="preserve">before loading</w:t>
+      </w:r>
+      <w:r>
+        <w:t xml:space="preserve"> </w:t>
+      </w:r>
+      <w:r>
+        <w:t xml:space="preserve">to use less.</w:t>
+      </w:r>
+    </w:p>
+    <w:p>
+      <w:pPr>
+        <w:pStyle w:val="Compact"/>
+        <w:numPr>
+          <w:ilvl w:val="0"/>
+          <w:numId w:val="1016"/>
         </w:numPr>
       </w:pPr>
       <w:r>
@@ -9734,6 +9986,9 @@
     <w:abstractNumId w:val="991"/>
   </w:num>
   <w:num w:numId="1015">
+    <w:abstractNumId w:val="991"/>
+  </w:num>
+  <w:num w:numId="1016">
     <w:abstractNumId w:val="991"/>
   </w:num>
 </w:numbering>

</xml_diff>